<commit_message>
Correcciones diagrama de clases (falta punto 4.2)
</commit_message>
<xml_diff>
--- a/Entrega 2/Entrega 2 - TPI.docx
+++ b/Entrega 2/Entrega 2 - TPI.docx
@@ -1,6 +1,6 @@
 
 <file path=word/document.xml><?xml version="1.0" encoding="utf-8"?>
-<w:document xmlns:wpc="http://schemas.microsoft.com/office/word/2010/wordprocessingCanvas" xmlns:cx="http://schemas.microsoft.com/office/drawing/2014/chartex" xmlns:cx1="http://schemas.microsoft.com/office/drawing/2015/9/8/chartex" xmlns:cx2="http://schemas.microsoft.com/office/drawing/2015/10/21/chartex" xmlns:cx3="http://schemas.microsoft.com/office/drawing/2016/5/9/chartex" xmlns:cx4="http://schemas.microsoft.com/office/drawing/2016/5/10/chartex" xmlns:cx5="http://schemas.microsoft.com/office/drawing/2016/5/11/chartex" xmlns:cx6="http://schemas.microsoft.com/office/drawing/2016/5/12/chartex" xmlns:cx7="http://schemas.microsoft.com/office/drawing/2016/5/13/chartex" xmlns:cx8="http://schemas.microsoft.com/office/drawing/2016/5/14/chartex" xmlns:mc="http://schemas.openxmlformats.org/markup-compatibility/2006" xmlns:aink="http://schemas.microsoft.com/office/drawing/2016/ink" xmlns:am3d="http://schemas.microsoft.com/office/drawing/2017/model3d" xmlns:o="urn:schemas-microsoft-com:office:office" xmlns:oel="http://schemas.microsoft.com/office/2019/extlst" xmlns:r="http://schemas.openxmlformats.org/officeDocument/2006/relationships" xmlns:m="http://schemas.openxmlformats.org/officeDocument/2006/math" xmlns:v="urn:schemas-microsoft-com:vml" xmlns:wp14="http://schemas.microsoft.com/office/word/2010/wordprocessingDrawing" xmlns:wp="http://schemas.openxmlformats.org/drawingml/2006/wordprocessingDrawing" xmlns:w10="urn:schemas-microsoft-com:office:word" xmlns:w="http://schemas.openxmlformats.org/wordprocessingml/2006/main" xmlns:w14="http://schemas.microsoft.com/office/word/2010/wordml" xmlns:w15="http://schemas.microsoft.com/office/word/2012/wordml" xmlns:w16cei="http://schemas.microsoft.com/office/word/2026/wordml/cei" xmlns:w16cex="http://schemas.microsoft.com/office/word/2018/wordml/cex" xmlns:w16cid="http://schemas.microsoft.com/office/word/2016/wordml/cid" xmlns:w16="http://schemas.microsoft.com/office/word/2018/wordml" xmlns:w16du="http://schemas.microsoft.com/office/word/2023/wordml/word16du" xmlns:w16sdtdh="http://schemas.microsoft.com/office/word/2020/wordml/sdtdatahash" xmlns:w16sdtfl="http://schemas.microsoft.com/office/word/2024/wordml/sdtformatlock" xmlns:w16se="http://schemas.microsoft.com/office/word/2015/wordml/symex" xmlns:wpg="http://schemas.microsoft.com/office/word/2010/wordprocessingGroup" xmlns:wpi="http://schemas.microsoft.com/office/word/2010/wordprocessingInk" xmlns:wne="http://schemas.microsoft.com/office/word/2006/wordml" xmlns:wps="http://schemas.microsoft.com/office/word/2010/wordprocessingShape" mc:Ignorable="w14 w15 w16se w16cid w16 w16cex w16sdtdh w16sdtfl w16du wp14">
+<w:document xmlns:wpc="http://schemas.microsoft.com/office/word/2010/wordprocessingCanvas" xmlns:cx="http://schemas.microsoft.com/office/drawing/2014/chartex" xmlns:mc="http://schemas.openxmlformats.org/markup-compatibility/2006" xmlns:o="urn:schemas-microsoft-com:office:office" xmlns:r="http://schemas.openxmlformats.org/officeDocument/2006/relationships" xmlns:m="http://schemas.openxmlformats.org/officeDocument/2006/math" xmlns:v="urn:schemas-microsoft-com:vml" xmlns:wp14="http://schemas.microsoft.com/office/word/2010/wordprocessingDrawing" xmlns:wp="http://schemas.openxmlformats.org/drawingml/2006/wordprocessingDrawing" xmlns:w10="urn:schemas-microsoft-com:office:word" xmlns:w="http://schemas.openxmlformats.org/wordprocessingml/2006/main" xmlns:w14="http://schemas.microsoft.com/office/word/2010/wordml" xmlns:w15="http://schemas.microsoft.com/office/word/2012/wordml" xmlns:w16se="http://schemas.microsoft.com/office/word/2015/wordml/symex" xmlns:wpg="http://schemas.microsoft.com/office/word/2010/wordprocessingGroup" xmlns:wpi="http://schemas.microsoft.com/office/word/2010/wordprocessingInk" xmlns:wne="http://schemas.microsoft.com/office/word/2006/wordml" xmlns:wps="http://schemas.microsoft.com/office/word/2010/wordprocessingShape" mc:Ignorable="w14 w15 w16se wp14">
   <w:body>
     <w:p>
       <w:pPr>
@@ -146,128 +146,6 @@
     </w:p>
     <w:p>
       <w:pPr>
-        <w:widowControl w:val="0"/>
-        <w:spacing w:before="44" w:line="240" w:lineRule="auto"/>
-        <w:ind w:right="1"/>
-        <w:jc w:val="center"/>
-        <w:rPr>
-          <w:sz w:val="30"/>
-          <w:szCs w:val="30"/>
-        </w:rPr>
-      </w:pPr>
-    </w:p>
-    <w:p>
-      <w:pPr>
-        <w:widowControl w:val="0"/>
-        <w:spacing w:before="44" w:line="240" w:lineRule="auto"/>
-        <w:ind w:right="1"/>
-        <w:rPr>
-          <w:sz w:val="30"/>
-          <w:szCs w:val="30"/>
-        </w:rPr>
-      </w:pPr>
-    </w:p>
-    <w:p>
-      <w:pPr>
-        <w:widowControl w:val="0"/>
-        <w:spacing w:before="44" w:line="240" w:lineRule="auto"/>
-        <w:ind w:right="1"/>
-        <w:rPr>
-          <w:sz w:val="30"/>
-          <w:szCs w:val="30"/>
-        </w:rPr>
-      </w:pPr>
-    </w:p>
-    <w:p>
-      <w:pPr>
-        <w:rPr>
-          <w:b/>
-          <w:bCs/>
-          <w:sz w:val="28"/>
-          <w:szCs w:val="28"/>
-          <w:u w:val="single"/>
-        </w:rPr>
-      </w:pPr>
-    </w:p>
-    <w:p>
-      <w:pPr>
-        <w:rPr>
-          <w:b/>
-          <w:bCs/>
-          <w:sz w:val="28"/>
-          <w:szCs w:val="28"/>
-          <w:u w:val="single"/>
-        </w:rPr>
-      </w:pPr>
-    </w:p>
-    <w:p>
-      <w:pPr>
-        <w:rPr>
-          <w:b/>
-          <w:bCs/>
-          <w:sz w:val="28"/>
-          <w:szCs w:val="28"/>
-          <w:u w:val="single"/>
-        </w:rPr>
-      </w:pPr>
-    </w:p>
-    <w:p>
-      <w:pPr>
-        <w:rPr>
-          <w:b/>
-          <w:bCs/>
-          <w:sz w:val="28"/>
-          <w:szCs w:val="28"/>
-          <w:u w:val="single"/>
-        </w:rPr>
-      </w:pPr>
-    </w:p>
-    <w:p>
-      <w:pPr>
-        <w:rPr>
-          <w:b/>
-          <w:bCs/>
-          <w:sz w:val="28"/>
-          <w:szCs w:val="28"/>
-          <w:u w:val="single"/>
-        </w:rPr>
-      </w:pPr>
-    </w:p>
-    <w:p>
-      <w:pPr>
-        <w:rPr>
-          <w:b/>
-          <w:bCs/>
-          <w:sz w:val="28"/>
-          <w:szCs w:val="28"/>
-          <w:u w:val="single"/>
-        </w:rPr>
-      </w:pPr>
-    </w:p>
-    <w:p>
-      <w:pPr>
-        <w:rPr>
-          <w:b/>
-          <w:bCs/>
-          <w:sz w:val="28"/>
-          <w:szCs w:val="28"/>
-          <w:u w:val="single"/>
-        </w:rPr>
-      </w:pPr>
-    </w:p>
-    <w:p>
-      <w:pPr>
-        <w:rPr>
-          <w:b/>
-          <w:bCs/>
-          <w:sz w:val="28"/>
-          <w:szCs w:val="28"/>
-          <w:u w:val="single"/>
-        </w:rPr>
-      </w:pPr>
-    </w:p>
-    <w:p>
-      <w:pPr>
         <w:rPr>
           <w:b/>
           <w:bCs/>
@@ -629,6 +507,22 @@
         <w:t>/2026</w:t>
       </w:r>
     </w:p>
+    <w:p/>
+    <w:p/>
+    <w:p/>
+    <w:p/>
+    <w:p/>
+    <w:p/>
+    <w:p/>
+    <w:p/>
+    <w:p/>
+    <w:p/>
+    <w:p/>
+    <w:p/>
+    <w:p>
+      <w:bookmarkStart w:id="0" w:name="_GoBack"/>
+      <w:bookmarkEnd w:id="0"/>
+    </w:p>
     <w:p>
       <w:pPr>
         <w:rPr>
@@ -665,6 +559,7 @@
           <w:i/>
           <w:iCs/>
         </w:rPr>
+        <w:lastRenderedPageBreak/>
         <w:t>ÍNDICE</w:t>
       </w:r>
     </w:p>
@@ -1134,7 +1029,7 @@
         </w:rPr>
         <w:br w:type="page"/>
       </w:r>
-      <w:bookmarkStart w:id="0" w:name="_Toc237872476"/>
+      <w:bookmarkStart w:id="1" w:name="_Toc237872476"/>
       <w:r>
         <w:rPr>
           <w:b/>
@@ -1206,7 +1101,7 @@
         </w:rPr>
         <w:t>(MODP)</w:t>
       </w:r>
-      <w:bookmarkEnd w:id="0"/>
+      <w:bookmarkEnd w:id="1"/>
     </w:p>
     <w:p>
       <w:pPr>
@@ -1217,7 +1112,7 @@
           <w:u w:val="single"/>
         </w:rPr>
       </w:pPr>
-      <w:bookmarkStart w:id="1" w:name="_Toc237872477"/>
+      <w:bookmarkStart w:id="2" w:name="_Toc237872477"/>
       <w:r>
         <w:rPr>
           <w:b/>
@@ -1226,7 +1121,7 @@
         </w:rPr>
         <w:t>Identificación de Clases</w:t>
       </w:r>
-      <w:bookmarkEnd w:id="1"/>
+      <w:bookmarkEnd w:id="2"/>
     </w:p>
     <w:p/>
     <w:p>
@@ -1313,7 +1208,7 @@
           <w:u w:val="single"/>
         </w:rPr>
       </w:pPr>
-      <w:bookmarkStart w:id="2" w:name="_Toc237872478"/>
+      <w:bookmarkStart w:id="3" w:name="_Toc237872478"/>
       <w:r>
         <w:rPr>
           <w:b/>
@@ -1332,13 +1227,14 @@
         </w:rPr>
         <w:t>PlantUML</w:t>
       </w:r>
-      <w:bookmarkEnd w:id="2"/>
+      <w:bookmarkEnd w:id="3"/>
       <w:proofErr w:type="spellEnd"/>
     </w:p>
     <w:p>
       <w:r>
         <w:rPr>
           <w:noProof/>
+          <w:lang w:val="en-US" w:eastAsia="en-US"/>
         </w:rPr>
         <w:drawing>
           <wp:inline distT="0" distB="0" distL="0" distR="0" wp14:anchorId="138D8AD3" wp14:editId="154751ED">
@@ -1400,7 +1296,7 @@
           <w:u w:val="single"/>
         </w:rPr>
       </w:pPr>
-      <w:bookmarkStart w:id="3" w:name="_Toc237872479"/>
+      <w:bookmarkStart w:id="4" w:name="_Toc237872479"/>
       <w:r>
         <w:rPr>
           <w:b/>
@@ -1410,12 +1306,13 @@
         <w:lastRenderedPageBreak/>
         <w:t>Relaciones entre Clases</w:t>
       </w:r>
-      <w:bookmarkEnd w:id="3"/>
+      <w:bookmarkEnd w:id="4"/>
     </w:p>
     <w:p>
       <w:r>
         <w:rPr>
           <w:noProof/>
+          <w:lang w:val="en-US" w:eastAsia="en-US"/>
         </w:rPr>
         <w:drawing>
           <wp:inline distT="0" distB="0" distL="0" distR="0" wp14:anchorId="150CE07C" wp14:editId="07B9CDBC">
@@ -1539,6 +1436,7 @@
       <w:r>
         <w:rPr>
           <w:noProof/>
+          <w:lang w:val="en-US" w:eastAsia="en-US"/>
         </w:rPr>
         <w:drawing>
           <wp:inline distT="0" distB="0" distL="0" distR="0" wp14:anchorId="032D1B73" wp14:editId="0A517556">
@@ -1655,6 +1553,7 @@
       <w:r>
         <w:rPr>
           <w:noProof/>
+          <w:lang w:val="en-US" w:eastAsia="en-US"/>
         </w:rPr>
         <w:lastRenderedPageBreak/>
         <w:drawing>
@@ -1756,6 +1655,7 @@
       <w:r>
         <w:rPr>
           <w:noProof/>
+          <w:lang w:val="en-US" w:eastAsia="en-US"/>
         </w:rPr>
         <w:drawing>
           <wp:inline distT="0" distB="0" distL="0" distR="0" wp14:anchorId="4CE982CF" wp14:editId="33D74025">
@@ -1844,6 +1744,7 @@
       <w:r>
         <w:rPr>
           <w:noProof/>
+          <w:lang w:val="en-US" w:eastAsia="en-US"/>
         </w:rPr>
         <w:lastRenderedPageBreak/>
         <w:drawing>
@@ -1948,7 +1849,7 @@
           <w:u w:val="single"/>
         </w:rPr>
       </w:pPr>
-      <w:bookmarkStart w:id="4" w:name="_Toc237872480"/>
+      <w:bookmarkStart w:id="5" w:name="_Toc237872480"/>
       <w:r>
         <w:rPr>
           <w:b/>
@@ -1965,18 +1866,54 @@
         </w:rPr>
         <w:t xml:space="preserve"> segunda entrega</w:t>
       </w:r>
-      <w:bookmarkEnd w:id="4"/>
-    </w:p>
-    <w:p>
-      <w:proofErr w:type="spellStart"/>
-      <w:r>
-        <w:t>img</w:t>
-      </w:r>
-      <w:proofErr w:type="spellEnd"/>
+      <w:bookmarkEnd w:id="5"/>
+    </w:p>
+    <w:p>
+      <w:r>
+        <w:rPr>
+          <w:noProof/>
+          <w:lang w:val="en-US" w:eastAsia="en-US"/>
+        </w:rPr>
+        <w:drawing>
+          <wp:inline distT="0" distB="0" distL="0" distR="0" wp14:anchorId="1F64CE04" wp14:editId="40EE10E3">
+            <wp:extent cx="5733415" cy="4230370"/>
+            <wp:effectExtent l="0" t="0" r="635" b="0"/>
+            <wp:docPr id="5" name="Imagen 5"/>
+            <wp:cNvGraphicFramePr>
+              <a:graphicFrameLocks xmlns:a="http://schemas.openxmlformats.org/drawingml/2006/main" noChangeAspect="1"/>
+            </wp:cNvGraphicFramePr>
+            <a:graphic xmlns:a="http://schemas.openxmlformats.org/drawingml/2006/main">
+              <a:graphicData uri="http://schemas.openxmlformats.org/drawingml/2006/picture">
+                <pic:pic xmlns:pic="http://schemas.openxmlformats.org/drawingml/2006/picture">
+                  <pic:nvPicPr>
+                    <pic:cNvPr id="1" name=""/>
+                    <pic:cNvPicPr/>
+                  </pic:nvPicPr>
+                  <pic:blipFill>
+                    <a:blip r:embed="rId20"/>
+                    <a:stretch>
+                      <a:fillRect/>
+                    </a:stretch>
+                  </pic:blipFill>
+                  <pic:spPr>
+                    <a:xfrm>
+                      <a:off x="0" y="0"/>
+                      <a:ext cx="5733415" cy="4230370"/>
+                    </a:xfrm>
+                    <a:prstGeom prst="rect">
+                      <a:avLst/>
+                    </a:prstGeom>
+                  </pic:spPr>
+                </pic:pic>
+              </a:graphicData>
+            </a:graphic>
+          </wp:inline>
+        </w:drawing>
+      </w:r>
     </w:p>
     <w:sectPr>
-      <w:headerReference w:type="default" r:id="rId20"/>
-      <w:footerReference w:type="default" r:id="rId21"/>
+      <w:headerReference w:type="default" r:id="rId21"/>
+      <w:footerReference w:type="default" r:id="rId22"/>
       <w:pgSz w:w="11909" w:h="16834"/>
       <w:pgMar w:top="1440" w:right="1440" w:bottom="1440" w:left="1440" w:header="720" w:footer="720" w:gutter="0"/>
       <w:pgNumType w:start="0"/>
@@ -1988,7 +1925,7 @@
 </file>
 
 <file path=word/endnotes.xml><?xml version="1.0" encoding="utf-8"?>
-<w:endnotes xmlns:wpc="http://schemas.microsoft.com/office/word/2010/wordprocessingCanvas" xmlns:cx="http://schemas.microsoft.com/office/drawing/2014/chartex" xmlns:cx1="http://schemas.microsoft.com/office/drawing/2015/9/8/chartex" xmlns:cx2="http://schemas.microsoft.com/office/drawing/2015/10/21/chartex" xmlns:cx3="http://schemas.microsoft.com/office/drawing/2016/5/9/chartex" xmlns:cx4="http://schemas.microsoft.com/office/drawing/2016/5/10/chartex" xmlns:cx5="http://schemas.microsoft.com/office/drawing/2016/5/11/chartex" xmlns:cx6="http://schemas.microsoft.com/office/drawing/2016/5/12/chartex" xmlns:cx7="http://schemas.microsoft.com/office/drawing/2016/5/13/chartex" xmlns:cx8="http://schemas.microsoft.com/office/drawing/2016/5/14/chartex" xmlns:mc="http://schemas.openxmlformats.org/markup-compatibility/2006" xmlns:aink="http://schemas.microsoft.com/office/drawing/2016/ink" xmlns:am3d="http://schemas.microsoft.com/office/drawing/2017/model3d" xmlns:o="urn:schemas-microsoft-com:office:office" xmlns:oel="http://schemas.microsoft.com/office/2019/extlst" xmlns:r="http://schemas.openxmlformats.org/officeDocument/2006/relationships" xmlns:m="http://schemas.openxmlformats.org/officeDocument/2006/math" xmlns:v="urn:schemas-microsoft-com:vml" xmlns:wp14="http://schemas.microsoft.com/office/word/2010/wordprocessingDrawing" xmlns:wp="http://schemas.openxmlformats.org/drawingml/2006/wordprocessingDrawing" xmlns:w10="urn:schemas-microsoft-com:office:word" xmlns:w="http://schemas.openxmlformats.org/wordprocessingml/2006/main" xmlns:w14="http://schemas.microsoft.com/office/word/2010/wordml" xmlns:w15="http://schemas.microsoft.com/office/word/2012/wordml" xmlns:w16cei="http://schemas.microsoft.com/office/word/2026/wordml/cei" xmlns:w16cex="http://schemas.microsoft.com/office/word/2018/wordml/cex" xmlns:w16cid="http://schemas.microsoft.com/office/word/2016/wordml/cid" xmlns:w16="http://schemas.microsoft.com/office/word/2018/wordml" xmlns:w16du="http://schemas.microsoft.com/office/word/2023/wordml/word16du" xmlns:w16sdtdh="http://schemas.microsoft.com/office/word/2020/wordml/sdtdatahash" xmlns:w16sdtfl="http://schemas.microsoft.com/office/word/2024/wordml/sdtformatlock" xmlns:w16se="http://schemas.microsoft.com/office/word/2015/wordml/symex" xmlns:wpg="http://schemas.microsoft.com/office/word/2010/wordprocessingGroup" xmlns:wpi="http://schemas.microsoft.com/office/word/2010/wordprocessingInk" xmlns:wne="http://schemas.microsoft.com/office/word/2006/wordml" xmlns:wps="http://schemas.microsoft.com/office/word/2010/wordprocessingShape" mc:Ignorable="w14 w15 w16se w16cid w16 w16cex w16sdtdh w16sdtfl w16du wp14">
+<w:endnotes xmlns:wpc="http://schemas.microsoft.com/office/word/2010/wordprocessingCanvas" xmlns:cx="http://schemas.microsoft.com/office/drawing/2014/chartex" xmlns:mc="http://schemas.openxmlformats.org/markup-compatibility/2006" xmlns:o="urn:schemas-microsoft-com:office:office" xmlns:r="http://schemas.openxmlformats.org/officeDocument/2006/relationships" xmlns:m="http://schemas.openxmlformats.org/officeDocument/2006/math" xmlns:v="urn:schemas-microsoft-com:vml" xmlns:wp14="http://schemas.microsoft.com/office/word/2010/wordprocessingDrawing" xmlns:wp="http://schemas.openxmlformats.org/drawingml/2006/wordprocessingDrawing" xmlns:w10="urn:schemas-microsoft-com:office:word" xmlns:w="http://schemas.openxmlformats.org/wordprocessingml/2006/main" xmlns:w14="http://schemas.microsoft.com/office/word/2010/wordml" xmlns:w15="http://schemas.microsoft.com/office/word/2012/wordml" xmlns:w16se="http://schemas.microsoft.com/office/word/2015/wordml/symex" xmlns:wpg="http://schemas.microsoft.com/office/word/2010/wordprocessingGroup" xmlns:wpi="http://schemas.microsoft.com/office/word/2010/wordprocessingInk" xmlns:wne="http://schemas.microsoft.com/office/word/2006/wordml" xmlns:wps="http://schemas.microsoft.com/office/word/2010/wordprocessingShape" mc:Ignorable="w14 w15 w16se wp14">
   <w:endnote w:type="separator" w:id="-1">
     <w:p>
       <w:pPr>
@@ -2013,7 +1950,7 @@
 </file>
 
 <file path=word/footer1.xml><?xml version="1.0" encoding="utf-8"?>
-<w:ftr xmlns:wpc="http://schemas.microsoft.com/office/word/2010/wordprocessingCanvas" xmlns:cx="http://schemas.microsoft.com/office/drawing/2014/chartex" xmlns:cx1="http://schemas.microsoft.com/office/drawing/2015/9/8/chartex" xmlns:cx2="http://schemas.microsoft.com/office/drawing/2015/10/21/chartex" xmlns:cx3="http://schemas.microsoft.com/office/drawing/2016/5/9/chartex" xmlns:cx4="http://schemas.microsoft.com/office/drawing/2016/5/10/chartex" xmlns:cx5="http://schemas.microsoft.com/office/drawing/2016/5/11/chartex" xmlns:cx6="http://schemas.microsoft.com/office/drawing/2016/5/12/chartex" xmlns:cx7="http://schemas.microsoft.com/office/drawing/2016/5/13/chartex" xmlns:cx8="http://schemas.microsoft.com/office/drawing/2016/5/14/chartex" xmlns:mc="http://schemas.openxmlformats.org/markup-compatibility/2006" xmlns:aink="http://schemas.microsoft.com/office/drawing/2016/ink" xmlns:am3d="http://schemas.microsoft.com/office/drawing/2017/model3d" xmlns:o="urn:schemas-microsoft-com:office:office" xmlns:oel="http://schemas.microsoft.com/office/2019/extlst" xmlns:r="http://schemas.openxmlformats.org/officeDocument/2006/relationships" xmlns:m="http://schemas.openxmlformats.org/officeDocument/2006/math" xmlns:v="urn:schemas-microsoft-com:vml" xmlns:wp14="http://schemas.microsoft.com/office/word/2010/wordprocessingDrawing" xmlns:wp="http://schemas.openxmlformats.org/drawingml/2006/wordprocessingDrawing" xmlns:w10="urn:schemas-microsoft-com:office:word" xmlns:w="http://schemas.openxmlformats.org/wordprocessingml/2006/main" xmlns:w14="http://schemas.microsoft.com/office/word/2010/wordml" xmlns:w15="http://schemas.microsoft.com/office/word/2012/wordml" xmlns:w16cei="http://schemas.microsoft.com/office/word/2026/wordml/cei" xmlns:w16cex="http://schemas.microsoft.com/office/word/2018/wordml/cex" xmlns:w16cid="http://schemas.microsoft.com/office/word/2016/wordml/cid" xmlns:w16="http://schemas.microsoft.com/office/word/2018/wordml" xmlns:w16du="http://schemas.microsoft.com/office/word/2023/wordml/word16du" xmlns:w16sdtdh="http://schemas.microsoft.com/office/word/2020/wordml/sdtdatahash" xmlns:w16sdtfl="http://schemas.microsoft.com/office/word/2024/wordml/sdtformatlock" xmlns:w16se="http://schemas.microsoft.com/office/word/2015/wordml/symex" xmlns:wpg="http://schemas.microsoft.com/office/word/2010/wordprocessingGroup" xmlns:wpi="http://schemas.microsoft.com/office/word/2010/wordprocessingInk" xmlns:wne="http://schemas.microsoft.com/office/word/2006/wordml" xmlns:wps="http://schemas.microsoft.com/office/word/2010/wordprocessingShape" mc:Ignorable="w14 w15 w16se w16cid w16 w16cex w16sdtdh w16sdtfl w16du wp14">
+<w:ftr xmlns:wpc="http://schemas.microsoft.com/office/word/2010/wordprocessingCanvas" xmlns:cx="http://schemas.microsoft.com/office/drawing/2014/chartex" xmlns:mc="http://schemas.openxmlformats.org/markup-compatibility/2006" xmlns:o="urn:schemas-microsoft-com:office:office" xmlns:r="http://schemas.openxmlformats.org/officeDocument/2006/relationships" xmlns:m="http://schemas.openxmlformats.org/officeDocument/2006/math" xmlns:v="urn:schemas-microsoft-com:vml" xmlns:wp14="http://schemas.microsoft.com/office/word/2010/wordprocessingDrawing" xmlns:wp="http://schemas.openxmlformats.org/drawingml/2006/wordprocessingDrawing" xmlns:w10="urn:schemas-microsoft-com:office:word" xmlns:w="http://schemas.openxmlformats.org/wordprocessingml/2006/main" xmlns:w14="http://schemas.microsoft.com/office/word/2010/wordml" xmlns:w15="http://schemas.microsoft.com/office/word/2012/wordml" xmlns:w16se="http://schemas.microsoft.com/office/word/2015/wordml/symex" xmlns:wpg="http://schemas.microsoft.com/office/word/2010/wordprocessingGroup" xmlns:wpi="http://schemas.microsoft.com/office/word/2010/wordprocessingInk" xmlns:wne="http://schemas.microsoft.com/office/word/2006/wordml" xmlns:wps="http://schemas.microsoft.com/office/word/2010/wordprocessingShape" mc:Ignorable="w14 w15 w16se wp14">
   <w:p>
     <w:r>
       <w:rPr>
@@ -2116,7 +2053,7 @@
             </wp:anchor>
           </w:drawing>
         </mc:Choice>
-        <mc:Fallback>
+        <mc:Fallback xmlns:cx1="http://schemas.microsoft.com/office/drawing/2015/9/8/chartex" xmlns:cx2="http://schemas.microsoft.com/office/drawing/2015/10/21/chartex" xmlns:cx3="http://schemas.microsoft.com/office/drawing/2016/5/9/chartex" xmlns:cx4="http://schemas.microsoft.com/office/drawing/2016/5/10/chartex" xmlns:cx5="http://schemas.microsoft.com/office/drawing/2016/5/11/chartex" xmlns:cx6="http://schemas.microsoft.com/office/drawing/2016/5/12/chartex" xmlns:cx7="http://schemas.microsoft.com/office/drawing/2016/5/13/chartex" xmlns:cx8="http://schemas.microsoft.com/office/drawing/2016/5/14/chartex" xmlns:aink="http://schemas.microsoft.com/office/drawing/2016/ink" xmlns:am3d="http://schemas.microsoft.com/office/drawing/2017/model3d" xmlns:oel="http://schemas.microsoft.com/office/2019/extlst" xmlns:w16cei="http://schemas.microsoft.com/office/word/2026/wordml/cei" xmlns:w16cex="http://schemas.microsoft.com/office/word/2018/wordml/cex" xmlns:w16cid="http://schemas.microsoft.com/office/word/2016/wordml/cid" xmlns:w16="http://schemas.microsoft.com/office/word/2018/wordml" xmlns:w16du="http://schemas.microsoft.com/office/word/2023/wordml/word16du" xmlns:w16sdtdh="http://schemas.microsoft.com/office/word/2020/wordml/sdtdatahash" xmlns:w16sdtfl="http://schemas.microsoft.com/office/word/2024/wordml/sdtformatlock">
           <w:pict>
             <v:shapetype w14:anchorId="55970E85" id="_x0000_t202" coordsize="21600,21600" o:spt="202" path="m,l,21600r21600,l21600,xe">
               <v:stroke joinstyle="miter"/>
@@ -2242,7 +2179,7 @@
             </wp:anchor>
           </w:drawing>
         </mc:Choice>
-        <mc:Fallback>
+        <mc:Fallback xmlns:cx1="http://schemas.microsoft.com/office/drawing/2015/9/8/chartex" xmlns:cx2="http://schemas.microsoft.com/office/drawing/2015/10/21/chartex" xmlns:cx3="http://schemas.microsoft.com/office/drawing/2016/5/9/chartex" xmlns:cx4="http://schemas.microsoft.com/office/drawing/2016/5/10/chartex" xmlns:cx5="http://schemas.microsoft.com/office/drawing/2016/5/11/chartex" xmlns:cx6="http://schemas.microsoft.com/office/drawing/2016/5/12/chartex" xmlns:cx7="http://schemas.microsoft.com/office/drawing/2016/5/13/chartex" xmlns:cx8="http://schemas.microsoft.com/office/drawing/2016/5/14/chartex" xmlns:aink="http://schemas.microsoft.com/office/drawing/2016/ink" xmlns:am3d="http://schemas.microsoft.com/office/drawing/2017/model3d" xmlns:oel="http://schemas.microsoft.com/office/2019/extlst" xmlns:w16cei="http://schemas.microsoft.com/office/word/2026/wordml/cei" xmlns:w16cex="http://schemas.microsoft.com/office/word/2018/wordml/cex" xmlns:w16cid="http://schemas.microsoft.com/office/word/2016/wordml/cid" xmlns:w16="http://schemas.microsoft.com/office/word/2018/wordml" xmlns:w16du="http://schemas.microsoft.com/office/word/2023/wordml/word16du" xmlns:w16sdtdh="http://schemas.microsoft.com/office/word/2020/wordml/sdtdatahash" xmlns:w16sdtfl="http://schemas.microsoft.com/office/word/2024/wordml/sdtformatlock">
           <w:pict>
             <v:shapetype w14:anchorId="78A880AB" id="_x0000_t15" coordsize="21600,21600" o:spt="15" adj="16200" path="m@0,l,,,21600@0,21600,21600,10800xe">
               <v:stroke joinstyle="miter"/>
@@ -2299,7 +2236,7 @@
       <w:rPr>
         <w:noProof/>
       </w:rPr>
-      <w:t>8</w:t>
+      <w:t>5</w:t>
     </w:r>
     <w:r>
       <w:fldChar w:fldCharType="end"/>
@@ -2309,7 +2246,7 @@
 </file>
 
 <file path=word/footnotes.xml><?xml version="1.0" encoding="utf-8"?>
-<w:footnotes xmlns:wpc="http://schemas.microsoft.com/office/word/2010/wordprocessingCanvas" xmlns:cx="http://schemas.microsoft.com/office/drawing/2014/chartex" xmlns:cx1="http://schemas.microsoft.com/office/drawing/2015/9/8/chartex" xmlns:cx2="http://schemas.microsoft.com/office/drawing/2015/10/21/chartex" xmlns:cx3="http://schemas.microsoft.com/office/drawing/2016/5/9/chartex" xmlns:cx4="http://schemas.microsoft.com/office/drawing/2016/5/10/chartex" xmlns:cx5="http://schemas.microsoft.com/office/drawing/2016/5/11/chartex" xmlns:cx6="http://schemas.microsoft.com/office/drawing/2016/5/12/chartex" xmlns:cx7="http://schemas.microsoft.com/office/drawing/2016/5/13/chartex" xmlns:cx8="http://schemas.microsoft.com/office/drawing/2016/5/14/chartex" xmlns:mc="http://schemas.openxmlformats.org/markup-compatibility/2006" xmlns:aink="http://schemas.microsoft.com/office/drawing/2016/ink" xmlns:am3d="http://schemas.microsoft.com/office/drawing/2017/model3d" xmlns:o="urn:schemas-microsoft-com:office:office" xmlns:oel="http://schemas.microsoft.com/office/2019/extlst" xmlns:r="http://schemas.openxmlformats.org/officeDocument/2006/relationships" xmlns:m="http://schemas.openxmlformats.org/officeDocument/2006/math" xmlns:v="urn:schemas-microsoft-com:vml" xmlns:wp14="http://schemas.microsoft.com/office/word/2010/wordprocessingDrawing" xmlns:wp="http://schemas.openxmlformats.org/drawingml/2006/wordprocessingDrawing" xmlns:w10="urn:schemas-microsoft-com:office:word" xmlns:w="http://schemas.openxmlformats.org/wordprocessingml/2006/main" xmlns:w14="http://schemas.microsoft.com/office/word/2010/wordml" xmlns:w15="http://schemas.microsoft.com/office/word/2012/wordml" xmlns:w16cei="http://schemas.microsoft.com/office/word/2026/wordml/cei" xmlns:w16cex="http://schemas.microsoft.com/office/word/2018/wordml/cex" xmlns:w16cid="http://schemas.microsoft.com/office/word/2016/wordml/cid" xmlns:w16="http://schemas.microsoft.com/office/word/2018/wordml" xmlns:w16du="http://schemas.microsoft.com/office/word/2023/wordml/word16du" xmlns:w16sdtdh="http://schemas.microsoft.com/office/word/2020/wordml/sdtdatahash" xmlns:w16sdtfl="http://schemas.microsoft.com/office/word/2024/wordml/sdtformatlock" xmlns:w16se="http://schemas.microsoft.com/office/word/2015/wordml/symex" xmlns:wpg="http://schemas.microsoft.com/office/word/2010/wordprocessingGroup" xmlns:wpi="http://schemas.microsoft.com/office/word/2010/wordprocessingInk" xmlns:wne="http://schemas.microsoft.com/office/word/2006/wordml" xmlns:wps="http://schemas.microsoft.com/office/word/2010/wordprocessingShape" mc:Ignorable="w14 w15 w16se w16cid w16 w16cex w16sdtdh w16sdtfl w16du wp14">
+<w:footnotes xmlns:wpc="http://schemas.microsoft.com/office/word/2010/wordprocessingCanvas" xmlns:cx="http://schemas.microsoft.com/office/drawing/2014/chartex" xmlns:mc="http://schemas.openxmlformats.org/markup-compatibility/2006" xmlns:o="urn:schemas-microsoft-com:office:office" xmlns:r="http://schemas.openxmlformats.org/officeDocument/2006/relationships" xmlns:m="http://schemas.openxmlformats.org/officeDocument/2006/math" xmlns:v="urn:schemas-microsoft-com:vml" xmlns:wp14="http://schemas.microsoft.com/office/word/2010/wordprocessingDrawing" xmlns:wp="http://schemas.openxmlformats.org/drawingml/2006/wordprocessingDrawing" xmlns:w10="urn:schemas-microsoft-com:office:word" xmlns:w="http://schemas.openxmlformats.org/wordprocessingml/2006/main" xmlns:w14="http://schemas.microsoft.com/office/word/2010/wordml" xmlns:w15="http://schemas.microsoft.com/office/word/2012/wordml" xmlns:w16se="http://schemas.microsoft.com/office/word/2015/wordml/symex" xmlns:wpg="http://schemas.microsoft.com/office/word/2010/wordprocessingGroup" xmlns:wpi="http://schemas.microsoft.com/office/word/2010/wordprocessingInk" xmlns:wne="http://schemas.microsoft.com/office/word/2006/wordml" xmlns:wps="http://schemas.microsoft.com/office/word/2010/wordprocessingShape" mc:Ignorable="w14 w15 w16se wp14">
   <w:footnote w:type="separator" w:id="-1">
     <w:p>
       <w:pPr>
@@ -2334,7 +2271,7 @@
 </file>
 
 <file path=word/header1.xml><?xml version="1.0" encoding="utf-8"?>
-<w:hdr xmlns:wpc="http://schemas.microsoft.com/office/word/2010/wordprocessingCanvas" xmlns:cx="http://schemas.microsoft.com/office/drawing/2014/chartex" xmlns:cx1="http://schemas.microsoft.com/office/drawing/2015/9/8/chartex" xmlns:cx2="http://schemas.microsoft.com/office/drawing/2015/10/21/chartex" xmlns:cx3="http://schemas.microsoft.com/office/drawing/2016/5/9/chartex" xmlns:cx4="http://schemas.microsoft.com/office/drawing/2016/5/10/chartex" xmlns:cx5="http://schemas.microsoft.com/office/drawing/2016/5/11/chartex" xmlns:cx6="http://schemas.microsoft.com/office/drawing/2016/5/12/chartex" xmlns:cx7="http://schemas.microsoft.com/office/drawing/2016/5/13/chartex" xmlns:cx8="http://schemas.microsoft.com/office/drawing/2016/5/14/chartex" xmlns:mc="http://schemas.openxmlformats.org/markup-compatibility/2006" xmlns:aink="http://schemas.microsoft.com/office/drawing/2016/ink" xmlns:am3d="http://schemas.microsoft.com/office/drawing/2017/model3d" xmlns:o="urn:schemas-microsoft-com:office:office" xmlns:oel="http://schemas.microsoft.com/office/2019/extlst" xmlns:r="http://schemas.openxmlformats.org/officeDocument/2006/relationships" xmlns:m="http://schemas.openxmlformats.org/officeDocument/2006/math" xmlns:v="urn:schemas-microsoft-com:vml" xmlns:wp14="http://schemas.microsoft.com/office/word/2010/wordprocessingDrawing" xmlns:wp="http://schemas.openxmlformats.org/drawingml/2006/wordprocessingDrawing" xmlns:w10="urn:schemas-microsoft-com:office:word" xmlns:w="http://schemas.openxmlformats.org/wordprocessingml/2006/main" xmlns:w14="http://schemas.microsoft.com/office/word/2010/wordml" xmlns:w15="http://schemas.microsoft.com/office/word/2012/wordml" xmlns:w16cei="http://schemas.microsoft.com/office/word/2026/wordml/cei" xmlns:w16cex="http://schemas.microsoft.com/office/word/2018/wordml/cex" xmlns:w16cid="http://schemas.microsoft.com/office/word/2016/wordml/cid" xmlns:w16="http://schemas.microsoft.com/office/word/2018/wordml" xmlns:w16du="http://schemas.microsoft.com/office/word/2023/wordml/word16du" xmlns:w16sdtdh="http://schemas.microsoft.com/office/word/2020/wordml/sdtdatahash" xmlns:w16sdtfl="http://schemas.microsoft.com/office/word/2024/wordml/sdtformatlock" xmlns:w16se="http://schemas.microsoft.com/office/word/2015/wordml/symex" xmlns:wpg="http://schemas.microsoft.com/office/word/2010/wordprocessingGroup" xmlns:wpi="http://schemas.microsoft.com/office/word/2010/wordprocessingInk" xmlns:wne="http://schemas.microsoft.com/office/word/2006/wordml" xmlns:wps="http://schemas.microsoft.com/office/word/2010/wordprocessingShape" mc:Ignorable="w14 w15 w16se w16cid w16 w16cex w16sdtdh w16sdtfl w16du wp14">
+<w:hdr xmlns:wpc="http://schemas.microsoft.com/office/word/2010/wordprocessingCanvas" xmlns:cx="http://schemas.microsoft.com/office/drawing/2014/chartex" xmlns:mc="http://schemas.openxmlformats.org/markup-compatibility/2006" xmlns:o="urn:schemas-microsoft-com:office:office" xmlns:r="http://schemas.openxmlformats.org/officeDocument/2006/relationships" xmlns:m="http://schemas.openxmlformats.org/officeDocument/2006/math" xmlns:v="urn:schemas-microsoft-com:vml" xmlns:wp14="http://schemas.microsoft.com/office/word/2010/wordprocessingDrawing" xmlns:wp="http://schemas.openxmlformats.org/drawingml/2006/wordprocessingDrawing" xmlns:w10="urn:schemas-microsoft-com:office:word" xmlns:w="http://schemas.openxmlformats.org/wordprocessingml/2006/main" xmlns:w14="http://schemas.microsoft.com/office/word/2010/wordml" xmlns:w15="http://schemas.microsoft.com/office/word/2012/wordml" xmlns:w16se="http://schemas.microsoft.com/office/word/2015/wordml/symex" xmlns:wpg="http://schemas.microsoft.com/office/word/2010/wordprocessingGroup" xmlns:wpi="http://schemas.microsoft.com/office/word/2010/wordprocessingInk" xmlns:wne="http://schemas.microsoft.com/office/word/2006/wordml" xmlns:wps="http://schemas.microsoft.com/office/word/2010/wordprocessingShape" mc:Ignorable="w14 w15 w16se wp14">
   <w:p>
     <w:r>
       <w:rPr>
@@ -2421,7 +2358,7 @@
             </wp:anchor>
           </w:drawing>
         </mc:Choice>
-        <mc:Fallback>
+        <mc:Fallback xmlns:cx1="http://schemas.microsoft.com/office/drawing/2015/9/8/chartex" xmlns:cx2="http://schemas.microsoft.com/office/drawing/2015/10/21/chartex" xmlns:cx3="http://schemas.microsoft.com/office/drawing/2016/5/9/chartex" xmlns:cx4="http://schemas.microsoft.com/office/drawing/2016/5/10/chartex" xmlns:cx5="http://schemas.microsoft.com/office/drawing/2016/5/11/chartex" xmlns:cx6="http://schemas.microsoft.com/office/drawing/2016/5/12/chartex" xmlns:cx7="http://schemas.microsoft.com/office/drawing/2016/5/13/chartex" xmlns:cx8="http://schemas.microsoft.com/office/drawing/2016/5/14/chartex" xmlns:aink="http://schemas.microsoft.com/office/drawing/2016/ink" xmlns:am3d="http://schemas.microsoft.com/office/drawing/2017/model3d" xmlns:oel="http://schemas.microsoft.com/office/2019/extlst" xmlns:w16cei="http://schemas.microsoft.com/office/word/2026/wordml/cei" xmlns:w16cex="http://schemas.microsoft.com/office/word/2018/wordml/cex" xmlns:w16cid="http://schemas.microsoft.com/office/word/2016/wordml/cid" xmlns:w16="http://schemas.microsoft.com/office/word/2018/wordml" xmlns:w16du="http://schemas.microsoft.com/office/word/2023/wordml/word16du" xmlns:w16sdtdh="http://schemas.microsoft.com/office/word/2020/wordml/sdtdatahash" xmlns:w16sdtfl="http://schemas.microsoft.com/office/word/2024/wordml/sdtformatlock">
           <w:pict>
             <v:shapetype w14:anchorId="6704EB9D" id="_x0000_t202" coordsize="21600,21600" o:spt="202" path="m,l,21600r21600,l21600,xe">
               <v:stroke joinstyle="miter"/>
@@ -2519,7 +2456,7 @@
 </file>
 
 <file path=word/numbering.xml><?xml version="1.0" encoding="utf-8"?>
-<w:numbering xmlns:wpc="http://schemas.microsoft.com/office/word/2010/wordprocessingCanvas" xmlns:cx="http://schemas.microsoft.com/office/drawing/2014/chartex" xmlns:cx1="http://schemas.microsoft.com/office/drawing/2015/9/8/chartex" xmlns:cx2="http://schemas.microsoft.com/office/drawing/2015/10/21/chartex" xmlns:cx3="http://schemas.microsoft.com/office/drawing/2016/5/9/chartex" xmlns:cx4="http://schemas.microsoft.com/office/drawing/2016/5/10/chartex" xmlns:cx5="http://schemas.microsoft.com/office/drawing/2016/5/11/chartex" xmlns:cx6="http://schemas.microsoft.com/office/drawing/2016/5/12/chartex" xmlns:cx7="http://schemas.microsoft.com/office/drawing/2016/5/13/chartex" xmlns:cx8="http://schemas.microsoft.com/office/drawing/2016/5/14/chartex" xmlns:mc="http://schemas.openxmlformats.org/markup-compatibility/2006" xmlns:aink="http://schemas.microsoft.com/office/drawing/2016/ink" xmlns:am3d="http://schemas.microsoft.com/office/drawing/2017/model3d" xmlns:o="urn:schemas-microsoft-com:office:office" xmlns:oel="http://schemas.microsoft.com/office/2019/extlst" xmlns:r="http://schemas.openxmlformats.org/officeDocument/2006/relationships" xmlns:m="http://schemas.openxmlformats.org/officeDocument/2006/math" xmlns:v="urn:schemas-microsoft-com:vml" xmlns:wp14="http://schemas.microsoft.com/office/word/2010/wordprocessingDrawing" xmlns:wp="http://schemas.openxmlformats.org/drawingml/2006/wordprocessingDrawing" xmlns:w10="urn:schemas-microsoft-com:office:word" xmlns:w="http://schemas.openxmlformats.org/wordprocessingml/2006/main" xmlns:w14="http://schemas.microsoft.com/office/word/2010/wordml" xmlns:w15="http://schemas.microsoft.com/office/word/2012/wordml" xmlns:w16cei="http://schemas.microsoft.com/office/word/2026/wordml/cei" xmlns:w16cex="http://schemas.microsoft.com/office/word/2018/wordml/cex" xmlns:w16cid="http://schemas.microsoft.com/office/word/2016/wordml/cid" xmlns:w16="http://schemas.microsoft.com/office/word/2018/wordml" xmlns:w16du="http://schemas.microsoft.com/office/word/2023/wordml/word16du" xmlns:w16sdtdh="http://schemas.microsoft.com/office/word/2020/wordml/sdtdatahash" xmlns:w16sdtfl="http://schemas.microsoft.com/office/word/2024/wordml/sdtformatlock" xmlns:w16se="http://schemas.microsoft.com/office/word/2015/wordml/symex" xmlns:wpg="http://schemas.microsoft.com/office/word/2010/wordprocessingGroup" xmlns:wpi="http://schemas.microsoft.com/office/word/2010/wordprocessingInk" xmlns:wne="http://schemas.microsoft.com/office/word/2006/wordml" xmlns:wps="http://schemas.microsoft.com/office/word/2010/wordprocessingShape" mc:Ignorable="w14 w15 w16se w16cid w16 w16cex w16sdtdh w16sdtfl w16du wp14">
+<w:numbering xmlns:wpc="http://schemas.microsoft.com/office/word/2010/wordprocessingCanvas" xmlns:cx="http://schemas.microsoft.com/office/drawing/2014/chartex" xmlns:mc="http://schemas.openxmlformats.org/markup-compatibility/2006" xmlns:o="urn:schemas-microsoft-com:office:office" xmlns:r="http://schemas.openxmlformats.org/officeDocument/2006/relationships" xmlns:m="http://schemas.openxmlformats.org/officeDocument/2006/math" xmlns:v="urn:schemas-microsoft-com:vml" xmlns:wp14="http://schemas.microsoft.com/office/word/2010/wordprocessingDrawing" xmlns:wp="http://schemas.openxmlformats.org/drawingml/2006/wordprocessingDrawing" xmlns:w10="urn:schemas-microsoft-com:office:word" xmlns:w="http://schemas.openxmlformats.org/wordprocessingml/2006/main" xmlns:w14="http://schemas.microsoft.com/office/word/2010/wordml" xmlns:w15="http://schemas.microsoft.com/office/word/2012/wordml" xmlns:w16se="http://schemas.microsoft.com/office/word/2015/wordml/symex" xmlns:wpg="http://schemas.microsoft.com/office/word/2010/wordprocessingGroup" xmlns:wpi="http://schemas.microsoft.com/office/word/2010/wordprocessingInk" xmlns:wne="http://schemas.microsoft.com/office/word/2006/wordml" xmlns:wps="http://schemas.microsoft.com/office/word/2010/wordprocessingShape" mc:Ignorable="w14 w15 w16se wp14">
   <w:abstractNum w:abstractNumId="0" w15:restartNumberingAfterBreak="0">
     <w:nsid w:val="055B1C49"/>
     <w:multiLevelType w:val="hybridMultilevel"/>
@@ -3758,44 +3695,44 @@
       </w:rPr>
     </w:lvl>
   </w:abstractNum>
-  <w:num w:numId="1" w16cid:durableId="2083915656">
+  <w:num w:numId="1">
     <w:abstractNumId w:val="1"/>
   </w:num>
-  <w:num w:numId="2" w16cid:durableId="1561549736">
+  <w:num w:numId="2">
     <w:abstractNumId w:val="4"/>
   </w:num>
-  <w:num w:numId="3" w16cid:durableId="1300189556">
+  <w:num w:numId="3">
     <w:abstractNumId w:val="0"/>
   </w:num>
-  <w:num w:numId="4" w16cid:durableId="1985155995">
+  <w:num w:numId="4">
     <w:abstractNumId w:val="10"/>
   </w:num>
-  <w:num w:numId="5" w16cid:durableId="296104436">
+  <w:num w:numId="5">
     <w:abstractNumId w:val="2"/>
   </w:num>
-  <w:num w:numId="6" w16cid:durableId="637106450">
+  <w:num w:numId="6">
     <w:abstractNumId w:val="6"/>
   </w:num>
-  <w:num w:numId="7" w16cid:durableId="829516128">
+  <w:num w:numId="7">
     <w:abstractNumId w:val="3"/>
   </w:num>
-  <w:num w:numId="8" w16cid:durableId="622076084">
+  <w:num w:numId="8">
     <w:abstractNumId w:val="9"/>
   </w:num>
-  <w:num w:numId="9" w16cid:durableId="1407995319">
+  <w:num w:numId="9">
     <w:abstractNumId w:val="8"/>
   </w:num>
-  <w:num w:numId="10" w16cid:durableId="2004968749">
+  <w:num w:numId="10">
     <w:abstractNumId w:val="7"/>
   </w:num>
-  <w:num w:numId="11" w16cid:durableId="1297761148">
+  <w:num w:numId="11">
     <w:abstractNumId w:val="5"/>
   </w:num>
 </w:numbering>
 </file>
 
 <file path=word/styles.xml><?xml version="1.0" encoding="utf-8"?>
-<w:styles xmlns:mc="http://schemas.openxmlformats.org/markup-compatibility/2006" xmlns:r="http://schemas.openxmlformats.org/officeDocument/2006/relationships" xmlns:w="http://schemas.openxmlformats.org/wordprocessingml/2006/main" xmlns:w14="http://schemas.microsoft.com/office/word/2010/wordml" xmlns:w15="http://schemas.microsoft.com/office/word/2012/wordml" xmlns:w16cex="http://schemas.microsoft.com/office/word/2018/wordml/cex" xmlns:w16cid="http://schemas.microsoft.com/office/word/2016/wordml/cid" xmlns:w16="http://schemas.microsoft.com/office/word/2018/wordml" xmlns:w16du="http://schemas.microsoft.com/office/word/2023/wordml/word16du" xmlns:w16sdtdh="http://schemas.microsoft.com/office/word/2020/wordml/sdtdatahash" xmlns:w16sdtfl="http://schemas.microsoft.com/office/word/2024/wordml/sdtformatlock" xmlns:w16se="http://schemas.microsoft.com/office/word/2015/wordml/symex" mc:Ignorable="w14 w15 w16se w16cid w16 w16cex w16sdtdh w16sdtfl w16du">
+<w:styles xmlns:mc="http://schemas.openxmlformats.org/markup-compatibility/2006" xmlns:r="http://schemas.openxmlformats.org/officeDocument/2006/relationships" xmlns:w="http://schemas.openxmlformats.org/wordprocessingml/2006/main" xmlns:w14="http://schemas.microsoft.com/office/word/2010/wordml" xmlns:w15="http://schemas.microsoft.com/office/word/2012/wordml" xmlns:w16se="http://schemas.microsoft.com/office/word/2015/wordml/symex" mc:Ignorable="w14 w15 w16se">
   <w:docDefaults>
     <w:rPrDefault>
       <w:rPr>
@@ -3811,7 +3748,7 @@
       </w:pPr>
     </w:pPrDefault>
   </w:docDefaults>
-  <w:latentStyles w:defLockedState="0" w:defUIPriority="99" w:defSemiHidden="0" w:defUnhideWhenUsed="0" w:defQFormat="0" w:count="376">
+  <w:latentStyles w:defLockedState="0" w:defUIPriority="99" w:defSemiHidden="0" w:defUnhideWhenUsed="0" w:defQFormat="0" w:count="371">
     <w:lsdException w:name="Normal" w:uiPriority="0" w:qFormat="1"/>
     <w:lsdException w:name="heading 1" w:uiPriority="9" w:qFormat="1"/>
     <w:lsdException w:name="heading 2" w:semiHidden="1" w:uiPriority="9" w:unhideWhenUsed="1" w:qFormat="1"/>
@@ -4183,11 +4120,6 @@
     <w:lsdException w:name="List Table 5 Dark Accent 6" w:uiPriority="50"/>
     <w:lsdException w:name="List Table 6 Colorful Accent 6" w:uiPriority="51"/>
     <w:lsdException w:name="List Table 7 Colorful Accent 6" w:uiPriority="52"/>
-    <w:lsdException w:name="Mention" w:semiHidden="1" w:unhideWhenUsed="1"/>
-    <w:lsdException w:name="Smart Hyperlink" w:semiHidden="1" w:unhideWhenUsed="1"/>
-    <w:lsdException w:name="Hashtag" w:semiHidden="1" w:unhideWhenUsed="1"/>
-    <w:lsdException w:name="Unresolved Mention" w:semiHidden="1" w:unhideWhenUsed="1"/>
-    <w:lsdException w:name="Smart Link" w:semiHidden="1" w:unhideWhenUsed="1"/>
   </w:latentStyles>
   <w:style w:type="paragraph" w:default="1" w:styleId="Normal">
     <w:name w:val="Normal"/>

</xml_diff>

<commit_message>
Se agregaron imagenes a la entrega 2, se modifico el diagrama de CU y se agregó el doc de la entrega 3
</commit_message>
<xml_diff>
--- a/Entrega 2/Entrega 2 - TPI.docx
+++ b/Entrega 2/Entrega 2 - TPI.docx
@@ -1,13 +1,12 @@
 
 <file path=word/document.xml><?xml version="1.0" encoding="utf-8"?>
-<w:document xmlns:o="urn:schemas-microsoft-com:office:office" xmlns:r="http://schemas.openxmlformats.org/officeDocument/2006/relationships" xmlns:v="urn:schemas-microsoft-com:vml" xmlns:w="http://schemas.openxmlformats.org/wordprocessingml/2006/main" xmlns:w10="urn:schemas-microsoft-com:office:word" xmlns:wp="http://schemas.openxmlformats.org/drawingml/2006/wordprocessingDrawing" xmlns:pic="http://schemas.openxmlformats.org/drawingml/2006/picture" xmlns:wps="http://schemas.microsoft.com/office/word/2010/wordprocessingShape" xmlns:wpg="http://schemas.microsoft.com/office/word/2010/wordprocessingGroup" xmlns:mc="http://schemas.openxmlformats.org/markup-compatibility/2006" xmlns:wp14="http://schemas.microsoft.com/office/word/2010/wordprocessingDrawing" xmlns:w14="http://schemas.microsoft.com/office/word/2010/wordml" xmlns:w15="http://schemas.microsoft.com/office/word/2012/wordml" mc:Ignorable="w14 wp14 w15">
+<w:document xmlns:wpc="http://schemas.microsoft.com/office/word/2010/wordprocessingCanvas" xmlns:cx="http://schemas.microsoft.com/office/drawing/2014/chartex" xmlns:cx1="http://schemas.microsoft.com/office/drawing/2015/9/8/chartex" xmlns:cx2="http://schemas.microsoft.com/office/drawing/2015/10/21/chartex" xmlns:cx3="http://schemas.microsoft.com/office/drawing/2016/5/9/chartex" xmlns:cx4="http://schemas.microsoft.com/office/drawing/2016/5/10/chartex" xmlns:cx5="http://schemas.microsoft.com/office/drawing/2016/5/11/chartex" xmlns:cx6="http://schemas.microsoft.com/office/drawing/2016/5/12/chartex" xmlns:cx7="http://schemas.microsoft.com/office/drawing/2016/5/13/chartex" xmlns:cx8="http://schemas.microsoft.com/office/drawing/2016/5/14/chartex" xmlns:mc="http://schemas.openxmlformats.org/markup-compatibility/2006" xmlns:aink="http://schemas.microsoft.com/office/drawing/2016/ink" xmlns:am3d="http://schemas.microsoft.com/office/drawing/2017/model3d" xmlns:o="urn:schemas-microsoft-com:office:office" xmlns:oel="http://schemas.microsoft.com/office/2019/extlst" xmlns:r="http://schemas.openxmlformats.org/officeDocument/2006/relationships" xmlns:m="http://schemas.openxmlformats.org/officeDocument/2006/math" xmlns:v="urn:schemas-microsoft-com:vml" xmlns:wp14="http://schemas.microsoft.com/office/word/2010/wordprocessingDrawing" xmlns:wp="http://schemas.openxmlformats.org/drawingml/2006/wordprocessingDrawing" xmlns:w10="urn:schemas-microsoft-com:office:word" xmlns:w="http://schemas.openxmlformats.org/wordprocessingml/2006/main" xmlns:w14="http://schemas.microsoft.com/office/word/2010/wordml" xmlns:w15="http://schemas.microsoft.com/office/word/2012/wordml" xmlns:w16cex="http://schemas.microsoft.com/office/word/2018/wordml/cex" xmlns:w16cid="http://schemas.microsoft.com/office/word/2016/wordml/cid" xmlns:w16="http://schemas.microsoft.com/office/word/2018/wordml" xmlns:w16du="http://schemas.microsoft.com/office/word/2023/wordml/word16du" xmlns:w16sdtdh="http://schemas.microsoft.com/office/word/2020/wordml/sdtdatahash" xmlns:w16sdtfl="http://schemas.microsoft.com/office/word/2024/wordml/sdtformatlock" xmlns:w16se="http://schemas.microsoft.com/office/word/2015/wordml/symex" xmlns:wpg="http://schemas.microsoft.com/office/word/2010/wordprocessingGroup" xmlns:wpi="http://schemas.microsoft.com/office/word/2010/wordprocessingInk" xmlns:wne="http://schemas.microsoft.com/office/word/2006/wordml" xmlns:wps="http://schemas.microsoft.com/office/word/2010/wordprocessingShape" mc:Ignorable="w14 w15 w16se w16cid w16 w16cex w16sdtdh w16sdtfl w16du wp14">
   <w:body>
     <w:p>
       <w:pPr>
-        <w:pStyle w:val="Normal"/>
-        <w:widowControl w:val="false"/>
-        <w:spacing w:lineRule="auto" w:line="240" w:before="44" w:after="0"/>
-        <w:ind w:end="1"/>
+        <w:widowControl w:val="0"/>
+        <w:spacing w:before="44" w:line="240" w:lineRule="auto"/>
+        <w:ind w:right="1"/>
         <w:jc w:val="center"/>
         <w:rPr>
           <w:i/>
@@ -17,9 +16,11 @@
         </w:rPr>
       </w:pPr>
       <w:r>
-        <w:rPr/>
+        <w:rPr>
+          <w:noProof/>
+        </w:rPr>
         <w:drawing>
-          <wp:inline distT="0" distB="0" distL="0" distR="0">
+          <wp:inline distT="0" distB="0" distL="0" distR="0" wp14:anchorId="4F7AE386" wp14:editId="38777B53">
             <wp:extent cx="4268470" cy="1774825"/>
             <wp:effectExtent l="0" t="0" r="0" b="0"/>
             <wp:docPr id="1" name="image2.png"/>
@@ -36,7 +37,7 @@
                     </pic:cNvPicPr>
                   </pic:nvPicPr>
                   <pic:blipFill>
-                    <a:blip r:embed="rId2"/>
+                    <a:blip r:embed="rId7"/>
                     <a:stretch>
                       <a:fillRect/>
                     </a:stretch>
@@ -60,10 +61,9 @@
     </w:p>
     <w:p>
       <w:pPr>
-        <w:pStyle w:val="Normal"/>
-        <w:widowControl w:val="false"/>
-        <w:spacing w:lineRule="auto" w:line="240" w:before="44" w:after="0"/>
-        <w:ind w:end="1"/>
+        <w:widowControl w:val="0"/>
+        <w:spacing w:before="44" w:line="240" w:lineRule="auto"/>
+        <w:ind w:right="1"/>
         <w:jc w:val="center"/>
         <w:rPr>
           <w:i/>
@@ -84,29 +84,21 @@
     </w:p>
     <w:p>
       <w:pPr>
-        <w:pStyle w:val="Normal"/>
-        <w:widowControl w:val="false"/>
-        <w:spacing w:lineRule="auto" w:line="240" w:before="44" w:after="0"/>
-        <w:ind w:end="1"/>
+        <w:widowControl w:val="0"/>
+        <w:spacing w:before="44" w:line="240" w:lineRule="auto"/>
+        <w:ind w:right="1"/>
         <w:jc w:val="center"/>
         <w:rPr>
           <w:sz w:val="34"/>
           <w:szCs w:val="34"/>
         </w:rPr>
       </w:pPr>
-      <w:r>
-        <w:rPr>
-          <w:sz w:val="34"/>
-          <w:szCs w:val="34"/>
-        </w:rPr>
-      </w:r>
-    </w:p>
-    <w:p>
-      <w:pPr>
-        <w:pStyle w:val="Normal"/>
-        <w:widowControl w:val="false"/>
-        <w:spacing w:lineRule="auto" w:line="240" w:before="44" w:after="0"/>
-        <w:ind w:end="1"/>
+    </w:p>
+    <w:p>
+      <w:pPr>
+        <w:widowControl w:val="0"/>
+        <w:spacing w:before="44" w:line="240" w:lineRule="auto"/>
+        <w:ind w:right="1"/>
         <w:jc w:val="center"/>
         <w:rPr>
           <w:sz w:val="30"/>
@@ -133,26 +125,18 @@
     </w:p>
     <w:p>
       <w:pPr>
-        <w:pStyle w:val="Normal"/>
-        <w:widowControl w:val="false"/>
-        <w:spacing w:lineRule="auto" w:line="240" w:before="44" w:after="0"/>
-        <w:ind w:end="1"/>
+        <w:widowControl w:val="0"/>
+        <w:spacing w:before="44" w:line="240" w:lineRule="auto"/>
+        <w:ind w:right="1"/>
         <w:jc w:val="center"/>
         <w:rPr>
           <w:sz w:val="30"/>
           <w:szCs w:val="30"/>
         </w:rPr>
       </w:pPr>
-      <w:r>
-        <w:rPr>
-          <w:sz w:val="30"/>
-          <w:szCs w:val="30"/>
-        </w:rPr>
-      </w:r>
-    </w:p>
-    <w:p>
-      <w:pPr>
-        <w:pStyle w:val="Normal"/>
+    </w:p>
+    <w:p>
+      <w:pPr>
         <w:rPr>
           <w:b/>
           <w:bCs/>
@@ -161,19 +145,9 @@
           <w:u w:val="single"/>
         </w:rPr>
       </w:pPr>
-      <w:r>
-        <w:rPr>
-          <w:b/>
-          <w:bCs/>
-          <w:sz w:val="26"/>
-          <w:szCs w:val="26"/>
-          <w:u w:val="single"/>
-        </w:rPr>
-      </w:r>
-    </w:p>
-    <w:p>
-      <w:pPr>
-        <w:pStyle w:val="Normal"/>
+    </w:p>
+    <w:p>
+      <w:pPr>
         <w:rPr>
           <w:b/>
           <w:bCs/>
@@ -202,53 +176,30 @@
       </w:r>
     </w:p>
     <w:p>
-      <w:pPr>
-        <w:pStyle w:val="Normal"/>
-        <w:rPr/>
-      </w:pPr>
-      <w:r>
-        <w:rPr/>
+      <w:r>
         <w:t>Simieli, Mariana Paola.</w:t>
       </w:r>
     </w:p>
     <w:p>
-      <w:pPr>
-        <w:pStyle w:val="Normal"/>
-        <w:rPr/>
-      </w:pPr>
-      <w:r>
-        <w:rPr/>
+      <w:r>
         <w:t>Ortiz Quiroz, Valeria.</w:t>
       </w:r>
     </w:p>
     <w:p>
-      <w:pPr>
-        <w:pStyle w:val="Normal"/>
-        <w:rPr/>
-      </w:pPr>
-      <w:r>
-        <w:rPr/>
+      <w:r>
         <w:t>Achetta, María Laura.</w:t>
       </w:r>
     </w:p>
     <w:p>
       <w:pPr>
-        <w:pStyle w:val="Normal"/>
         <w:rPr>
           <w:sz w:val="26"/>
           <w:szCs w:val="26"/>
         </w:rPr>
       </w:pPr>
-      <w:r>
-        <w:rPr>
-          <w:sz w:val="26"/>
-          <w:szCs w:val="26"/>
-        </w:rPr>
-      </w:r>
-    </w:p>
-    <w:p>
-      <w:pPr>
-        <w:pStyle w:val="Normal"/>
+    </w:p>
+    <w:p>
+      <w:pPr>
         <w:rPr>
           <w:sz w:val="24"/>
           <w:szCs w:val="24"/>
@@ -291,22 +242,14 @@
     </w:p>
     <w:p>
       <w:pPr>
-        <w:pStyle w:val="Normal"/>
         <w:rPr>
           <w:sz w:val="24"/>
           <w:szCs w:val="24"/>
         </w:rPr>
       </w:pPr>
-      <w:r>
-        <w:rPr>
-          <w:sz w:val="24"/>
-          <w:szCs w:val="24"/>
-        </w:rPr>
-      </w:r>
-    </w:p>
-    <w:p>
-      <w:pPr>
-        <w:pStyle w:val="Normal"/>
+    </w:p>
+    <w:p>
+      <w:pPr>
         <w:rPr>
           <w:b/>
           <w:bCs/>
@@ -327,23 +270,27 @@
       </w:r>
     </w:p>
     <w:p>
-      <w:pPr>
-        <w:pStyle w:val="Normal"/>
-        <w:rPr/>
-      </w:pPr>
-      <w:r>
-        <w:rPr/>
+      <w:r>
         <w:t>Agüero, Maximo.</w:t>
+      </w:r>
+      <w:r>
         <w:tab/>
+      </w:r>
+      <w:r>
         <w:tab/>
+      </w:r>
+      <w:r>
         <w:tab/>
+      </w:r>
+      <w:r>
         <w:tab/>
+      </w:r>
+      <w:r>
         <w:tab/>
       </w:r>
-      <w:hyperlink r:id="rId3">
+      <w:hyperlink r:id="rId8">
         <w:r>
           <w:rPr>
-            <w:rStyle w:val="Style3"/>
             <w:color w:val="1155CC"/>
             <w:u w:val="single"/>
           </w:rPr>
@@ -351,28 +298,31 @@
         </w:r>
       </w:hyperlink>
       <w:r>
-        <w:rPr/>
         <w:t xml:space="preserve"> </w:t>
       </w:r>
     </w:p>
     <w:p>
-      <w:pPr>
-        <w:pStyle w:val="Normal"/>
-        <w:rPr/>
-      </w:pPr>
-      <w:r>
-        <w:rPr/>
+      <w:r>
         <w:t>Borgo, Agustín.</w:t>
+      </w:r>
+      <w:r>
         <w:tab/>
+      </w:r>
+      <w:r>
         <w:tab/>
+      </w:r>
+      <w:r>
         <w:tab/>
+      </w:r>
+      <w:r>
         <w:tab/>
+      </w:r>
+      <w:r>
         <w:tab/>
       </w:r>
-      <w:hyperlink r:id="rId4">
+      <w:hyperlink r:id="rId9">
         <w:r>
           <w:rPr>
-            <w:rStyle w:val="Style3"/>
             <w:color w:val="1155CC"/>
             <w:u w:val="single"/>
           </w:rPr>
@@ -380,27 +330,28 @@
         </w:r>
       </w:hyperlink>
       <w:r>
-        <w:rPr/>
         <w:t xml:space="preserve"> </w:t>
       </w:r>
     </w:p>
     <w:p>
-      <w:pPr>
-        <w:pStyle w:val="Normal"/>
-        <w:rPr/>
-      </w:pPr>
-      <w:r>
-        <w:rPr/>
+      <w:r>
         <w:t>Didzius, Luana Micaela.</w:t>
+      </w:r>
+      <w:r>
         <w:tab/>
+      </w:r>
+      <w:r>
         <w:tab/>
+      </w:r>
+      <w:r>
         <w:tab/>
+      </w:r>
+      <w:r>
         <w:tab/>
       </w:r>
-      <w:hyperlink r:id="rId5">
+      <w:hyperlink r:id="rId10">
         <w:r>
           <w:rPr>
-            <w:rStyle w:val="Style3"/>
             <w:color w:val="1155CC"/>
             <w:u w:val="single"/>
           </w:rPr>
@@ -409,23 +360,27 @@
       </w:hyperlink>
     </w:p>
     <w:p>
-      <w:pPr>
-        <w:pStyle w:val="Normal"/>
-        <w:rPr/>
-      </w:pPr>
-      <w:r>
-        <w:rPr/>
+      <w:r>
         <w:t>Medina, Manuel.</w:t>
+      </w:r>
+      <w:r>
         <w:tab/>
+      </w:r>
+      <w:r>
         <w:tab/>
+      </w:r>
+      <w:r>
         <w:tab/>
+      </w:r>
+      <w:r>
         <w:tab/>
+      </w:r>
+      <w:r>
         <w:tab/>
       </w:r>
-      <w:hyperlink r:id="rId6">
+      <w:hyperlink r:id="rId11">
         <w:r>
           <w:rPr>
-            <w:rStyle w:val="Style3"/>
             <w:color w:val="1155CC"/>
             <w:u w:val="single"/>
           </w:rPr>
@@ -434,23 +389,27 @@
       </w:hyperlink>
     </w:p>
     <w:p>
-      <w:pPr>
-        <w:pStyle w:val="Normal"/>
-        <w:rPr/>
-      </w:pPr>
-      <w:r>
-        <w:rPr/>
+      <w:r>
         <w:t>Tise, Maximiliano</w:t>
+      </w:r>
+      <w:r>
         <w:tab/>
+      </w:r>
+      <w:r>
         <w:tab/>
+      </w:r>
+      <w:r>
         <w:tab/>
+      </w:r>
+      <w:r>
         <w:tab/>
+      </w:r>
+      <w:r>
         <w:tab/>
       </w:r>
-      <w:hyperlink r:id="rId7">
+      <w:hyperlink r:id="rId12">
         <w:r>
           <w:rPr>
-            <w:rStyle w:val="Style3"/>
             <w:color w:val="1155CC"/>
             <w:u w:val="single"/>
           </w:rPr>
@@ -459,22 +418,29 @@
       </w:hyperlink>
     </w:p>
     <w:p>
-      <w:pPr>
-        <w:pStyle w:val="Normal"/>
-        <w:rPr/>
-      </w:pPr>
-      <w:r>
-        <w:rPr/>
-        <w:t>Nuñez Loza, Juan Manuel</w:t>
+      <w:proofErr w:type="spellStart"/>
+      <w:r>
+        <w:t>Nuñez</w:t>
+      </w:r>
+      <w:proofErr w:type="spellEnd"/>
+      <w:r>
+        <w:t xml:space="preserve"> Loza, Juan Manuel</w:t>
+      </w:r>
+      <w:r>
         <w:tab/>
+      </w:r>
+      <w:r>
         <w:tab/>
+      </w:r>
+      <w:r>
         <w:tab/>
+      </w:r>
+      <w:r>
         <w:tab/>
       </w:r>
-      <w:hyperlink r:id="rId8">
+      <w:hyperlink r:id="rId13">
         <w:r>
           <w:rPr>
-            <w:rStyle w:val="Style3"/>
             <w:color w:val="1155CC"/>
             <w:u w:val="single"/>
           </w:rPr>
@@ -484,24 +450,13 @@
     </w:p>
     <w:p>
       <w:pPr>
-        <w:pStyle w:val="Normal"/>
         <w:rPr>
           <w:b/>
           <w:bCs/>
         </w:rPr>
       </w:pPr>
-      <w:r>
-        <w:rPr>
-          <w:b/>
-          <w:bCs/>
-        </w:rPr>
-      </w:r>
-    </w:p>
-    <w:p>
-      <w:pPr>
-        <w:pStyle w:val="Normal"/>
-        <w:rPr/>
-      </w:pPr>
+    </w:p>
+    <w:p>
       <w:r>
         <w:rPr>
           <w:b/>
@@ -522,132 +477,24 @@
         <w:t xml:space="preserve"> 1</w:t>
       </w:r>
       <w:r>
-        <w:rPr/>
         <w:t>7/08/2026</w:t>
       </w:r>
     </w:p>
-    <w:p>
-      <w:pPr>
-        <w:pStyle w:val="Normal"/>
-        <w:rPr/>
-      </w:pPr>
-      <w:r>
-        <w:rPr/>
-      </w:r>
-    </w:p>
-    <w:p>
-      <w:pPr>
-        <w:pStyle w:val="Normal"/>
-        <w:rPr/>
-      </w:pPr>
-      <w:r>
-        <w:rPr/>
-      </w:r>
-    </w:p>
-    <w:p>
-      <w:pPr>
-        <w:pStyle w:val="Normal"/>
-        <w:rPr/>
-      </w:pPr>
-      <w:r>
-        <w:rPr/>
-      </w:r>
-    </w:p>
-    <w:p>
-      <w:pPr>
-        <w:pStyle w:val="Normal"/>
-        <w:rPr/>
-      </w:pPr>
-      <w:r>
-        <w:rPr/>
-      </w:r>
-    </w:p>
-    <w:p>
-      <w:pPr>
-        <w:pStyle w:val="Normal"/>
-        <w:rPr/>
-      </w:pPr>
-      <w:r>
-        <w:rPr/>
-      </w:r>
-    </w:p>
-    <w:p>
-      <w:pPr>
-        <w:pStyle w:val="Normal"/>
-        <w:rPr/>
-      </w:pPr>
-      <w:r>
-        <w:rPr/>
-      </w:r>
-    </w:p>
-    <w:p>
-      <w:pPr>
-        <w:pStyle w:val="Normal"/>
-        <w:rPr/>
-      </w:pPr>
-      <w:r>
-        <w:rPr/>
-      </w:r>
-    </w:p>
-    <w:p>
-      <w:pPr>
-        <w:pStyle w:val="Normal"/>
-        <w:rPr/>
-      </w:pPr>
-      <w:r>
-        <w:rPr/>
-      </w:r>
-    </w:p>
-    <w:p>
-      <w:pPr>
-        <w:pStyle w:val="Normal"/>
-        <w:rPr/>
-      </w:pPr>
-      <w:r>
-        <w:rPr/>
-      </w:r>
-    </w:p>
-    <w:p>
-      <w:pPr>
-        <w:pStyle w:val="Normal"/>
-        <w:rPr/>
-      </w:pPr>
-      <w:r>
-        <w:rPr/>
-      </w:r>
-    </w:p>
-    <w:p>
-      <w:pPr>
-        <w:pStyle w:val="Normal"/>
-        <w:rPr/>
-      </w:pPr>
-      <w:r>
-        <w:rPr/>
-      </w:r>
-    </w:p>
-    <w:p>
-      <w:pPr>
-        <w:pStyle w:val="Normal"/>
-        <w:rPr/>
-      </w:pPr>
-      <w:r>
-        <w:rPr/>
-      </w:r>
-    </w:p>
-    <w:p>
-      <w:pPr>
-        <w:pStyle w:val="Normal"/>
-        <w:rPr/>
-      </w:pPr>
-      <w:r>
-        <w:rPr/>
-      </w:r>
-      <w:bookmarkStart w:id="0" w:name="_GoBack"/>
-      <w:bookmarkEnd w:id="0"/>
-    </w:p>
-    <w:p>
-      <w:pPr>
-        <w:pStyle w:val="Normal"/>
+    <w:p/>
+    <w:p/>
+    <w:p/>
+    <w:p/>
+    <w:p/>
+    <w:p/>
+    <w:p/>
+    <w:p/>
+    <w:p/>
+    <w:p/>
+    <w:p/>
+    <w:p/>
+    <w:p/>
+    <w:p>
+      <w:pPr>
         <w:rPr>
           <w:b/>
           <w:bCs/>
@@ -655,18 +502,19 @@
           <w:iCs/>
         </w:rPr>
       </w:pPr>
-      <w:r>
+    </w:p>
+    <w:p>
+      <w:pPr>
         <w:rPr>
           <w:b/>
           <w:bCs/>
           <w:i/>
           <w:iCs/>
         </w:rPr>
-      </w:r>
-    </w:p>
-    <w:p>
-      <w:pPr>
-        <w:pStyle w:val="Normal"/>
+      </w:pPr>
+    </w:p>
+    <w:p>
+      <w:pPr>
         <w:rPr>
           <w:b/>
           <w:bCs/>
@@ -681,11 +529,12 @@
           <w:i/>
           <w:iCs/>
         </w:rPr>
-      </w:r>
-    </w:p>
-    <w:p>
-      <w:pPr>
-        <w:pStyle w:val="Normal"/>
+        <w:lastRenderedPageBreak/>
+        <w:t>ÍNDICE</w:t>
+      </w:r>
+    </w:p>
+    <w:p>
+      <w:pPr>
         <w:rPr>
           <w:b/>
           <w:bCs/>
@@ -693,47 +542,27 @@
           <w:iCs/>
         </w:rPr>
       </w:pPr>
-      <w:r>
-        <w:rPr>
-          <w:b/>
-          <w:bCs/>
-          <w:i/>
-          <w:iCs/>
-        </w:rPr>
-        <w:t>ÍNDICE</w:t>
-      </w:r>
-    </w:p>
-    <w:p>
-      <w:pPr>
-        <w:pStyle w:val="Normal"/>
-        <w:rPr>
-          <w:b/>
-          <w:bCs/>
-          <w:i/>
-          <w:iCs/>
-        </w:rPr>
-      </w:pPr>
-      <w:r>
-        <w:rPr>
-          <w:b/>
-          <w:bCs/>
-          <w:i/>
-          <w:iCs/>
-        </w:rPr>
-      </w:r>
     </w:p>
     <w:sdt>
       <w:sdtPr>
+        <w:rPr>
+          <w:rFonts w:ascii="Arial" w:eastAsia="Arial" w:hAnsi="Arial" w:cs="Arial"/>
+          <w:color w:val="auto"/>
+          <w:sz w:val="22"/>
+          <w:szCs w:val="22"/>
+          <w:lang w:val="es-ES" w:eastAsia="es-AR"/>
+        </w:rPr>
+        <w:id w:val="-856729622"/>
         <w:docPartObj>
           <w:docPartGallery w:val="Table of Contents"/>
-          <w:docPartUnique w:val="true"/>
+          <w:docPartUnique/>
         </w:docPartObj>
       </w:sdtPr>
+      <w:sdtEndPr/>
       <w:sdtContent>
         <w:p>
           <w:pPr>
-            <w:pStyle w:val="TOCHeading"/>
-            <w:rPr/>
+            <w:pStyle w:val="TtuloTDC"/>
           </w:pPr>
           <w:r>
             <w:rPr>
@@ -744,13 +573,12 @@
         </w:p>
         <w:p>
           <w:pPr>
-            <w:pStyle w:val="TOC1"/>
+            <w:pStyle w:val="TDC1"/>
             <w:tabs>
-              <w:tab w:val="clear" w:pos="720"/>
-              <w:tab w:val="right" w:pos="9019" w:leader="dot"/>
+              <w:tab w:val="right" w:leader="dot" w:pos="9019"/>
             </w:tabs>
             <w:rPr>
-              <w:rFonts w:ascii="Cambria" w:hAnsi="Cambria" w:eastAsia="" w:cs="" w:asciiTheme="minorHAnsi" w:cstheme="minorBidi" w:eastAsiaTheme="minorEastAsia" w:hAnsiTheme="minorHAnsi"/>
+              <w:rFonts w:asciiTheme="minorHAnsi" w:eastAsiaTheme="minorEastAsia" w:hAnsiTheme="minorHAnsi" w:cstheme="minorBidi"/>
               <w:kern w:val="2"/>
               <w:sz w:val="24"/>
               <w:szCs w:val="24"/>
@@ -775,7 +603,6 @@
               <w:rStyle w:val="IndexLink"/>
               <w:b/>
               <w:bCs/>
-              <w:webHidden/>
             </w:rPr>
             <w:fldChar w:fldCharType="separate"/>
           </w:r>
@@ -799,7 +626,12 @@
               <w:rPr>
                 <w:webHidden/>
               </w:rPr>
-              <w:instrText xml:space="preserve">PAGEREF _Toc237872476 \h</w:instrText>
+              <w:instrText>PAGEREF _Toc237872476 \h</w:instrText>
+            </w:r>
+            <w:r>
+              <w:rPr>
+                <w:webHidden/>
+              </w:rPr>
             </w:r>
             <w:r>
               <w:rPr>
@@ -810,7 +642,6 @@
             <w:r>
               <w:rPr>
                 <w:rStyle w:val="IndexLink"/>
-                <w:vanish w:val="false"/>
               </w:rPr>
               <w:tab/>
               <w:t>2</w:t>
@@ -825,13 +656,12 @@
         </w:p>
         <w:p>
           <w:pPr>
-            <w:pStyle w:val="TOC2"/>
+            <w:pStyle w:val="TDC2"/>
             <w:tabs>
-              <w:tab w:val="clear" w:pos="720"/>
-              <w:tab w:val="right" w:pos="9019" w:leader="dot"/>
+              <w:tab w:val="right" w:leader="dot" w:pos="9019"/>
             </w:tabs>
             <w:rPr>
-              <w:rFonts w:ascii="Cambria" w:hAnsi="Cambria" w:eastAsia="" w:cs="" w:asciiTheme="minorHAnsi" w:cstheme="minorBidi" w:eastAsiaTheme="minorEastAsia" w:hAnsiTheme="minorHAnsi"/>
+              <w:rFonts w:asciiTheme="minorHAnsi" w:eastAsiaTheme="minorEastAsia" w:hAnsiTheme="minorHAnsi" w:cstheme="minorBidi"/>
               <w:kern w:val="2"/>
               <w:sz w:val="24"/>
               <w:szCs w:val="24"/>
@@ -859,7 +689,12 @@
               <w:rPr>
                 <w:webHidden/>
               </w:rPr>
-              <w:instrText xml:space="preserve">PAGEREF _Toc237872477 \h</w:instrText>
+              <w:instrText>PAGEREF _Toc237872477 \h</w:instrText>
+            </w:r>
+            <w:r>
+              <w:rPr>
+                <w:webHidden/>
+              </w:rPr>
             </w:r>
             <w:r>
               <w:rPr>
@@ -870,7 +705,6 @@
             <w:r>
               <w:rPr>
                 <w:rStyle w:val="IndexLink"/>
-                <w:vanish w:val="false"/>
               </w:rPr>
               <w:tab/>
               <w:t>2</w:t>
@@ -885,13 +719,12 @@
         </w:p>
         <w:p>
           <w:pPr>
-            <w:pStyle w:val="TOC2"/>
+            <w:pStyle w:val="TDC2"/>
             <w:tabs>
-              <w:tab w:val="clear" w:pos="720"/>
-              <w:tab w:val="right" w:pos="9019" w:leader="dot"/>
+              <w:tab w:val="right" w:leader="dot" w:pos="9019"/>
             </w:tabs>
             <w:rPr>
-              <w:rFonts w:ascii="Cambria" w:hAnsi="Cambria" w:eastAsia="" w:cs="" w:asciiTheme="minorHAnsi" w:cstheme="minorBidi" w:eastAsiaTheme="minorEastAsia" w:hAnsiTheme="minorHAnsi"/>
+              <w:rFonts w:asciiTheme="minorHAnsi" w:eastAsiaTheme="minorEastAsia" w:hAnsiTheme="minorHAnsi" w:cstheme="minorBidi"/>
               <w:kern w:val="2"/>
               <w:sz w:val="24"/>
               <w:szCs w:val="24"/>
@@ -919,7 +752,12 @@
               <w:rPr>
                 <w:webHidden/>
               </w:rPr>
-              <w:instrText xml:space="preserve">PAGEREF _Toc237872478 \h</w:instrText>
+              <w:instrText>PAGEREF _Toc237872478 \h</w:instrText>
+            </w:r>
+            <w:r>
+              <w:rPr>
+                <w:webHidden/>
+              </w:rPr>
             </w:r>
             <w:r>
               <w:rPr>
@@ -930,7 +768,6 @@
             <w:r>
               <w:rPr>
                 <w:rStyle w:val="IndexLink"/>
-                <w:vanish w:val="false"/>
               </w:rPr>
               <w:tab/>
               <w:t>3</w:t>
@@ -945,13 +782,12 @@
         </w:p>
         <w:p>
           <w:pPr>
-            <w:pStyle w:val="TOC2"/>
+            <w:pStyle w:val="TDC2"/>
             <w:tabs>
-              <w:tab w:val="clear" w:pos="720"/>
-              <w:tab w:val="right" w:pos="9019" w:leader="dot"/>
+              <w:tab w:val="right" w:leader="dot" w:pos="9019"/>
             </w:tabs>
             <w:rPr>
-              <w:rFonts w:ascii="Cambria" w:hAnsi="Cambria" w:eastAsia="" w:cs="" w:asciiTheme="minorHAnsi" w:cstheme="minorBidi" w:eastAsiaTheme="minorEastAsia" w:hAnsiTheme="minorHAnsi"/>
+              <w:rFonts w:asciiTheme="minorHAnsi" w:eastAsiaTheme="minorEastAsia" w:hAnsiTheme="minorHAnsi" w:cstheme="minorBidi"/>
               <w:kern w:val="2"/>
               <w:sz w:val="24"/>
               <w:szCs w:val="24"/>
@@ -979,7 +815,12 @@
               <w:rPr>
                 <w:webHidden/>
               </w:rPr>
-              <w:instrText xml:space="preserve">PAGEREF _Toc237872479 \h</w:instrText>
+              <w:instrText>PAGEREF _Toc237872479 \h</w:instrText>
+            </w:r>
+            <w:r>
+              <w:rPr>
+                <w:webHidden/>
+              </w:rPr>
             </w:r>
             <w:r>
               <w:rPr>
@@ -990,7 +831,6 @@
             <w:r>
               <w:rPr>
                 <w:rStyle w:val="IndexLink"/>
-                <w:vanish w:val="false"/>
               </w:rPr>
               <w:tab/>
               <w:t>4</w:t>
@@ -1005,13 +845,12 @@
         </w:p>
         <w:p>
           <w:pPr>
-            <w:pStyle w:val="TOC2"/>
+            <w:pStyle w:val="TDC2"/>
             <w:tabs>
-              <w:tab w:val="clear" w:pos="720"/>
-              <w:tab w:val="right" w:pos="9019" w:leader="dot"/>
+              <w:tab w:val="right" w:leader="dot" w:pos="9019"/>
             </w:tabs>
             <w:rPr>
-              <w:rFonts w:ascii="Cambria" w:hAnsi="Cambria" w:eastAsia="" w:cs="" w:asciiTheme="minorHAnsi" w:cstheme="minorBidi" w:eastAsiaTheme="minorEastAsia" w:hAnsiTheme="minorHAnsi"/>
+              <w:rFonts w:asciiTheme="minorHAnsi" w:eastAsiaTheme="minorEastAsia" w:hAnsiTheme="minorHAnsi" w:cstheme="minorBidi"/>
               <w:kern w:val="2"/>
               <w:sz w:val="24"/>
               <w:szCs w:val="24"/>
@@ -1039,7 +878,12 @@
               <w:rPr>
                 <w:webHidden/>
               </w:rPr>
-              <w:instrText xml:space="preserve">PAGEREF _Toc237872480 \h</w:instrText>
+              <w:instrText>PAGEREF _Toc237872480 \h</w:instrText>
+            </w:r>
+            <w:r>
+              <w:rPr>
+                <w:webHidden/>
+              </w:rPr>
             </w:r>
             <w:r>
               <w:rPr>
@@ -1050,7 +894,6 @@
             <w:r>
               <w:rPr>
                 <w:rStyle w:val="IndexLink"/>
-                <w:vanish w:val="false"/>
               </w:rPr>
               <w:tab/>
               <w:t>6</w:t>
@@ -1064,36 +907,21 @@
           </w:hyperlink>
         </w:p>
         <w:p>
-          <w:pPr>
-            <w:pStyle w:val="Normal"/>
-            <w:rPr/>
-          </w:pPr>
           <w:r>
-            <w:rPr/>
-          </w:r>
-          <w:r>
-            <w:rPr/>
             <w:fldChar w:fldCharType="end"/>
           </w:r>
         </w:p>
       </w:sdtContent>
     </w:sdt>
     <w:p>
-      <w:pPr>
-        <w:pStyle w:val="Normal"/>
-        <w:rPr/>
-      </w:pPr>
-      <w:r>
-        <w:rPr/>
-      </w:r>
       <w:r>
         <w:br w:type="page"/>
       </w:r>
     </w:p>
     <w:p>
       <w:pPr>
-        <w:pStyle w:val="Heading1"/>
-        <w:spacing w:before="0" w:after="120"/>
+        <w:pStyle w:val="Ttulo1"/>
+        <w:spacing w:before="0"/>
         <w:rPr>
           <w:b/>
           <w:bCs/>
@@ -1102,7 +930,7 @@
           <w:u w:val="single"/>
         </w:rPr>
       </w:pPr>
-      <w:bookmarkStart w:id="1" w:name="_Toc237872476"/>
+      <w:bookmarkStart w:id="0" w:name="_Toc237872476"/>
       <w:r>
         <w:rPr>
           <w:b/>
@@ -1111,30 +939,21 @@
           <w:szCs w:val="36"/>
           <w:u w:val="single"/>
         </w:rPr>
-        <w:t xml:space="preserve">Modelo de Objetos del </w:t>
-      </w:r>
-      <w:r>
-        <w:rPr>
-          <w:b/>
-          <w:bCs/>
-          <w:sz w:val="36"/>
-          <w:szCs w:val="36"/>
-          <w:u w:val="single"/>
-        </w:rPr>
-        <w:t>Dominio del Problema (MODP)</w:t>
-      </w:r>
-      <w:bookmarkEnd w:id="1"/>
-    </w:p>
-    <w:p>
-      <w:pPr>
-        <w:pStyle w:val="Heading2"/>
+        <w:lastRenderedPageBreak/>
+        <w:t>Modelo de Objetos del Dominio del Problema (MODP)</w:t>
+      </w:r>
+      <w:bookmarkEnd w:id="0"/>
+    </w:p>
+    <w:p>
+      <w:pPr>
+        <w:pStyle w:val="Ttulo2"/>
         <w:rPr>
           <w:b/>
           <w:bCs/>
           <w:u w:val="single"/>
         </w:rPr>
       </w:pPr>
-      <w:bookmarkStart w:id="2" w:name="_Toc237872477"/>
+      <w:bookmarkStart w:id="1" w:name="_Toc237872477"/>
       <w:r>
         <w:rPr>
           <w:b/>
@@ -1143,130 +962,119 @@
         </w:rPr>
         <w:t>Identificación de Clases</w:t>
       </w:r>
-      <w:bookmarkEnd w:id="2"/>
-    </w:p>
-    <w:p>
-      <w:pPr>
-        <w:pStyle w:val="Normal"/>
-        <w:rPr/>
-      </w:pPr>
-      <w:r>
-        <w:rPr/>
-      </w:r>
-    </w:p>
-    <w:p>
-      <w:pPr>
-        <w:pStyle w:val="ListParagraph"/>
+      <w:bookmarkEnd w:id="1"/>
+    </w:p>
+    <w:p/>
+    <w:p>
+      <w:pPr>
+        <w:pStyle w:val="Prrafodelista"/>
         <w:numPr>
           <w:ilvl w:val="0"/>
           <w:numId w:val="2"/>
         </w:numPr>
-        <w:rPr/>
-      </w:pPr>
-      <w:r>
-        <w:rPr/>
+      </w:pPr>
+      <w:r>
         <w:t>Retiro</w:t>
       </w:r>
     </w:p>
     <w:p>
       <w:pPr>
-        <w:pStyle w:val="ListParagraph"/>
+        <w:pStyle w:val="Prrafodelista"/>
         <w:numPr>
           <w:ilvl w:val="0"/>
           <w:numId w:val="2"/>
         </w:numPr>
-        <w:rPr/>
-      </w:pPr>
-      <w:r>
-        <w:rPr/>
+      </w:pPr>
+      <w:r>
         <w:t>Categoría</w:t>
       </w:r>
     </w:p>
     <w:p>
       <w:pPr>
-        <w:pStyle w:val="ListParagraph"/>
+        <w:pStyle w:val="Prrafodelista"/>
         <w:numPr>
           <w:ilvl w:val="0"/>
           <w:numId w:val="2"/>
         </w:numPr>
-        <w:rPr/>
-      </w:pPr>
-      <w:r>
-        <w:rPr/>
+      </w:pPr>
+      <w:r>
         <w:t>Valoración</w:t>
       </w:r>
     </w:p>
     <w:p>
       <w:pPr>
-        <w:pStyle w:val="ListParagraph"/>
+        <w:pStyle w:val="Prrafodelista"/>
         <w:numPr>
           <w:ilvl w:val="0"/>
           <w:numId w:val="2"/>
         </w:numPr>
-        <w:rPr/>
-      </w:pPr>
-      <w:r>
-        <w:rPr/>
+      </w:pPr>
+      <w:r>
         <w:t>Pago</w:t>
       </w:r>
     </w:p>
     <w:p>
       <w:pPr>
-        <w:pStyle w:val="ListParagraph"/>
+        <w:pStyle w:val="Prrafodelista"/>
         <w:numPr>
           <w:ilvl w:val="0"/>
           <w:numId w:val="2"/>
         </w:numPr>
-        <w:rPr/>
-      </w:pPr>
-      <w:r>
-        <w:rPr/>
+      </w:pPr>
+      <w:r>
         <w:t>Notificación</w:t>
       </w:r>
     </w:p>
     <w:p>
       <w:pPr>
-        <w:pStyle w:val="ListParagraph"/>
+        <w:pStyle w:val="Prrafodelista"/>
         <w:numPr>
           <w:ilvl w:val="0"/>
           <w:numId w:val="2"/>
         </w:numPr>
-        <w:rPr/>
-      </w:pPr>
-      <w:r>
-        <w:rPr/>
+      </w:pPr>
+      <w:r>
         <w:t>Actividad.</w:t>
       </w:r>
     </w:p>
     <w:p>
       <w:pPr>
-        <w:pStyle w:val="Heading2"/>
+        <w:pStyle w:val="Ttulo2"/>
         <w:rPr>
           <w:b/>
           <w:bCs/>
           <w:u w:val="single"/>
         </w:rPr>
       </w:pPr>
-      <w:bookmarkStart w:id="3" w:name="_Toc237872478"/>
+      <w:bookmarkStart w:id="2" w:name="_Toc237872478"/>
       <w:r>
         <w:rPr>
           <w:b/>
           <w:bCs/>
           <w:u w:val="single"/>
         </w:rPr>
-        <w:t>Diagrama de Clases en PlantUML</w:t>
-      </w:r>
-      <w:bookmarkEnd w:id="3"/>
-    </w:p>
-    <w:p>
-      <w:pPr>
-        <w:pStyle w:val="Normal"/>
-        <w:rPr/>
-      </w:pPr>
-      <w:r>
-        <w:rPr/>
+        <w:lastRenderedPageBreak/>
+        <w:t xml:space="preserve">Diagrama de Clases en </w:t>
+      </w:r>
+      <w:proofErr w:type="spellStart"/>
+      <w:r>
+        <w:rPr>
+          <w:b/>
+          <w:bCs/>
+          <w:u w:val="single"/>
+        </w:rPr>
+        <w:t>PlantUML</w:t>
+      </w:r>
+      <w:bookmarkEnd w:id="2"/>
+      <w:proofErr w:type="spellEnd"/>
+    </w:p>
+    <w:p>
+      <w:r>
+        <w:rPr>
+          <w:noProof/>
+        </w:rPr>
         <w:drawing>
-          <wp:anchor distT="0" distB="0" distL="0" distR="0" simplePos="0" relativeHeight="39" behindDoc="0" locked="0" layoutInCell="0" allowOverlap="1">
+          <wp:anchor distT="0" distB="0" distL="0" distR="0" simplePos="0" relativeHeight="251658240" behindDoc="0" locked="0" layoutInCell="0" allowOverlap="1" wp14:anchorId="5AC2EB5A" wp14:editId="02CBD17D">
             <wp:simplePos x="0" y="0"/>
             <wp:positionH relativeFrom="column">
               <wp:align>center</wp:align>
@@ -1291,7 +1099,7 @@
                     </pic:cNvPicPr>
                   </pic:nvPicPr>
                   <pic:blipFill>
-                    <a:blip r:embed="rId9"/>
+                    <a:blip r:embed="rId14"/>
                     <a:stretch>
                       <a:fillRect/>
                     </a:stretch>
@@ -1313,357 +1121,479 @@
         </w:drawing>
       </w:r>
     </w:p>
-    <w:p>
-      <w:pPr>
-        <w:pStyle w:val="Normal"/>
-        <w:rPr/>
-      </w:pPr>
-      <w:r>
-        <w:rPr/>
-      </w:r>
-    </w:p>
-    <w:p>
-      <w:pPr>
-        <w:pStyle w:val="Heading3"/>
+    <w:p/>
+    <w:p>
+      <w:pPr>
+        <w:pStyle w:val="Ttulo3"/>
         <w:rPr>
           <w:b/>
           <w:bCs/>
           <w:u w:val="single"/>
         </w:rPr>
       </w:pPr>
-      <w:bookmarkStart w:id="4" w:name="_Toc237872479"/>
+      <w:bookmarkStart w:id="3" w:name="_Toc237872479"/>
       <w:r>
         <w:rPr>
           <w:b/>
           <w:bCs/>
           <w:u w:val="single"/>
         </w:rPr>
+        <w:lastRenderedPageBreak/>
         <w:t>Relaciones entre Clases</w:t>
       </w:r>
-      <w:bookmarkEnd w:id="4"/>
-    </w:p>
-    <w:p>
-      <w:pPr>
-        <w:pStyle w:val="Heading4"/>
-        <w:rPr/>
-      </w:pPr>
-      <w:r>
-        <w:rPr/>
-        <w:t>Entre Retiro y Valoracion</w:t>
-      </w:r>
-    </w:p>
-    <w:p>
-      <w:pPr>
-        <w:pStyle w:val="ListParagraph"/>
+      <w:bookmarkEnd w:id="3"/>
+    </w:p>
+    <w:p>
+      <w:pPr>
+        <w:pStyle w:val="Ttulo4"/>
+      </w:pPr>
+      <w:r>
+        <w:t xml:space="preserve">Entre Retiro y </w:t>
+      </w:r>
+      <w:r>
+        <w:t>Valoración</w:t>
+      </w:r>
+    </w:p>
+    <w:p>
+      <w:r>
+        <w:drawing>
+          <wp:inline distT="0" distB="0" distL="0" distR="0" wp14:anchorId="1C3FBD42" wp14:editId="3EC7A658">
+            <wp:extent cx="2257425" cy="7525469"/>
+            <wp:effectExtent l="0" t="0" r="0" b="0"/>
+            <wp:docPr id="431059771" name="Imagen 1"/>
+            <wp:cNvGraphicFramePr>
+              <a:graphicFrameLocks xmlns:a="http://schemas.openxmlformats.org/drawingml/2006/main" noChangeAspect="1"/>
+            </wp:cNvGraphicFramePr>
+            <a:graphic xmlns:a="http://schemas.openxmlformats.org/drawingml/2006/main">
+              <a:graphicData uri="http://schemas.openxmlformats.org/drawingml/2006/picture">
+                <pic:pic xmlns:pic="http://schemas.openxmlformats.org/drawingml/2006/picture">
+                  <pic:nvPicPr>
+                    <pic:cNvPr id="431059771" name=""/>
+                    <pic:cNvPicPr/>
+                  </pic:nvPicPr>
+                  <pic:blipFill>
+                    <a:blip r:embed="rId15"/>
+                    <a:stretch>
+                      <a:fillRect/>
+                    </a:stretch>
+                  </pic:blipFill>
+                  <pic:spPr>
+                    <a:xfrm>
+                      <a:off x="0" y="0"/>
+                      <a:ext cx="2263031" cy="7544157"/>
+                    </a:xfrm>
+                    <a:prstGeom prst="rect">
+                      <a:avLst/>
+                    </a:prstGeom>
+                  </pic:spPr>
+                </pic:pic>
+              </a:graphicData>
+            </a:graphic>
+          </wp:inline>
+        </w:drawing>
+      </w:r>
+    </w:p>
+    <w:p>
+      <w:pPr>
+        <w:pStyle w:val="Prrafodelista"/>
         <w:numPr>
           <w:ilvl w:val="0"/>
           <w:numId w:val="1"/>
         </w:numPr>
-        <w:rPr/>
-      </w:pPr>
-      <w:r>
-        <w:rPr/>
-        <w:t xml:space="preserve">Navegabilidad: </w:t>
-      </w:r>
-      <w:r>
-        <w:rPr/>
-        <w:t>Un retiro conoce a su valoracion</w:t>
-      </w:r>
-    </w:p>
-    <w:p>
-      <w:pPr>
-        <w:pStyle w:val="ListParagraph"/>
+      </w:pPr>
+      <w:r>
+        <w:t xml:space="preserve">Navegabilidad: Un retiro conoce a su </w:t>
+      </w:r>
+      <w:r>
+        <w:t>valoración</w:t>
+      </w:r>
+    </w:p>
+    <w:p>
+      <w:pPr>
+        <w:pStyle w:val="Prrafodelista"/>
         <w:numPr>
           <w:ilvl w:val="0"/>
           <w:numId w:val="1"/>
         </w:numPr>
-        <w:rPr/>
-      </w:pPr>
-      <w:r>
-        <w:rPr/>
-        <w:t xml:space="preserve">Multiplicidad: puede haber </w:t>
-      </w:r>
-      <w:r>
-        <w:rPr/>
-        <w:t>cero o una valoracion en un retiro.</w:t>
-      </w:r>
-    </w:p>
-    <w:p>
-      <w:pPr>
-        <w:pStyle w:val="Normal"/>
-        <w:ind w:start="360"/>
-        <w:rPr/>
-      </w:pPr>
-      <w:r>
-        <w:rPr/>
-      </w:r>
-    </w:p>
-    <w:p>
-      <w:pPr>
-        <w:pStyle w:val="Normal"/>
-        <w:rPr/>
-      </w:pPr>
-      <w:r>
-        <w:rPr/>
-      </w:r>
-    </w:p>
-    <w:p>
-      <w:pPr>
-        <w:pStyle w:val="Heading4"/>
-        <w:rPr/>
-      </w:pPr>
-      <w:r>
-        <w:rPr/>
+      </w:pPr>
+      <w:r>
+        <w:t xml:space="preserve">Multiplicidad: puede haber cero o una </w:t>
+      </w:r>
+      <w:r>
+        <w:t>valoración</w:t>
+      </w:r>
+      <w:r>
+        <w:t xml:space="preserve"> en un retiro.</w:t>
+      </w:r>
+    </w:p>
+    <w:p>
+      <w:pPr>
+        <w:ind w:left="360"/>
+      </w:pPr>
+    </w:p>
+    <w:p/>
+    <w:p>
+      <w:pPr>
+        <w:pStyle w:val="Ttulo4"/>
+      </w:pPr>
+      <w:r>
         <w:t>Entre Retiro y Pago</w:t>
       </w:r>
-    </w:p>
-    <w:p>
-      <w:pPr>
-        <w:pStyle w:val="ListParagraph"/>
+      <w:r>
+        <w:br/>
+      </w:r>
+      <w:r>
+        <w:drawing>
+          <wp:inline distT="0" distB="0" distL="0" distR="0" wp14:anchorId="0C14750E" wp14:editId="77B59216">
+            <wp:extent cx="2838450" cy="7219539"/>
+            <wp:effectExtent l="0" t="0" r="0" b="635"/>
+            <wp:docPr id="1159333665" name="Imagen 1"/>
+            <wp:cNvGraphicFramePr>
+              <a:graphicFrameLocks xmlns:a="http://schemas.openxmlformats.org/drawingml/2006/main" noChangeAspect="1"/>
+            </wp:cNvGraphicFramePr>
+            <a:graphic xmlns:a="http://schemas.openxmlformats.org/drawingml/2006/main">
+              <a:graphicData uri="http://schemas.openxmlformats.org/drawingml/2006/picture">
+                <pic:pic xmlns:pic="http://schemas.openxmlformats.org/drawingml/2006/picture">
+                  <pic:nvPicPr>
+                    <pic:cNvPr id="1159333665" name=""/>
+                    <pic:cNvPicPr/>
+                  </pic:nvPicPr>
+                  <pic:blipFill>
+                    <a:blip r:embed="rId16"/>
+                    <a:stretch>
+                      <a:fillRect/>
+                    </a:stretch>
+                  </pic:blipFill>
+                  <pic:spPr>
+                    <a:xfrm>
+                      <a:off x="0" y="0"/>
+                      <a:ext cx="2845068" cy="7236373"/>
+                    </a:xfrm>
+                    <a:prstGeom prst="rect">
+                      <a:avLst/>
+                    </a:prstGeom>
+                  </pic:spPr>
+                </pic:pic>
+              </a:graphicData>
+            </a:graphic>
+          </wp:inline>
+        </w:drawing>
+      </w:r>
+    </w:p>
+    <w:p>
+      <w:pPr>
+        <w:pStyle w:val="Prrafodelista"/>
         <w:numPr>
           <w:ilvl w:val="0"/>
           <w:numId w:val="1"/>
         </w:numPr>
-        <w:rPr/>
-      </w:pPr>
-      <w:r>
-        <w:rPr/>
+      </w:pPr>
+      <w:r>
         <w:t>Navegabilidad: Retiro conoce a Pago.</w:t>
       </w:r>
     </w:p>
     <w:p>
       <w:pPr>
-        <w:pStyle w:val="ListParagraph"/>
+        <w:pStyle w:val="Prrafodelista"/>
         <w:numPr>
           <w:ilvl w:val="0"/>
           <w:numId w:val="1"/>
         </w:numPr>
-        <w:rPr/>
-      </w:pPr>
-      <w:r>
-        <w:rPr/>
+      </w:pPr>
+      <w:r>
         <w:t xml:space="preserve">Multiplicidad: un retiro puede tener </w:t>
       </w:r>
       <w:r>
-        <w:rPr/>
-        <w:t>ningun, uno, o</w:t>
-      </w:r>
-      <w:r>
-        <w:rPr/>
-        <w:t xml:space="preserve"> muchos pagos </w:t>
-      </w:r>
-      <w:r>
-        <w:rPr/>
-        <w:t>a lo largo de su ciclo de vida</w:t>
-      </w:r>
-      <w:r>
-        <w:rPr/>
-        <w:t>.</w:t>
-      </w:r>
-    </w:p>
-    <w:p>
-      <w:pPr>
-        <w:pStyle w:val="Heading4"/>
-        <w:numPr>
-          <w:ilvl w:val="0"/>
-          <w:numId w:val="0"/>
-        </w:numPr>
-        <w:ind w:hanging="0" w:start="0"/>
-        <w:rPr/>
-      </w:pPr>
-      <w:r>
-        <w:rPr/>
-        <w:t>Entre Retiro y Notificacion</w:t>
-      </w:r>
-    </w:p>
-    <w:p>
-      <w:pPr>
-        <w:pStyle w:val="ListParagraph"/>
+        <w:t>ningún</w:t>
+      </w:r>
+      <w:r>
+        <w:t>, uno, o muchos pagos a lo largo de su ciclo de vida.</w:t>
+      </w:r>
+    </w:p>
+    <w:p>
+      <w:pPr>
+        <w:pStyle w:val="Ttulo4"/>
+      </w:pPr>
+      <w:r>
+        <w:lastRenderedPageBreak/>
+        <w:t xml:space="preserve">Entre Retiro y </w:t>
+      </w:r>
+      <w:r>
+        <w:t>Notificación</w:t>
+      </w:r>
+    </w:p>
+    <w:p>
+      <w:r>
+        <w:drawing>
+          <wp:inline distT="0" distB="0" distL="0" distR="0" wp14:anchorId="4D12C08F" wp14:editId="4546D71E">
+            <wp:extent cx="3790950" cy="7342040"/>
+            <wp:effectExtent l="0" t="0" r="0" b="0"/>
+            <wp:docPr id="403816759" name="Imagen 1"/>
+            <wp:cNvGraphicFramePr>
+              <a:graphicFrameLocks xmlns:a="http://schemas.openxmlformats.org/drawingml/2006/main" noChangeAspect="1"/>
+            </wp:cNvGraphicFramePr>
+            <a:graphic xmlns:a="http://schemas.openxmlformats.org/drawingml/2006/main">
+              <a:graphicData uri="http://schemas.openxmlformats.org/drawingml/2006/picture">
+                <pic:pic xmlns:pic="http://schemas.openxmlformats.org/drawingml/2006/picture">
+                  <pic:nvPicPr>
+                    <pic:cNvPr id="403816759" name=""/>
+                    <pic:cNvPicPr/>
+                  </pic:nvPicPr>
+                  <pic:blipFill>
+                    <a:blip r:embed="rId17"/>
+                    <a:stretch>
+                      <a:fillRect/>
+                    </a:stretch>
+                  </pic:blipFill>
+                  <pic:spPr>
+                    <a:xfrm>
+                      <a:off x="0" y="0"/>
+                      <a:ext cx="3795780" cy="7351394"/>
+                    </a:xfrm>
+                    <a:prstGeom prst="rect">
+                      <a:avLst/>
+                    </a:prstGeom>
+                  </pic:spPr>
+                </pic:pic>
+              </a:graphicData>
+            </a:graphic>
+          </wp:inline>
+        </w:drawing>
+      </w:r>
+    </w:p>
+    <w:p>
+      <w:pPr>
+        <w:pStyle w:val="Prrafodelista"/>
         <w:numPr>
           <w:ilvl w:val="0"/>
           <w:numId w:val="1"/>
         </w:numPr>
-        <w:rPr/>
-      </w:pPr>
-      <w:r>
-        <w:rPr/>
-        <w:t xml:space="preserve">Navegabilidad: </w:t>
-      </w:r>
-      <w:r>
-        <w:rPr/>
-        <w:t>Retiro conoce a sus notificaciones.</w:t>
-      </w:r>
-    </w:p>
-    <w:p>
-      <w:pPr>
-        <w:pStyle w:val="ListParagraph"/>
+      </w:pPr>
+      <w:r>
+        <w:t>Navegabilidad: Retiro conoce a sus notificaciones.</w:t>
+      </w:r>
+    </w:p>
+    <w:p>
+      <w:pPr>
+        <w:pStyle w:val="Prrafodelista"/>
         <w:numPr>
           <w:ilvl w:val="0"/>
           <w:numId w:val="1"/>
         </w:numPr>
-        <w:rPr/>
-      </w:pPr>
-      <w:r>
-        <w:rPr/>
-        <w:t xml:space="preserve">Multiplicidad: </w:t>
-      </w:r>
-      <w:r>
-        <w:rPr/>
-        <w:t>Puede haber ninguna (en caso de que se cancele antes de que el sistema dispare una notificacion por fecha puntual) o hasta cuatro notificaciones distintas, por Retiro, a lo largo de su ciclo de vida</w:t>
-      </w:r>
-      <w:r>
-        <w:rPr/>
-        <w:t>.</w:t>
-      </w:r>
-    </w:p>
-    <w:p>
-      <w:pPr>
-        <w:pStyle w:val="Heading4"/>
-        <w:numPr>
-          <w:ilvl w:val="0"/>
-          <w:numId w:val="0"/>
-        </w:numPr>
-        <w:ind w:hanging="0" w:start="0"/>
-        <w:rPr/>
-      </w:pPr>
-      <w:r>
-        <w:rPr/>
+      </w:pPr>
+      <w:r>
+        <w:t xml:space="preserve">Multiplicidad: Puede haber ninguna (en caso de que se cancele antes de que el sistema dispare una </w:t>
+      </w:r>
+      <w:r>
+        <w:t>notificación</w:t>
+      </w:r>
+      <w:r>
+        <w:t xml:space="preserve"> por fecha puntual) o hasta cuatro notificaciones distintas, por Retiro, a lo largo de su ciclo de vida.</w:t>
+      </w:r>
+    </w:p>
+    <w:p>
+      <w:pPr>
+        <w:pStyle w:val="Ttulo4"/>
+      </w:pPr>
+      <w:r>
+        <w:lastRenderedPageBreak/>
         <w:t>Entre Retiro y Actividad</w:t>
       </w:r>
     </w:p>
     <w:p>
-      <w:pPr>
-        <w:pStyle w:val="ListParagraph"/>
+      <w:r>
+        <w:drawing>
+          <wp:inline distT="0" distB="0" distL="0" distR="0" wp14:anchorId="4A12D7E8" wp14:editId="415715E8">
+            <wp:extent cx="1905000" cy="6353175"/>
+            <wp:effectExtent l="0" t="0" r="0" b="9525"/>
+            <wp:docPr id="1445116290" name="Imagen 1"/>
+            <wp:cNvGraphicFramePr>
+              <a:graphicFrameLocks xmlns:a="http://schemas.openxmlformats.org/drawingml/2006/main" noChangeAspect="1"/>
+            </wp:cNvGraphicFramePr>
+            <a:graphic xmlns:a="http://schemas.openxmlformats.org/drawingml/2006/main">
+              <a:graphicData uri="http://schemas.openxmlformats.org/drawingml/2006/picture">
+                <pic:pic xmlns:pic="http://schemas.openxmlformats.org/drawingml/2006/picture">
+                  <pic:nvPicPr>
+                    <pic:cNvPr id="1445116290" name=""/>
+                    <pic:cNvPicPr/>
+                  </pic:nvPicPr>
+                  <pic:blipFill>
+                    <a:blip r:embed="rId18"/>
+                    <a:stretch>
+                      <a:fillRect/>
+                    </a:stretch>
+                  </pic:blipFill>
+                  <pic:spPr>
+                    <a:xfrm>
+                      <a:off x="0" y="0"/>
+                      <a:ext cx="1905000" cy="6353175"/>
+                    </a:xfrm>
+                    <a:prstGeom prst="rect">
+                      <a:avLst/>
+                    </a:prstGeom>
+                  </pic:spPr>
+                </pic:pic>
+              </a:graphicData>
+            </a:graphic>
+          </wp:inline>
+        </w:drawing>
+      </w:r>
+    </w:p>
+    <w:p>
+      <w:pPr>
+        <w:pStyle w:val="Prrafodelista"/>
         <w:numPr>
           <w:ilvl w:val="0"/>
           <w:numId w:val="1"/>
         </w:numPr>
-        <w:rPr/>
-      </w:pPr>
-      <w:r>
-        <w:rPr/>
-        <w:t xml:space="preserve">Navegabilidad: </w:t>
-      </w:r>
-      <w:r>
-        <w:rPr/>
-        <w:t>Retiro</w:t>
-      </w:r>
-      <w:r>
-        <w:rPr/>
-        <w:t xml:space="preserve"> conoce a Actividad</w:t>
-      </w:r>
-    </w:p>
-    <w:p>
-      <w:pPr>
-        <w:pStyle w:val="ListParagraph"/>
+      </w:pPr>
+      <w:r>
+        <w:t>Navegabilidad: Retiro conoce a Actividad</w:t>
+      </w:r>
+    </w:p>
+    <w:p>
+      <w:pPr>
+        <w:pStyle w:val="Prrafodelista"/>
         <w:numPr>
           <w:ilvl w:val="0"/>
           <w:numId w:val="1"/>
         </w:numPr>
-        <w:rPr/>
-      </w:pPr>
-      <w:r>
-        <w:rPr/>
-        <w:t xml:space="preserve">Multiplicidad: </w:t>
-      </w:r>
-      <w:r>
-        <w:rPr/>
-        <w:t>En un Retiro debe haber por lo menos una actividad registrada, en adelante y sin un limite fijo.</w:t>
-      </w:r>
-    </w:p>
-    <w:p>
-      <w:pPr>
-        <w:pStyle w:val="Heading4"/>
-        <w:numPr>
-          <w:ilvl w:val="0"/>
-          <w:numId w:val="0"/>
-        </w:numPr>
-        <w:ind w:hanging="0" w:start="0"/>
-        <w:rPr/>
-      </w:pPr>
-      <w:r>
-        <w:rPr/>
-        <w:t xml:space="preserve">Entre Retiro y </w:t>
-      </w:r>
-      <w:r>
-        <w:rPr/>
-        <w:t>Categoria</w:t>
-      </w:r>
-    </w:p>
-    <w:p>
-      <w:pPr>
-        <w:pStyle w:val="ListParagraph"/>
+      </w:pPr>
+      <w:r>
+        <w:t xml:space="preserve">Multiplicidad: En un Retiro debe haber por lo menos una actividad registrada, en adelante y sin un </w:t>
+      </w:r>
+      <w:r>
+        <w:t>límite</w:t>
+      </w:r>
+      <w:r>
+        <w:t xml:space="preserve"> fijo.</w:t>
+      </w:r>
+    </w:p>
+    <w:p>
+      <w:pPr>
+        <w:pStyle w:val="Ttulo4"/>
+      </w:pPr>
+      <w:r>
+        <w:lastRenderedPageBreak/>
+        <w:t>Entre Retiro y Categor</w:t>
+      </w:r>
+      <w:r>
+        <w:t>í</w:t>
+      </w:r>
+      <w:r>
+        <w:t>a</w:t>
+      </w:r>
+    </w:p>
+    <w:p>
+      <w:r>
+        <w:drawing>
+          <wp:inline distT="0" distB="0" distL="0" distR="0" wp14:anchorId="29E422E5" wp14:editId="28E2EC74">
+            <wp:extent cx="2581275" cy="6100491"/>
+            <wp:effectExtent l="0" t="0" r="0" b="0"/>
+            <wp:docPr id="1845288664" name="Imagen 1"/>
+            <wp:cNvGraphicFramePr>
+              <a:graphicFrameLocks xmlns:a="http://schemas.openxmlformats.org/drawingml/2006/main" noChangeAspect="1"/>
+            </wp:cNvGraphicFramePr>
+            <a:graphic xmlns:a="http://schemas.openxmlformats.org/drawingml/2006/main">
+              <a:graphicData uri="http://schemas.openxmlformats.org/drawingml/2006/picture">
+                <pic:pic xmlns:pic="http://schemas.openxmlformats.org/drawingml/2006/picture">
+                  <pic:nvPicPr>
+                    <pic:cNvPr id="1845288664" name=""/>
+                    <pic:cNvPicPr/>
+                  </pic:nvPicPr>
+                  <pic:blipFill>
+                    <a:blip r:embed="rId19"/>
+                    <a:stretch>
+                      <a:fillRect/>
+                    </a:stretch>
+                  </pic:blipFill>
+                  <pic:spPr>
+                    <a:xfrm>
+                      <a:off x="0" y="0"/>
+                      <a:ext cx="2585601" cy="6110714"/>
+                    </a:xfrm>
+                    <a:prstGeom prst="rect">
+                      <a:avLst/>
+                    </a:prstGeom>
+                  </pic:spPr>
+                </pic:pic>
+              </a:graphicData>
+            </a:graphic>
+          </wp:inline>
+        </w:drawing>
+      </w:r>
+    </w:p>
+    <w:p>
+      <w:pPr>
+        <w:pStyle w:val="Prrafodelista"/>
         <w:numPr>
           <w:ilvl w:val="0"/>
           <w:numId w:val="1"/>
         </w:numPr>
-        <w:rPr/>
-      </w:pPr>
-      <w:r>
-        <w:rPr/>
+      </w:pPr>
+      <w:r>
         <w:t>Navegabilidad: Retiro conoce a Categoría</w:t>
       </w:r>
     </w:p>
     <w:p>
       <w:pPr>
-        <w:pStyle w:val="ListParagraph"/>
+        <w:pStyle w:val="Prrafodelista"/>
         <w:numPr>
           <w:ilvl w:val="0"/>
           <w:numId w:val="1"/>
         </w:numPr>
-        <w:rPr/>
-      </w:pPr>
-      <w:r>
-        <w:rPr/>
-        <w:t xml:space="preserve">Multiplicidad: </w:t>
-      </w:r>
-      <w:r>
-        <w:rPr/>
-        <w:t>Un retiro tiene una categoria puntual (se opto por este enfoque simple), pero muchos retiros existentes pueden estar asociados a una categoria</w:t>
-      </w:r>
-      <w:r>
-        <w:rPr/>
+      </w:pPr>
+      <w:r>
+        <w:t xml:space="preserve">Multiplicidad: Un retiro tiene una </w:t>
+      </w:r>
+      <w:r>
+        <w:t>categoría</w:t>
+      </w:r>
+      <w:r>
+        <w:t xml:space="preserve"> puntual (se </w:t>
+      </w:r>
+      <w:r>
+        <w:t>optó</w:t>
+      </w:r>
+      <w:r>
+        <w:t xml:space="preserve"> por este enfoque simple), pero muchos retiros existentes pueden estar asociados a una </w:t>
+      </w:r>
+      <w:r>
+        <w:t>categoría</w:t>
+      </w:r>
+      <w:r>
         <w:t>.</w:t>
       </w:r>
     </w:p>
-    <w:p>
-      <w:pPr>
-        <w:pStyle w:val="Normal"/>
-        <w:rPr/>
-      </w:pPr>
-      <w:r>
-        <w:rPr/>
-      </w:r>
-    </w:p>
-    <w:p>
-      <w:pPr>
-        <w:pStyle w:val="Heading2"/>
+    <w:p/>
+    <w:p>
+      <w:pPr>
+        <w:pStyle w:val="Ttulo2"/>
         <w:rPr>
           <w:b/>
           <w:bCs/>
           <w:u w:val="single"/>
         </w:rPr>
       </w:pPr>
-      <w:bookmarkStart w:id="5" w:name="_Toc237872480"/>
+      <w:bookmarkStart w:id="4" w:name="_Toc237872480"/>
       <w:r>
         <w:rPr>
           <w:b/>
           <w:bCs/>
           <w:u w:val="single"/>
         </w:rPr>
+        <w:lastRenderedPageBreak/>
         <w:t>Git log de la segunda entrega</w:t>
       </w:r>
-      <w:bookmarkEnd w:id="5"/>
-    </w:p>
-    <w:p>
-      <w:pPr>
-        <w:pStyle w:val="Normal"/>
-        <w:rPr/>
-      </w:pPr>
-      <w:r>
-        <w:rPr/>
+      <w:bookmarkEnd w:id="4"/>
+    </w:p>
+    <w:p>
+      <w:r>
+        <w:rPr>
+          <w:noProof/>
+        </w:rPr>
         <w:drawing>
-          <wp:inline distT="0" distB="0" distL="0" distR="0">
+          <wp:inline distT="0" distB="0" distL="0" distR="0" wp14:anchorId="60304A34" wp14:editId="379B83A9">
             <wp:extent cx="5733415" cy="4230370"/>
             <wp:effectExtent l="0" t="0" r="0" b="0"/>
             <wp:docPr id="3" name="Imagen 5"/>
@@ -1680,7 +1610,7 @@
                     </pic:cNvPicPr>
                   </pic:nvPicPr>
                   <pic:blipFill>
-                    <a:blip r:embed="rId10"/>
+                    <a:blip r:embed="rId20"/>
                     <a:stretch>
                       <a:fillRect/>
                     </a:stretch>
@@ -1703,52 +1633,70 @@
       </w:r>
     </w:p>
     <w:sectPr>
-      <w:headerReference w:type="even" r:id="rId11"/>
-      <w:headerReference w:type="default" r:id="rId12"/>
-      <w:headerReference w:type="first" r:id="rId13"/>
-      <w:footerReference w:type="even" r:id="rId14"/>
-      <w:footerReference w:type="default" r:id="rId15"/>
-      <w:footerReference w:type="first" r:id="rId16"/>
-      <w:type w:val="nextPage"/>
+      <w:headerReference w:type="even" r:id="rId21"/>
+      <w:headerReference w:type="default" r:id="rId22"/>
+      <w:footerReference w:type="even" r:id="rId23"/>
+      <w:footerReference w:type="default" r:id="rId24"/>
+      <w:headerReference w:type="first" r:id="rId25"/>
+      <w:footerReference w:type="first" r:id="rId26"/>
       <w:pgSz w:w="11906" w:h="16838"/>
-      <w:pgMar w:left="1440" w:right="1440" w:gutter="0" w:header="720" w:top="1440" w:footer="720" w:bottom="1440"/>
-      <w:pgNumType w:start="0" w:fmt="decimal"/>
-      <w:formProt w:val="false"/>
+      <w:pgMar w:top="1440" w:right="1440" w:bottom="1440" w:left="1440" w:header="720" w:footer="720" w:gutter="0"/>
+      <w:pgNumType w:start="0"/>
+      <w:cols w:space="720"/>
+      <w:formProt w:val="0"/>
       <w:titlePg/>
-      <w:textDirection w:val="lrTb"/>
-      <w:docGrid w:type="default" w:linePitch="100" w:charSpace="0"/>
+      <w:docGrid w:linePitch="100"/>
     </w:sectPr>
   </w:body>
 </w:document>
 </file>
 
+<file path=word/endnotes.xml><?xml version="1.0" encoding="utf-8"?>
+<w:endnotes xmlns:wpc="http://schemas.microsoft.com/office/word/2010/wordprocessingCanvas" xmlns:cx="http://schemas.microsoft.com/office/drawing/2014/chartex" xmlns:cx1="http://schemas.microsoft.com/office/drawing/2015/9/8/chartex" xmlns:cx2="http://schemas.microsoft.com/office/drawing/2015/10/21/chartex" xmlns:cx3="http://schemas.microsoft.com/office/drawing/2016/5/9/chartex" xmlns:cx4="http://schemas.microsoft.com/office/drawing/2016/5/10/chartex" xmlns:cx5="http://schemas.microsoft.com/office/drawing/2016/5/11/chartex" xmlns:cx6="http://schemas.microsoft.com/office/drawing/2016/5/12/chartex" xmlns:cx7="http://schemas.microsoft.com/office/drawing/2016/5/13/chartex" xmlns:cx8="http://schemas.microsoft.com/office/drawing/2016/5/14/chartex" xmlns:mc="http://schemas.openxmlformats.org/markup-compatibility/2006" xmlns:aink="http://schemas.microsoft.com/office/drawing/2016/ink" xmlns:am3d="http://schemas.microsoft.com/office/drawing/2017/model3d" xmlns:o="urn:schemas-microsoft-com:office:office" xmlns:oel="http://schemas.microsoft.com/office/2019/extlst" xmlns:r="http://schemas.openxmlformats.org/officeDocument/2006/relationships" xmlns:m="http://schemas.openxmlformats.org/officeDocument/2006/math" xmlns:v="urn:schemas-microsoft-com:vml" xmlns:wp14="http://schemas.microsoft.com/office/word/2010/wordprocessingDrawing" xmlns:wp="http://schemas.openxmlformats.org/drawingml/2006/wordprocessingDrawing" xmlns:w10="urn:schemas-microsoft-com:office:word" xmlns:w="http://schemas.openxmlformats.org/wordprocessingml/2006/main" xmlns:w14="http://schemas.microsoft.com/office/word/2010/wordml" xmlns:w15="http://schemas.microsoft.com/office/word/2012/wordml" xmlns:w16cex="http://schemas.microsoft.com/office/word/2018/wordml/cex" xmlns:w16cid="http://schemas.microsoft.com/office/word/2016/wordml/cid" xmlns:w16="http://schemas.microsoft.com/office/word/2018/wordml" xmlns:w16du="http://schemas.microsoft.com/office/word/2023/wordml/word16du" xmlns:w16sdtdh="http://schemas.microsoft.com/office/word/2020/wordml/sdtdatahash" xmlns:w16sdtfl="http://schemas.microsoft.com/office/word/2024/wordml/sdtformatlock" xmlns:w16se="http://schemas.microsoft.com/office/word/2015/wordml/symex" xmlns:wpg="http://schemas.microsoft.com/office/word/2010/wordprocessingGroup" xmlns:wpi="http://schemas.microsoft.com/office/word/2010/wordprocessingInk" xmlns:wne="http://schemas.microsoft.com/office/word/2006/wordml" xmlns:wps="http://schemas.microsoft.com/office/word/2010/wordprocessingShape" mc:Ignorable="w14 w15 w16se w16cid w16 w16cex w16sdtdh w16sdtfl w16du wp14">
+  <w:endnote w:type="separator" w:id="-1">
+    <w:p>
+      <w:pPr>
+        <w:spacing w:line="240" w:lineRule="auto"/>
+      </w:pPr>
+      <w:r>
+        <w:separator/>
+      </w:r>
+    </w:p>
+  </w:endnote>
+  <w:endnote w:type="continuationSeparator" w:id="0">
+    <w:p>
+      <w:pPr>
+        <w:spacing w:line="240" w:lineRule="auto"/>
+      </w:pPr>
+      <w:r>
+        <w:continuationSeparator/>
+      </w:r>
+    </w:p>
+  </w:endnote>
+</w:endnotes>
+</file>
+
 <file path=word/footer1.xml><?xml version="1.0" encoding="utf-8"?>
-<w:ftr xmlns:o="urn:schemas-microsoft-com:office:office" xmlns:r="http://schemas.openxmlformats.org/officeDocument/2006/relationships" xmlns:v="urn:schemas-microsoft-com:vml" xmlns:w="http://schemas.openxmlformats.org/wordprocessingml/2006/main" xmlns:w10="urn:schemas-microsoft-com:office:word" xmlns:wp="http://schemas.openxmlformats.org/drawingml/2006/wordprocessingDrawing" xmlns:pic="http://schemas.openxmlformats.org/drawingml/2006/picture" xmlns:wps="http://schemas.microsoft.com/office/word/2010/wordprocessingShape" xmlns:wpg="http://schemas.microsoft.com/office/word/2010/wordprocessingGroup" xmlns:mc="http://schemas.openxmlformats.org/markup-compatibility/2006" xmlns:wp14="http://schemas.microsoft.com/office/word/2010/wordprocessingDrawing" xmlns:w14="http://schemas.microsoft.com/office/word/2010/wordml" xmlns:w15="http://schemas.microsoft.com/office/word/2012/wordml" mc:Ignorable="w14 wp14 w15">
+<w:ftr xmlns:wpc="http://schemas.microsoft.com/office/word/2010/wordprocessingCanvas" xmlns:cx="http://schemas.microsoft.com/office/drawing/2014/chartex" xmlns:cx1="http://schemas.microsoft.com/office/drawing/2015/9/8/chartex" xmlns:cx2="http://schemas.microsoft.com/office/drawing/2015/10/21/chartex" xmlns:cx3="http://schemas.microsoft.com/office/drawing/2016/5/9/chartex" xmlns:cx4="http://schemas.microsoft.com/office/drawing/2016/5/10/chartex" xmlns:cx5="http://schemas.microsoft.com/office/drawing/2016/5/11/chartex" xmlns:cx6="http://schemas.microsoft.com/office/drawing/2016/5/12/chartex" xmlns:cx7="http://schemas.microsoft.com/office/drawing/2016/5/13/chartex" xmlns:cx8="http://schemas.microsoft.com/office/drawing/2016/5/14/chartex" xmlns:mc="http://schemas.openxmlformats.org/markup-compatibility/2006" xmlns:aink="http://schemas.microsoft.com/office/drawing/2016/ink" xmlns:am3d="http://schemas.microsoft.com/office/drawing/2017/model3d" xmlns:o="urn:schemas-microsoft-com:office:office" xmlns:oel="http://schemas.microsoft.com/office/2019/extlst" xmlns:r="http://schemas.openxmlformats.org/officeDocument/2006/relationships" xmlns:m="http://schemas.openxmlformats.org/officeDocument/2006/math" xmlns:v="urn:schemas-microsoft-com:vml" xmlns:wp14="http://schemas.microsoft.com/office/word/2010/wordprocessingDrawing" xmlns:wp="http://schemas.openxmlformats.org/drawingml/2006/wordprocessingDrawing" xmlns:w10="urn:schemas-microsoft-com:office:word" xmlns:w="http://schemas.openxmlformats.org/wordprocessingml/2006/main" xmlns:w14="http://schemas.microsoft.com/office/word/2010/wordml" xmlns:w15="http://schemas.microsoft.com/office/word/2012/wordml" xmlns:w16cex="http://schemas.microsoft.com/office/word/2018/wordml/cex" xmlns:w16cid="http://schemas.microsoft.com/office/word/2016/wordml/cid" xmlns:w16="http://schemas.microsoft.com/office/word/2018/wordml" xmlns:w16du="http://schemas.microsoft.com/office/word/2023/wordml/word16du" xmlns:w16sdtdh="http://schemas.microsoft.com/office/word/2020/wordml/sdtdatahash" xmlns:w16sdtfl="http://schemas.microsoft.com/office/word/2024/wordml/sdtformatlock" xmlns:w16se="http://schemas.microsoft.com/office/word/2015/wordml/symex" xmlns:wpg="http://schemas.microsoft.com/office/word/2010/wordprocessingGroup" xmlns:wpi="http://schemas.microsoft.com/office/word/2010/wordprocessingInk" xmlns:wne="http://schemas.microsoft.com/office/word/2006/wordml" xmlns:wps="http://schemas.microsoft.com/office/word/2010/wordprocessingShape" mc:Ignorable="w14 w15 w16se w16cid w16 w16cex w16sdtdh w16sdtfl w16du wp14">
   <w:p>
     <w:pPr>
-      <w:pStyle w:val="Footer"/>
-      <w:rPr/>
+      <w:pStyle w:val="Piedepgina"/>
     </w:pPr>
-    <w:r>
-      <w:rPr/>
-    </w:r>
   </w:p>
 </w:ftr>
 </file>
 
 <file path=word/footer2.xml><?xml version="1.0" encoding="utf-8"?>
-<w:ftr xmlns:o="urn:schemas-microsoft-com:office:office" xmlns:r="http://schemas.openxmlformats.org/officeDocument/2006/relationships" xmlns:v="urn:schemas-microsoft-com:vml" xmlns:w="http://schemas.openxmlformats.org/wordprocessingml/2006/main" xmlns:w10="urn:schemas-microsoft-com:office:word" xmlns:wp="http://schemas.openxmlformats.org/drawingml/2006/wordprocessingDrawing" xmlns:pic="http://schemas.openxmlformats.org/drawingml/2006/picture" xmlns:wps="http://schemas.microsoft.com/office/word/2010/wordprocessingShape" xmlns:wpg="http://schemas.microsoft.com/office/word/2010/wordprocessingGroup" xmlns:mc="http://schemas.openxmlformats.org/markup-compatibility/2006" xmlns:wp14="http://schemas.microsoft.com/office/word/2010/wordprocessingDrawing" xmlns:w14="http://schemas.microsoft.com/office/word/2010/wordml" xmlns:w15="http://schemas.microsoft.com/office/word/2012/wordml" mc:Ignorable="w14 wp14 w15">
+<w:ftr xmlns:wpc="http://schemas.microsoft.com/office/word/2010/wordprocessingCanvas" xmlns:cx="http://schemas.microsoft.com/office/drawing/2014/chartex" xmlns:cx1="http://schemas.microsoft.com/office/drawing/2015/9/8/chartex" xmlns:cx2="http://schemas.microsoft.com/office/drawing/2015/10/21/chartex" xmlns:cx3="http://schemas.microsoft.com/office/drawing/2016/5/9/chartex" xmlns:cx4="http://schemas.microsoft.com/office/drawing/2016/5/10/chartex" xmlns:cx5="http://schemas.microsoft.com/office/drawing/2016/5/11/chartex" xmlns:cx6="http://schemas.microsoft.com/office/drawing/2016/5/12/chartex" xmlns:cx7="http://schemas.microsoft.com/office/drawing/2016/5/13/chartex" xmlns:cx8="http://schemas.microsoft.com/office/drawing/2016/5/14/chartex" xmlns:mc="http://schemas.openxmlformats.org/markup-compatibility/2006" xmlns:aink="http://schemas.microsoft.com/office/drawing/2016/ink" xmlns:am3d="http://schemas.microsoft.com/office/drawing/2017/model3d" xmlns:o="urn:schemas-microsoft-com:office:office" xmlns:oel="http://schemas.microsoft.com/office/2019/extlst" xmlns:r="http://schemas.openxmlformats.org/officeDocument/2006/relationships" xmlns:m="http://schemas.openxmlformats.org/officeDocument/2006/math" xmlns:v="urn:schemas-microsoft-com:vml" xmlns:wp14="http://schemas.microsoft.com/office/word/2010/wordprocessingDrawing" xmlns:wp="http://schemas.openxmlformats.org/drawingml/2006/wordprocessingDrawing" xmlns:w10="urn:schemas-microsoft-com:office:word" xmlns:w="http://schemas.openxmlformats.org/wordprocessingml/2006/main" xmlns:w14="http://schemas.microsoft.com/office/word/2010/wordml" xmlns:w15="http://schemas.microsoft.com/office/word/2012/wordml" xmlns:w16cex="http://schemas.microsoft.com/office/word/2018/wordml/cex" xmlns:w16cid="http://schemas.microsoft.com/office/word/2016/wordml/cid" xmlns:w16="http://schemas.microsoft.com/office/word/2018/wordml" xmlns:w16du="http://schemas.microsoft.com/office/word/2023/wordml/word16du" xmlns:w16sdtdh="http://schemas.microsoft.com/office/word/2020/wordml/sdtdatahash" xmlns:w16sdtfl="http://schemas.microsoft.com/office/word/2024/wordml/sdtformatlock" xmlns:w16se="http://schemas.microsoft.com/office/word/2015/wordml/symex" xmlns:wpg="http://schemas.microsoft.com/office/word/2010/wordprocessingGroup" xmlns:wpi="http://schemas.microsoft.com/office/word/2010/wordprocessingInk" xmlns:wne="http://schemas.microsoft.com/office/word/2006/wordml" xmlns:wps="http://schemas.microsoft.com/office/word/2010/wordprocessingShape" mc:Ignorable="w14 w15 w16se w16cid w16 w16cex w16sdtdh w16sdtfl w16du wp14">
   <w:p>
-    <w:pPr>
-      <w:pStyle w:val="Normal"/>
-      <w:rPr/>
-    </w:pPr>
     <w:r>
-      <w:rPr/>
+      <w:rPr>
+        <w:noProof/>
+      </w:rPr>
       <mc:AlternateContent>
         <mc:Choice Requires="wps">
           <w:drawing>
-            <wp:anchor distT="0" distB="0" distL="0" distR="0" simplePos="0" relativeHeight="20" behindDoc="1" locked="0" layoutInCell="1" allowOverlap="1" wp14:anchorId="78A880AB">
+            <wp:anchor distT="0" distB="0" distL="0" distR="0" simplePos="0" relativeHeight="251658241" behindDoc="1" locked="0" layoutInCell="1" allowOverlap="1" wp14:anchorId="78A880AB" wp14:editId="383CB802">
               <wp:simplePos x="0" y="0"/>
               <wp:positionH relativeFrom="column">
                 <wp:posOffset>5218430</wp:posOffset>
@@ -1760,6 +1708,7 @@
               <wp:effectExtent l="0" t="0" r="0" b="0"/>
               <wp:wrapNone/>
               <wp:docPr id="6" name="Flecha: pentágono 3"/>
+              <wp:cNvGraphicFramePr/>
               <a:graphic xmlns:a="http://schemas.openxmlformats.org/drawingml/2006/main">
                 <a:graphicData uri="http://schemas.microsoft.com/office/word/2010/wordprocessingShape">
                   <wps:wsp>
@@ -1782,9 +1731,15 @@
                       </a:ln>
                     </wps:spPr>
                     <wps:style>
-                      <a:lnRef idx="0"/>
-                      <a:fillRef idx="0"/>
-                      <a:effectRef idx="0"/>
+                      <a:lnRef idx="0">
+                        <a:scrgbClr r="0" g="0" b="0"/>
+                      </a:lnRef>
+                      <a:fillRef idx="0">
+                        <a:scrgbClr r="0" g="0" b="0"/>
+                      </a:fillRef>
+                      <a:effectRef idx="0">
+                        <a:scrgbClr r="0" g="0" b="0"/>
+                      </a:effectRef>
                       <a:fontRef idx="minor"/>
                     </wps:style>
                     <wps:txbx>
@@ -1792,13 +1747,9 @@
                         <w:p>
                           <w:pPr>
                             <w:pStyle w:val="FrameContents"/>
-                            <w:spacing w:lineRule="auto" w:line="240"/>
+                            <w:spacing w:line="240" w:lineRule="auto"/>
                             <w:jc w:val="center"/>
-                            <w:rPr/>
                           </w:pPr>
-                          <w:r>
-                            <w:rPr/>
-                          </w:r>
                         </w:p>
                       </w:txbxContent>
                     </wps:txbx>
@@ -1813,48 +1764,42 @@
         </mc:Choice>
         <mc:Fallback>
           <w:pict>
-            <v:shapetype id="_x0000_t15" coordsize="21600,21600" o:spt="15" adj="10800" path="m,l@2,l21600,10800l@2,21600l,21600xe">
+            <v:shapetype w14:anchorId="78A880AB" id="_x0000_t15" coordsize="21600,21600" o:spt="15" adj="16200" path="m@0,l,,,21600@0,21600,21600,10800xe">
               <v:stroke joinstyle="miter"/>
               <v:formulas>
-                <v:f eqn="val 21600"/>
                 <v:f eqn="val #0"/>
-                <v:f eqn="sum width 0 @1"/>
-                <v:f eqn="sum @2 width 0"/>
-                <v:f eqn="prod 1 @3 2"/>
-                <v:f eqn="prod @2 1 2"/>
+                <v:f eqn="prod #0 1 2"/>
               </v:formulas>
-              <v:path gradientshapeok="t" o:connecttype="rect" textboxrect="0,0,@4,21600"/>
+              <v:path gradientshapeok="t" o:connecttype="custom" o:connectlocs="@1,0;0,10800;@1,21600;21600,10800" o:connectangles="270,180,90,0" textboxrect="0,0,10800,21600;0,0,16200,21600;0,0,21600,21600"/>
               <v:handles>
-                <v:h position="@2,0"/>
+                <v:h position="#0,topLeft" xrange="0,21600"/>
               </v:handles>
             </v:shapetype>
-            <v:shape id="shape_0" fillcolor="#45818e" stroked="f" o:allowincell="f" style="position:absolute;margin-left:410.9pt;margin-top:7.5pt;width:110.6pt;height:26.2pt;mso-wrap-style:none;v-text-anchor:middle;rotation:180" wp14:anchorId="78A880AB" type="_x0000_t15" path="m0,0l-2147483639,0l-2147483633,-2147483635l-2147483639,-2147483634l0,-2147483634xe">
-              <v:fill o:detectmouseclick="t" type="solid" color2="#ba7e71"/>
-              <v:stroke color="#3465a4" joinstyle="round" endcap="flat"/>
-              <v:textbox>
+            <v:shape id="Flecha: pentágono 3" o:spid="_x0000_s1027" type="#_x0000_t15" style="position:absolute;margin-left:410.9pt;margin-top:7.5pt;width:110.65pt;height:26.25pt;rotation:180;z-index:-251658239;visibility:visible;mso-wrap-style:square;mso-wrap-distance-left:0;mso-wrap-distance-top:0;mso-wrap-distance-right:0;mso-wrap-distance-bottom:0;mso-position-horizontal:absolute;mso-position-horizontal-relative:text;mso-position-vertical:absolute;mso-position-vertical-relative:text;v-text-anchor:middle" o:gfxdata="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" adj="19038" fillcolor="#45818e" stroked="f" strokeweight="0">
+              <v:textbox inset=",7.2pt,,7.2pt">
                 <w:txbxContent>
                   <w:p>
                     <w:pPr>
                       <w:pStyle w:val="FrameContents"/>
-                      <w:spacing w:lineRule="auto" w:line="240"/>
+                      <w:spacing w:line="240" w:lineRule="auto"/>
                       <w:jc w:val="center"/>
-                      <w:rPr/>
                     </w:pPr>
-                    <w:r>
-                      <w:rPr/>
-                    </w:r>
                   </w:p>
                 </w:txbxContent>
               </v:textbox>
-              <w10:wrap type="none"/>
             </v:shape>
           </w:pict>
         </mc:Fallback>
       </mc:AlternateContent>
+    </w:r>
+    <w:r>
+      <w:rPr>
+        <w:noProof/>
+      </w:rPr>
       <mc:AlternateContent>
         <mc:Choice Requires="wps">
           <w:drawing>
-            <wp:anchor distT="0" distB="0" distL="0" distR="0" simplePos="0" relativeHeight="35" behindDoc="1" locked="0" layoutInCell="0" allowOverlap="1" wp14:anchorId="55970E85">
+            <wp:anchor distT="0" distB="0" distL="0" distR="0" simplePos="0" relativeHeight="251658243" behindDoc="1" locked="0" layoutInCell="0" allowOverlap="1" wp14:anchorId="55970E85" wp14:editId="0C6BE82A">
               <wp:simplePos x="0" y="0"/>
               <wp:positionH relativeFrom="margin">
                 <wp:posOffset>753745</wp:posOffset>
@@ -1866,6 +1811,7 @@
               <wp:effectExtent l="0" t="0" r="0" b="0"/>
               <wp:wrapNone/>
               <wp:docPr id="7" name="Cuadro de texto 1"/>
+              <wp:cNvGraphicFramePr/>
               <a:graphic xmlns:a="http://schemas.openxmlformats.org/drawingml/2006/main">
                 <a:graphicData uri="http://schemas.microsoft.com/office/word/2010/wordprocessingShape">
                   <wps:wsp>
@@ -1884,9 +1830,15 @@
                       </a:ln>
                     </wps:spPr>
                     <wps:style>
-                      <a:lnRef idx="0"/>
-                      <a:fillRef idx="0"/>
-                      <a:effectRef idx="0"/>
+                      <a:lnRef idx="0">
+                        <a:scrgbClr r="0" g="0" b="0"/>
+                      </a:lnRef>
+                      <a:fillRef idx="0">
+                        <a:scrgbClr r="0" g="0" b="0"/>
+                      </a:fillRef>
+                      <a:effectRef idx="0">
+                        <a:scrgbClr r="0" g="0" b="0"/>
+                      </a:effectRef>
                       <a:fontRef idx="minor"/>
                     </wps:style>
                     <wps:txbx>
@@ -1894,7 +1846,7 @@
                         <w:p>
                           <w:pPr>
                             <w:pStyle w:val="FrameContents"/>
-                            <w:spacing w:lineRule="auto" w:line="240"/>
+                            <w:spacing w:line="240" w:lineRule="auto"/>
                             <w:jc w:val="center"/>
                             <w:rPr>
                               <w:color w:val="666666"/>
@@ -1914,7 +1866,7 @@
                         <w:p>
                           <w:pPr>
                             <w:pStyle w:val="FrameContents"/>
-                            <w:spacing w:lineRule="auto" w:line="240"/>
+                            <w:spacing w:line="240" w:lineRule="auto"/>
                             <w:jc w:val="center"/>
                             <w:rPr>
                               <w:sz w:val="20"/>
@@ -1927,15 +1879,7 @@
                               <w:sz w:val="24"/>
                               <w:szCs w:val="20"/>
                             </w:rPr>
-                            <w:t xml:space="preserve"> </w:t>
-                          </w:r>
-                          <w:r>
-                            <w:rPr>
-                              <w:color w:val="666666"/>
-                              <w:sz w:val="24"/>
-                              <w:szCs w:val="20"/>
-                            </w:rPr>
-                            <w:t>Nuñez Juan</w:t>
+                            <w:t xml:space="preserve"> Nuñez Juan</w:t>
                           </w:r>
                         </w:p>
                       </w:txbxContent>
@@ -1951,15 +1895,13 @@
         </mc:Choice>
         <mc:Fallback>
           <w:pict>
-            <v:rect id="shape_0" stroked="f" o:allowincell="f" style="position:absolute;margin-left:59.35pt;margin-top:5.05pt;width:305.6pt;height:54.1pt;mso-wrap-style:square;v-text-anchor:top;mso-position-horizontal-relative:margin" wp14:anchorId="55970E85">
-              <v:fill o:detectmouseclick="t" on="false"/>
-              <v:stroke color="#3465a4" joinstyle="round" endcap="flat"/>
-              <v:textbox>
+            <v:rect w14:anchorId="55970E85" id="Cuadro de texto 1" o:spid="_x0000_s1028" style="position:absolute;margin-left:59.35pt;margin-top:5.05pt;width:305.65pt;height:54.15pt;z-index:-251658237;visibility:visible;mso-wrap-style:square;mso-wrap-distance-left:0;mso-wrap-distance-top:0;mso-wrap-distance-right:0;mso-wrap-distance-bottom:0;mso-position-horizontal:absolute;mso-position-horizontal-relative:margin;mso-position-vertical:absolute;mso-position-vertical-relative:text;v-text-anchor:top" o:gfxdata="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" o:allowincell="f" filled="f" stroked="f" strokeweight="0">
+              <v:textbox inset=",7.2pt,,7.2pt">
                 <w:txbxContent>
                   <w:p>
                     <w:pPr>
                       <w:pStyle w:val="FrameContents"/>
-                      <w:spacing w:lineRule="auto" w:line="240"/>
+                      <w:spacing w:line="240" w:lineRule="auto"/>
                       <w:jc w:val="center"/>
                       <w:rPr>
                         <w:color w:val="666666"/>
@@ -1979,7 +1921,7 @@
                   <w:p>
                     <w:pPr>
                       <w:pStyle w:val="FrameContents"/>
-                      <w:spacing w:lineRule="auto" w:line="240"/>
+                      <w:spacing w:line="240" w:lineRule="auto"/>
                       <w:jc w:val="center"/>
                       <w:rPr>
                         <w:sz w:val="20"/>
@@ -1992,20 +1934,12 @@
                         <w:sz w:val="24"/>
                         <w:szCs w:val="20"/>
                       </w:rPr>
-                      <w:t xml:space="preserve"> </w:t>
-                    </w:r>
-                    <w:r>
-                      <w:rPr>
-                        <w:color w:val="666666"/>
-                        <w:sz w:val="24"/>
-                        <w:szCs w:val="20"/>
-                      </w:rPr>
-                      <w:t>Nuñez Juan</w:t>
+                      <w:t xml:space="preserve"> Nuñez Juan</w:t>
                     </w:r>
                   </w:p>
                 </w:txbxContent>
               </v:textbox>
-              <w10:wrap type="none"/>
+              <w10:wrap anchorx="margin"/>
             </v:rect>
           </w:pict>
         </mc:Fallback>
@@ -2014,37 +1948,30 @@
   </w:p>
   <w:p>
     <w:pPr>
-      <w:pStyle w:val="Normal"/>
       <w:tabs>
-        <w:tab w:val="clear" w:pos="720"/>
-        <w:tab w:val="center" w:pos="4514" w:leader="none"/>
-        <w:tab w:val="right" w:pos="9029" w:leader="none"/>
+        <w:tab w:val="center" w:pos="4514"/>
+        <w:tab w:val="right" w:pos="9029"/>
       </w:tabs>
-      <w:rPr/>
     </w:pPr>
     <w:r>
-      <w:rPr/>
-      <w:tab/>
       <w:tab/>
     </w:r>
     <w:r>
-      <w:rPr/>
+      <w:tab/>
+    </w:r>
+    <w:r>
       <w:fldChar w:fldCharType="begin"/>
     </w:r>
     <w:r>
-      <w:rPr/>
       <w:instrText xml:space="preserve"> PAGE </w:instrText>
     </w:r>
     <w:r>
-      <w:rPr/>
       <w:fldChar w:fldCharType="separate"/>
     </w:r>
     <w:r>
-      <w:rPr/>
       <w:t>5</w:t>
     </w:r>
     <w:r>
-      <w:rPr/>
       <w:fldChar w:fldCharType="end"/>
     </w:r>
   </w:p>
@@ -2052,46 +1979,61 @@
 </file>
 
 <file path=word/footer3.xml><?xml version="1.0" encoding="utf-8"?>
-<w:ftr xmlns:o="urn:schemas-microsoft-com:office:office" xmlns:r="http://schemas.openxmlformats.org/officeDocument/2006/relationships" xmlns:v="urn:schemas-microsoft-com:vml" xmlns:w="http://schemas.openxmlformats.org/wordprocessingml/2006/main" xmlns:w10="urn:schemas-microsoft-com:office:word" xmlns:wp="http://schemas.openxmlformats.org/drawingml/2006/wordprocessingDrawing" xmlns:pic="http://schemas.openxmlformats.org/drawingml/2006/picture" xmlns:wps="http://schemas.microsoft.com/office/word/2010/wordprocessingShape" xmlns:wpg="http://schemas.microsoft.com/office/word/2010/wordprocessingGroup" xmlns:mc="http://schemas.openxmlformats.org/markup-compatibility/2006" xmlns:wp14="http://schemas.microsoft.com/office/word/2010/wordprocessingDrawing" xmlns:w14="http://schemas.microsoft.com/office/word/2010/wordml" xmlns:w15="http://schemas.microsoft.com/office/word/2012/wordml" mc:Ignorable="w14 wp14 w15">
+<w:ftr xmlns:wpc="http://schemas.microsoft.com/office/word/2010/wordprocessingCanvas" xmlns:cx="http://schemas.microsoft.com/office/drawing/2014/chartex" xmlns:cx1="http://schemas.microsoft.com/office/drawing/2015/9/8/chartex" xmlns:cx2="http://schemas.microsoft.com/office/drawing/2015/10/21/chartex" xmlns:cx3="http://schemas.microsoft.com/office/drawing/2016/5/9/chartex" xmlns:cx4="http://schemas.microsoft.com/office/drawing/2016/5/10/chartex" xmlns:cx5="http://schemas.microsoft.com/office/drawing/2016/5/11/chartex" xmlns:cx6="http://schemas.microsoft.com/office/drawing/2016/5/12/chartex" xmlns:cx7="http://schemas.microsoft.com/office/drawing/2016/5/13/chartex" xmlns:cx8="http://schemas.microsoft.com/office/drawing/2016/5/14/chartex" xmlns:mc="http://schemas.openxmlformats.org/markup-compatibility/2006" xmlns:aink="http://schemas.microsoft.com/office/drawing/2016/ink" xmlns:am3d="http://schemas.microsoft.com/office/drawing/2017/model3d" xmlns:o="urn:schemas-microsoft-com:office:office" xmlns:oel="http://schemas.microsoft.com/office/2019/extlst" xmlns:r="http://schemas.openxmlformats.org/officeDocument/2006/relationships" xmlns:m="http://schemas.openxmlformats.org/officeDocument/2006/math" xmlns:v="urn:schemas-microsoft-com:vml" xmlns:wp14="http://schemas.microsoft.com/office/word/2010/wordprocessingDrawing" xmlns:wp="http://schemas.openxmlformats.org/drawingml/2006/wordprocessingDrawing" xmlns:w10="urn:schemas-microsoft-com:office:word" xmlns:w="http://schemas.openxmlformats.org/wordprocessingml/2006/main" xmlns:w14="http://schemas.microsoft.com/office/word/2010/wordml" xmlns:w15="http://schemas.microsoft.com/office/word/2012/wordml" xmlns:w16cex="http://schemas.microsoft.com/office/word/2018/wordml/cex" xmlns:w16cid="http://schemas.microsoft.com/office/word/2016/wordml/cid" xmlns:w16="http://schemas.microsoft.com/office/word/2018/wordml" xmlns:w16du="http://schemas.microsoft.com/office/word/2023/wordml/word16du" xmlns:w16sdtdh="http://schemas.microsoft.com/office/word/2020/wordml/sdtdatahash" xmlns:w16sdtfl="http://schemas.microsoft.com/office/word/2024/wordml/sdtformatlock" xmlns:w16se="http://schemas.microsoft.com/office/word/2015/wordml/symex" xmlns:wpg="http://schemas.microsoft.com/office/word/2010/wordprocessingGroup" xmlns:wpi="http://schemas.microsoft.com/office/word/2010/wordprocessingInk" xmlns:wne="http://schemas.microsoft.com/office/word/2006/wordml" xmlns:wps="http://schemas.microsoft.com/office/word/2010/wordprocessingShape" mc:Ignorable="w14 w15 w16se w16cid w16 w16cex w16sdtdh w16sdtfl w16du wp14">
   <w:p>
     <w:pPr>
-      <w:pStyle w:val="Footer"/>
-      <w:rPr/>
+      <w:pStyle w:val="Piedepgina"/>
     </w:pPr>
-    <w:r>
-      <w:rPr/>
-    </w:r>
   </w:p>
 </w:ftr>
 </file>
 
+<file path=word/footnotes.xml><?xml version="1.0" encoding="utf-8"?>
+<w:footnotes xmlns:wpc="http://schemas.microsoft.com/office/word/2010/wordprocessingCanvas" xmlns:cx="http://schemas.microsoft.com/office/drawing/2014/chartex" xmlns:cx1="http://schemas.microsoft.com/office/drawing/2015/9/8/chartex" xmlns:cx2="http://schemas.microsoft.com/office/drawing/2015/10/21/chartex" xmlns:cx3="http://schemas.microsoft.com/office/drawing/2016/5/9/chartex" xmlns:cx4="http://schemas.microsoft.com/office/drawing/2016/5/10/chartex" xmlns:cx5="http://schemas.microsoft.com/office/drawing/2016/5/11/chartex" xmlns:cx6="http://schemas.microsoft.com/office/drawing/2016/5/12/chartex" xmlns:cx7="http://schemas.microsoft.com/office/drawing/2016/5/13/chartex" xmlns:cx8="http://schemas.microsoft.com/office/drawing/2016/5/14/chartex" xmlns:mc="http://schemas.openxmlformats.org/markup-compatibility/2006" xmlns:aink="http://schemas.microsoft.com/office/drawing/2016/ink" xmlns:am3d="http://schemas.microsoft.com/office/drawing/2017/model3d" xmlns:o="urn:schemas-microsoft-com:office:office" xmlns:oel="http://schemas.microsoft.com/office/2019/extlst" xmlns:r="http://schemas.openxmlformats.org/officeDocument/2006/relationships" xmlns:m="http://schemas.openxmlformats.org/officeDocument/2006/math" xmlns:v="urn:schemas-microsoft-com:vml" xmlns:wp14="http://schemas.microsoft.com/office/word/2010/wordprocessingDrawing" xmlns:wp="http://schemas.openxmlformats.org/drawingml/2006/wordprocessingDrawing" xmlns:w10="urn:schemas-microsoft-com:office:word" xmlns:w="http://schemas.openxmlformats.org/wordprocessingml/2006/main" xmlns:w14="http://schemas.microsoft.com/office/word/2010/wordml" xmlns:w15="http://schemas.microsoft.com/office/word/2012/wordml" xmlns:w16cex="http://schemas.microsoft.com/office/word/2018/wordml/cex" xmlns:w16cid="http://schemas.microsoft.com/office/word/2016/wordml/cid" xmlns:w16="http://schemas.microsoft.com/office/word/2018/wordml" xmlns:w16du="http://schemas.microsoft.com/office/word/2023/wordml/word16du" xmlns:w16sdtdh="http://schemas.microsoft.com/office/word/2020/wordml/sdtdatahash" xmlns:w16sdtfl="http://schemas.microsoft.com/office/word/2024/wordml/sdtformatlock" xmlns:w16se="http://schemas.microsoft.com/office/word/2015/wordml/symex" xmlns:wpg="http://schemas.microsoft.com/office/word/2010/wordprocessingGroup" xmlns:wpi="http://schemas.microsoft.com/office/word/2010/wordprocessingInk" xmlns:wne="http://schemas.microsoft.com/office/word/2006/wordml" xmlns:wps="http://schemas.microsoft.com/office/word/2010/wordprocessingShape" mc:Ignorable="w14 w15 w16se w16cid w16 w16cex w16sdtdh w16sdtfl w16du wp14">
+  <w:footnote w:type="separator" w:id="-1">
+    <w:p>
+      <w:pPr>
+        <w:spacing w:line="240" w:lineRule="auto"/>
+      </w:pPr>
+      <w:r>
+        <w:separator/>
+      </w:r>
+    </w:p>
+  </w:footnote>
+  <w:footnote w:type="continuationSeparator" w:id="0">
+    <w:p>
+      <w:pPr>
+        <w:spacing w:line="240" w:lineRule="auto"/>
+      </w:pPr>
+      <w:r>
+        <w:continuationSeparator/>
+      </w:r>
+    </w:p>
+  </w:footnote>
+</w:footnotes>
+</file>
+
 <file path=word/header1.xml><?xml version="1.0" encoding="utf-8"?>
-<w:hdr xmlns:o="urn:schemas-microsoft-com:office:office" xmlns:r="http://schemas.openxmlformats.org/officeDocument/2006/relationships" xmlns:v="urn:schemas-microsoft-com:vml" xmlns:w="http://schemas.openxmlformats.org/wordprocessingml/2006/main" xmlns:w10="urn:schemas-microsoft-com:office:word" xmlns:wp="http://schemas.openxmlformats.org/drawingml/2006/wordprocessingDrawing" xmlns:pic="http://schemas.openxmlformats.org/drawingml/2006/picture" xmlns:wps="http://schemas.microsoft.com/office/word/2010/wordprocessingShape" xmlns:wpg="http://schemas.microsoft.com/office/word/2010/wordprocessingGroup" xmlns:mc="http://schemas.openxmlformats.org/markup-compatibility/2006" xmlns:wp14="http://schemas.microsoft.com/office/word/2010/wordprocessingDrawing" xmlns:w14="http://schemas.microsoft.com/office/word/2010/wordml" xmlns:w15="http://schemas.microsoft.com/office/word/2012/wordml" mc:Ignorable="w14 wp14 w15">
+<w:hdr xmlns:wpc="http://schemas.microsoft.com/office/word/2010/wordprocessingCanvas" xmlns:cx="http://schemas.microsoft.com/office/drawing/2014/chartex" xmlns:cx1="http://schemas.microsoft.com/office/drawing/2015/9/8/chartex" xmlns:cx2="http://schemas.microsoft.com/office/drawing/2015/10/21/chartex" xmlns:cx3="http://schemas.microsoft.com/office/drawing/2016/5/9/chartex" xmlns:cx4="http://schemas.microsoft.com/office/drawing/2016/5/10/chartex" xmlns:cx5="http://schemas.microsoft.com/office/drawing/2016/5/11/chartex" xmlns:cx6="http://schemas.microsoft.com/office/drawing/2016/5/12/chartex" xmlns:cx7="http://schemas.microsoft.com/office/drawing/2016/5/13/chartex" xmlns:cx8="http://schemas.microsoft.com/office/drawing/2016/5/14/chartex" xmlns:mc="http://schemas.openxmlformats.org/markup-compatibility/2006" xmlns:aink="http://schemas.microsoft.com/office/drawing/2016/ink" xmlns:am3d="http://schemas.microsoft.com/office/drawing/2017/model3d" xmlns:o="urn:schemas-microsoft-com:office:office" xmlns:oel="http://schemas.microsoft.com/office/2019/extlst" xmlns:r="http://schemas.openxmlformats.org/officeDocument/2006/relationships" xmlns:m="http://schemas.openxmlformats.org/officeDocument/2006/math" xmlns:v="urn:schemas-microsoft-com:vml" xmlns:wp14="http://schemas.microsoft.com/office/word/2010/wordprocessingDrawing" xmlns:wp="http://schemas.openxmlformats.org/drawingml/2006/wordprocessingDrawing" xmlns:w10="urn:schemas-microsoft-com:office:word" xmlns:w="http://schemas.openxmlformats.org/wordprocessingml/2006/main" xmlns:w14="http://schemas.microsoft.com/office/word/2010/wordml" xmlns:w15="http://schemas.microsoft.com/office/word/2012/wordml" xmlns:w16cex="http://schemas.microsoft.com/office/word/2018/wordml/cex" xmlns:w16cid="http://schemas.microsoft.com/office/word/2016/wordml/cid" xmlns:w16="http://schemas.microsoft.com/office/word/2018/wordml" xmlns:w16du="http://schemas.microsoft.com/office/word/2023/wordml/word16du" xmlns:w16sdtdh="http://schemas.microsoft.com/office/word/2020/wordml/sdtdatahash" xmlns:w16sdtfl="http://schemas.microsoft.com/office/word/2024/wordml/sdtformatlock" xmlns:w16se="http://schemas.microsoft.com/office/word/2015/wordml/symex" xmlns:wpg="http://schemas.microsoft.com/office/word/2010/wordprocessingGroup" xmlns:wpi="http://schemas.microsoft.com/office/word/2010/wordprocessingInk" xmlns:wne="http://schemas.microsoft.com/office/word/2006/wordml" xmlns:wps="http://schemas.microsoft.com/office/word/2010/wordprocessingShape" mc:Ignorable="w14 w15 w16se w16cid w16 w16cex w16sdtdh w16sdtfl w16du wp14">
   <w:p>
     <w:pPr>
-      <w:pStyle w:val="Header"/>
-      <w:rPr/>
+      <w:pStyle w:val="Encabezado"/>
     </w:pPr>
-    <w:r>
-      <w:rPr/>
-    </w:r>
   </w:p>
 </w:hdr>
 </file>
 
 <file path=word/header2.xml><?xml version="1.0" encoding="utf-8"?>
-<w:hdr xmlns:o="urn:schemas-microsoft-com:office:office" xmlns:r="http://schemas.openxmlformats.org/officeDocument/2006/relationships" xmlns:v="urn:schemas-microsoft-com:vml" xmlns:w="http://schemas.openxmlformats.org/wordprocessingml/2006/main" xmlns:w10="urn:schemas-microsoft-com:office:word" xmlns:wp="http://schemas.openxmlformats.org/drawingml/2006/wordprocessingDrawing" xmlns:pic="http://schemas.openxmlformats.org/drawingml/2006/picture" xmlns:wps="http://schemas.microsoft.com/office/word/2010/wordprocessingShape" xmlns:wpg="http://schemas.microsoft.com/office/word/2010/wordprocessingGroup" xmlns:mc="http://schemas.openxmlformats.org/markup-compatibility/2006" xmlns:wp14="http://schemas.microsoft.com/office/word/2010/wordprocessingDrawing" xmlns:w14="http://schemas.microsoft.com/office/word/2010/wordml" xmlns:w15="http://schemas.microsoft.com/office/word/2012/wordml" mc:Ignorable="w14 wp14 w15">
+<w:hdr xmlns:wpc="http://schemas.microsoft.com/office/word/2010/wordprocessingCanvas" xmlns:cx="http://schemas.microsoft.com/office/drawing/2014/chartex" xmlns:cx1="http://schemas.microsoft.com/office/drawing/2015/9/8/chartex" xmlns:cx2="http://schemas.microsoft.com/office/drawing/2015/10/21/chartex" xmlns:cx3="http://schemas.microsoft.com/office/drawing/2016/5/9/chartex" xmlns:cx4="http://schemas.microsoft.com/office/drawing/2016/5/10/chartex" xmlns:cx5="http://schemas.microsoft.com/office/drawing/2016/5/11/chartex" xmlns:cx6="http://schemas.microsoft.com/office/drawing/2016/5/12/chartex" xmlns:cx7="http://schemas.microsoft.com/office/drawing/2016/5/13/chartex" xmlns:cx8="http://schemas.microsoft.com/office/drawing/2016/5/14/chartex" xmlns:mc="http://schemas.openxmlformats.org/markup-compatibility/2006" xmlns:aink="http://schemas.microsoft.com/office/drawing/2016/ink" xmlns:am3d="http://schemas.microsoft.com/office/drawing/2017/model3d" xmlns:o="urn:schemas-microsoft-com:office:office" xmlns:oel="http://schemas.microsoft.com/office/2019/extlst" xmlns:r="http://schemas.openxmlformats.org/officeDocument/2006/relationships" xmlns:m="http://schemas.openxmlformats.org/officeDocument/2006/math" xmlns:v="urn:schemas-microsoft-com:vml" xmlns:wp14="http://schemas.microsoft.com/office/word/2010/wordprocessingDrawing" xmlns:wp="http://schemas.openxmlformats.org/drawingml/2006/wordprocessingDrawing" xmlns:w10="urn:schemas-microsoft-com:office:word" xmlns:w="http://schemas.openxmlformats.org/wordprocessingml/2006/main" xmlns:w14="http://schemas.microsoft.com/office/word/2010/wordml" xmlns:w15="http://schemas.microsoft.com/office/word/2012/wordml" xmlns:w16cex="http://schemas.microsoft.com/office/word/2018/wordml/cex" xmlns:w16cid="http://schemas.microsoft.com/office/word/2016/wordml/cid" xmlns:w16="http://schemas.microsoft.com/office/word/2018/wordml" xmlns:w16du="http://schemas.microsoft.com/office/word/2023/wordml/word16du" xmlns:w16sdtdh="http://schemas.microsoft.com/office/word/2020/wordml/sdtdatahash" xmlns:w16sdtfl="http://schemas.microsoft.com/office/word/2024/wordml/sdtformatlock" xmlns:w16se="http://schemas.microsoft.com/office/word/2015/wordml/symex" xmlns:wpg="http://schemas.microsoft.com/office/word/2010/wordprocessingGroup" xmlns:wpi="http://schemas.microsoft.com/office/word/2010/wordprocessingInk" xmlns:wne="http://schemas.microsoft.com/office/word/2006/wordml" xmlns:wps="http://schemas.microsoft.com/office/word/2010/wordprocessingShape" mc:Ignorable="w14 w15 w16se w16cid w16 w16cex w16sdtdh w16sdtfl w16du wp14">
   <w:p>
-    <w:pPr>
-      <w:pStyle w:val="Normal"/>
-      <w:rPr/>
-    </w:pPr>
     <w:r>
-      <w:rPr/>
+      <w:rPr>
+        <w:noProof/>
+      </w:rPr>
       <mc:AlternateContent>
         <mc:Choice Requires="wps">
           <w:drawing>
-            <wp:anchor distT="0" distB="0" distL="0" distR="0" simplePos="0" relativeHeight="10" behindDoc="1" locked="0" layoutInCell="1" allowOverlap="1" wp14:anchorId="6704EB9D">
+            <wp:anchor distT="0" distB="0" distL="0" distR="0" simplePos="0" relativeHeight="251658240" behindDoc="1" locked="0" layoutInCell="1" allowOverlap="1" wp14:anchorId="6704EB9D" wp14:editId="256A6FA8">
               <wp:simplePos x="0" y="0"/>
               <wp:positionH relativeFrom="column">
                 <wp:posOffset>-685800</wp:posOffset>
@@ -2103,6 +2045,7 @@
               <wp:effectExtent l="0" t="0" r="0" b="0"/>
               <wp:wrapNone/>
               <wp:docPr id="4" name="Cuadro de texto 2"/>
+              <wp:cNvGraphicFramePr/>
               <a:graphic xmlns:a="http://schemas.openxmlformats.org/drawingml/2006/main">
                 <a:graphicData uri="http://schemas.microsoft.com/office/word/2010/wordprocessingShape">
                   <wps:wsp>
@@ -2121,9 +2064,15 @@
                       </a:ln>
                     </wps:spPr>
                     <wps:style>
-                      <a:lnRef idx="0"/>
-                      <a:fillRef idx="0"/>
-                      <a:effectRef idx="0"/>
+                      <a:lnRef idx="0">
+                        <a:scrgbClr r="0" g="0" b="0"/>
+                      </a:lnRef>
+                      <a:fillRef idx="0">
+                        <a:scrgbClr r="0" g="0" b="0"/>
+                      </a:fillRef>
+                      <a:effectRef idx="0">
+                        <a:scrgbClr r="0" g="0" b="0"/>
+                      </a:effectRef>
                       <a:fontRef idx="minor"/>
                     </wps:style>
                     <wps:txbx>
@@ -2131,12 +2080,10 @@
                         <w:p>
                           <w:pPr>
                             <w:pStyle w:val="FrameContents"/>
-                            <w:spacing w:lineRule="auto" w:line="276"/>
-                            <w:rPr/>
                           </w:pPr>
                           <w:r>
                             <w:rPr>
-                              <w:rFonts w:eastAsia="Roboto" w:cs="Roboto" w:ascii="Roboto" w:hAnsi="Roboto"/>
+                              <w:rFonts w:ascii="Roboto" w:eastAsia="Roboto" w:hAnsi="Roboto" w:cs="Roboto"/>
                               <w:b/>
                               <w:color w:val="666666"/>
                             </w:rPr>
@@ -2146,13 +2093,11 @@
                         <w:p>
                           <w:pPr>
                             <w:pStyle w:val="FrameContents"/>
-                            <w:spacing w:lineRule="auto" w:line="276"/>
                             <w:ind w:firstLine="720"/>
-                            <w:rPr/>
                           </w:pPr>
                           <w:r>
                             <w:rPr>
-                              <w:rFonts w:eastAsia="Roboto" w:cs="Roboto" w:ascii="Roboto" w:hAnsi="Roboto"/>
+                              <w:rFonts w:ascii="Roboto" w:eastAsia="Roboto" w:hAnsi="Roboto" w:cs="Roboto"/>
                               <w:color w:val="666666"/>
                             </w:rPr>
                             <w:t>Análisis de Sistemas de Información</w:t>
@@ -2171,20 +2116,16 @@
         </mc:Choice>
         <mc:Fallback>
           <w:pict>
-            <v:rect id="shape_0" stroked="f" o:allowincell="f" style="position:absolute;margin-left:-54pt;margin-top:-23.25pt;width:257.95pt;height:40.45pt;mso-wrap-style:square;v-text-anchor:top" wp14:anchorId="6704EB9D">
-              <v:fill o:detectmouseclick="t" on="false"/>
-              <v:stroke color="#3465a4" joinstyle="round" endcap="flat"/>
-              <v:textbox>
+            <v:rect w14:anchorId="6704EB9D" id="Cuadro de texto 2" o:spid="_x0000_s1026" style="position:absolute;margin-left:-54pt;margin-top:-23.25pt;width:258pt;height:40.5pt;z-index:-251658240;visibility:visible;mso-wrap-style:square;mso-wrap-distance-left:0;mso-wrap-distance-top:0;mso-wrap-distance-right:0;mso-wrap-distance-bottom:0;mso-position-horizontal:absolute;mso-position-horizontal-relative:text;mso-position-vertical:absolute;mso-position-vertical-relative:text;v-text-anchor:top" o:gfxdata="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" filled="f" stroked="f" strokeweight="0">
+              <v:textbox inset=",7.2pt,,7.2pt">
                 <w:txbxContent>
                   <w:p>
                     <w:pPr>
                       <w:pStyle w:val="FrameContents"/>
-                      <w:spacing w:lineRule="auto" w:line="276"/>
-                      <w:rPr/>
                     </w:pPr>
                     <w:r>
                       <w:rPr>
-                        <w:rFonts w:eastAsia="Roboto" w:cs="Roboto" w:ascii="Roboto" w:hAnsi="Roboto"/>
+                        <w:rFonts w:ascii="Roboto" w:eastAsia="Roboto" w:hAnsi="Roboto" w:cs="Roboto"/>
                         <w:b/>
                         <w:color w:val="666666"/>
                       </w:rPr>
@@ -2194,13 +2135,11 @@
                   <w:p>
                     <w:pPr>
                       <w:pStyle w:val="FrameContents"/>
-                      <w:spacing w:lineRule="auto" w:line="276"/>
                       <w:ind w:firstLine="720"/>
-                      <w:rPr/>
                     </w:pPr>
                     <w:r>
                       <w:rPr>
-                        <w:rFonts w:eastAsia="Roboto" w:cs="Roboto" w:ascii="Roboto" w:hAnsi="Roboto"/>
+                        <w:rFonts w:ascii="Roboto" w:eastAsia="Roboto" w:hAnsi="Roboto" w:cs="Roboto"/>
                         <w:color w:val="666666"/>
                       </w:rPr>
                       <w:t>Análisis de Sistemas de Información</w:t>
@@ -2208,13 +2147,17 @@
                   </w:p>
                 </w:txbxContent>
               </v:textbox>
-              <w10:wrap type="none"/>
             </v:rect>
           </w:pict>
         </mc:Fallback>
       </mc:AlternateContent>
+    </w:r>
+    <w:r>
+      <w:rPr>
+        <w:noProof/>
+      </w:rPr>
       <w:drawing>
-        <wp:anchor distT="0" distB="0" distL="0" distR="0" simplePos="0" relativeHeight="26" behindDoc="1" locked="0" layoutInCell="1" allowOverlap="1">
+        <wp:anchor distT="0" distB="0" distL="0" distR="0" simplePos="0" relativeHeight="251658242" behindDoc="1" locked="0" layoutInCell="1" allowOverlap="1" wp14:anchorId="7F4A37A0" wp14:editId="5D44ECC9">
           <wp:simplePos x="0" y="0"/>
           <wp:positionH relativeFrom="column">
             <wp:posOffset>4052570</wp:posOffset>
@@ -2265,32 +2208,153 @@
 </file>
 
 <file path=word/header3.xml><?xml version="1.0" encoding="utf-8"?>
-<w:hdr xmlns:o="urn:schemas-microsoft-com:office:office" xmlns:r="http://schemas.openxmlformats.org/officeDocument/2006/relationships" xmlns:v="urn:schemas-microsoft-com:vml" xmlns:w="http://schemas.openxmlformats.org/wordprocessingml/2006/main" xmlns:w10="urn:schemas-microsoft-com:office:word" xmlns:wp="http://schemas.openxmlformats.org/drawingml/2006/wordprocessingDrawing" xmlns:pic="http://schemas.openxmlformats.org/drawingml/2006/picture" xmlns:wps="http://schemas.microsoft.com/office/word/2010/wordprocessingShape" xmlns:wpg="http://schemas.microsoft.com/office/word/2010/wordprocessingGroup" xmlns:mc="http://schemas.openxmlformats.org/markup-compatibility/2006" xmlns:wp14="http://schemas.microsoft.com/office/word/2010/wordprocessingDrawing" xmlns:w14="http://schemas.microsoft.com/office/word/2010/wordml" xmlns:w15="http://schemas.microsoft.com/office/word/2012/wordml" mc:Ignorable="w14 wp14 w15">
+<w:hdr xmlns:wpc="http://schemas.microsoft.com/office/word/2010/wordprocessingCanvas" xmlns:cx="http://schemas.microsoft.com/office/drawing/2014/chartex" xmlns:cx1="http://schemas.microsoft.com/office/drawing/2015/9/8/chartex" xmlns:cx2="http://schemas.microsoft.com/office/drawing/2015/10/21/chartex" xmlns:cx3="http://schemas.microsoft.com/office/drawing/2016/5/9/chartex" xmlns:cx4="http://schemas.microsoft.com/office/drawing/2016/5/10/chartex" xmlns:cx5="http://schemas.microsoft.com/office/drawing/2016/5/11/chartex" xmlns:cx6="http://schemas.microsoft.com/office/drawing/2016/5/12/chartex" xmlns:cx7="http://schemas.microsoft.com/office/drawing/2016/5/13/chartex" xmlns:cx8="http://schemas.microsoft.com/office/drawing/2016/5/14/chartex" xmlns:mc="http://schemas.openxmlformats.org/markup-compatibility/2006" xmlns:aink="http://schemas.microsoft.com/office/drawing/2016/ink" xmlns:am3d="http://schemas.microsoft.com/office/drawing/2017/model3d" xmlns:o="urn:schemas-microsoft-com:office:office" xmlns:oel="http://schemas.microsoft.com/office/2019/extlst" xmlns:r="http://schemas.openxmlformats.org/officeDocument/2006/relationships" xmlns:m="http://schemas.openxmlformats.org/officeDocument/2006/math" xmlns:v="urn:schemas-microsoft-com:vml" xmlns:wp14="http://schemas.microsoft.com/office/word/2010/wordprocessingDrawing" xmlns:wp="http://schemas.openxmlformats.org/drawingml/2006/wordprocessingDrawing" xmlns:w10="urn:schemas-microsoft-com:office:word" xmlns:w="http://schemas.openxmlformats.org/wordprocessingml/2006/main" xmlns:w14="http://schemas.microsoft.com/office/word/2010/wordml" xmlns:w15="http://schemas.microsoft.com/office/word/2012/wordml" xmlns:w16cex="http://schemas.microsoft.com/office/word/2018/wordml/cex" xmlns:w16cid="http://schemas.microsoft.com/office/word/2016/wordml/cid" xmlns:w16="http://schemas.microsoft.com/office/word/2018/wordml" xmlns:w16du="http://schemas.microsoft.com/office/word/2023/wordml/word16du" xmlns:w16sdtdh="http://schemas.microsoft.com/office/word/2020/wordml/sdtdatahash" xmlns:w16sdtfl="http://schemas.microsoft.com/office/word/2024/wordml/sdtformatlock" xmlns:w16se="http://schemas.microsoft.com/office/word/2015/wordml/symex" xmlns:wpg="http://schemas.microsoft.com/office/word/2010/wordprocessingGroup" xmlns:wpi="http://schemas.microsoft.com/office/word/2010/wordprocessingInk" xmlns:wne="http://schemas.microsoft.com/office/word/2006/wordml" xmlns:wps="http://schemas.microsoft.com/office/word/2010/wordprocessingShape" mc:Ignorable="w14 w15 w16se w16cid w16 w16cex w16sdtdh w16sdtfl w16du wp14">
   <w:p>
     <w:pPr>
-      <w:pStyle w:val="Header"/>
-      <w:rPr/>
+      <w:pStyle w:val="Encabezado"/>
     </w:pPr>
-    <w:r>
-      <w:rPr/>
-    </w:r>
   </w:p>
 </w:hdr>
 </file>
 
 <file path=word/numbering.xml><?xml version="1.0" encoding="utf-8"?>
-<w:numbering xmlns:w="http://schemas.openxmlformats.org/wordprocessingml/2006/main" xmlns:o="urn:schemas-microsoft-com:office:office" xmlns:r="http://schemas.openxmlformats.org/officeDocument/2006/relationships" xmlns:v="urn:schemas-microsoft-com:vml" xmlns:mc="http://schemas.openxmlformats.org/markup-compatibility/2006" xmlns:w14="http://schemas.microsoft.com/office/word/2010/wordml" mc:Ignorable="w14">
-  <w:abstractNum w:abstractNumId="1">
+<w:numbering xmlns:wpc="http://schemas.microsoft.com/office/word/2010/wordprocessingCanvas" xmlns:cx="http://schemas.microsoft.com/office/drawing/2014/chartex" xmlns:cx1="http://schemas.microsoft.com/office/drawing/2015/9/8/chartex" xmlns:cx2="http://schemas.microsoft.com/office/drawing/2015/10/21/chartex" xmlns:cx3="http://schemas.microsoft.com/office/drawing/2016/5/9/chartex" xmlns:cx4="http://schemas.microsoft.com/office/drawing/2016/5/10/chartex" xmlns:cx5="http://schemas.microsoft.com/office/drawing/2016/5/11/chartex" xmlns:cx6="http://schemas.microsoft.com/office/drawing/2016/5/12/chartex" xmlns:cx7="http://schemas.microsoft.com/office/drawing/2016/5/13/chartex" xmlns:cx8="http://schemas.microsoft.com/office/drawing/2016/5/14/chartex" xmlns:mc="http://schemas.openxmlformats.org/markup-compatibility/2006" xmlns:aink="http://schemas.microsoft.com/office/drawing/2016/ink" xmlns:am3d="http://schemas.microsoft.com/office/drawing/2017/model3d" xmlns:o="urn:schemas-microsoft-com:office:office" xmlns:oel="http://schemas.microsoft.com/office/2019/extlst" xmlns:r="http://schemas.openxmlformats.org/officeDocument/2006/relationships" xmlns:m="http://schemas.openxmlformats.org/officeDocument/2006/math" xmlns:v="urn:schemas-microsoft-com:vml" xmlns:wp14="http://schemas.microsoft.com/office/word/2010/wordprocessingDrawing" xmlns:wp="http://schemas.openxmlformats.org/drawingml/2006/wordprocessingDrawing" xmlns:w10="urn:schemas-microsoft-com:office:word" xmlns:w="http://schemas.openxmlformats.org/wordprocessingml/2006/main" xmlns:w14="http://schemas.microsoft.com/office/word/2010/wordml" xmlns:w15="http://schemas.microsoft.com/office/word/2012/wordml" xmlns:w16cex="http://schemas.microsoft.com/office/word/2018/wordml/cex" xmlns:w16cid="http://schemas.microsoft.com/office/word/2016/wordml/cid" xmlns:w16="http://schemas.microsoft.com/office/word/2018/wordml" xmlns:w16du="http://schemas.microsoft.com/office/word/2023/wordml/word16du" xmlns:w16sdtdh="http://schemas.microsoft.com/office/word/2020/wordml/sdtdatahash" xmlns:w16sdtfl="http://schemas.microsoft.com/office/word/2024/wordml/sdtformatlock" xmlns:w16se="http://schemas.microsoft.com/office/word/2015/wordml/symex" xmlns:wpg="http://schemas.microsoft.com/office/word/2010/wordprocessingGroup" xmlns:wpi="http://schemas.microsoft.com/office/word/2010/wordprocessingInk" xmlns:wne="http://schemas.microsoft.com/office/word/2006/wordml" xmlns:wps="http://schemas.microsoft.com/office/word/2010/wordprocessingShape" mc:Ignorable="w14 w15 w16se w16cid w16 w16cex w16sdtdh w16sdtfl w16du wp14">
+  <w:abstractNum w:abstractNumId="0" w15:restartNumberingAfterBreak="0">
+    <w:nsid w:val="307D766F"/>
+    <w:multiLevelType w:val="multilevel"/>
+    <w:tmpl w:val="7E2035B6"/>
+    <w:lvl w:ilvl="0">
+      <w:start w:val="1"/>
+      <w:numFmt w:val="none"/>
+      <w:suff w:val="nothing"/>
+      <w:lvlText w:val=""/>
+      <w:lvlJc w:val="left"/>
+      <w:pPr>
+        <w:tabs>
+          <w:tab w:val="num" w:pos="0"/>
+        </w:tabs>
+        <w:ind w:left="0" w:firstLine="0"/>
+      </w:pPr>
+    </w:lvl>
+    <w:lvl w:ilvl="1">
+      <w:start w:val="1"/>
+      <w:numFmt w:val="none"/>
+      <w:suff w:val="nothing"/>
+      <w:lvlText w:val=""/>
+      <w:lvlJc w:val="left"/>
+      <w:pPr>
+        <w:tabs>
+          <w:tab w:val="num" w:pos="0"/>
+        </w:tabs>
+        <w:ind w:left="0" w:firstLine="0"/>
+      </w:pPr>
+    </w:lvl>
+    <w:lvl w:ilvl="2">
+      <w:start w:val="1"/>
+      <w:numFmt w:val="none"/>
+      <w:suff w:val="nothing"/>
+      <w:lvlText w:val=""/>
+      <w:lvlJc w:val="left"/>
+      <w:pPr>
+        <w:tabs>
+          <w:tab w:val="num" w:pos="0"/>
+        </w:tabs>
+        <w:ind w:left="0" w:firstLine="0"/>
+      </w:pPr>
+    </w:lvl>
+    <w:lvl w:ilvl="3">
+      <w:start w:val="1"/>
+      <w:numFmt w:val="none"/>
+      <w:suff w:val="nothing"/>
+      <w:lvlText w:val=""/>
+      <w:lvlJc w:val="left"/>
+      <w:pPr>
+        <w:tabs>
+          <w:tab w:val="num" w:pos="0"/>
+        </w:tabs>
+        <w:ind w:left="0" w:firstLine="0"/>
+      </w:pPr>
+    </w:lvl>
+    <w:lvl w:ilvl="4">
+      <w:start w:val="1"/>
+      <w:numFmt w:val="none"/>
+      <w:suff w:val="nothing"/>
+      <w:lvlText w:val=""/>
+      <w:lvlJc w:val="left"/>
+      <w:pPr>
+        <w:tabs>
+          <w:tab w:val="num" w:pos="0"/>
+        </w:tabs>
+        <w:ind w:left="0" w:firstLine="0"/>
+      </w:pPr>
+    </w:lvl>
+    <w:lvl w:ilvl="5">
+      <w:start w:val="1"/>
+      <w:numFmt w:val="none"/>
+      <w:suff w:val="nothing"/>
+      <w:lvlText w:val=""/>
+      <w:lvlJc w:val="left"/>
+      <w:pPr>
+        <w:tabs>
+          <w:tab w:val="num" w:pos="0"/>
+        </w:tabs>
+        <w:ind w:left="0" w:firstLine="0"/>
+      </w:pPr>
+    </w:lvl>
+    <w:lvl w:ilvl="6">
+      <w:start w:val="1"/>
+      <w:numFmt w:val="none"/>
+      <w:suff w:val="nothing"/>
+      <w:lvlText w:val=""/>
+      <w:lvlJc w:val="left"/>
+      <w:pPr>
+        <w:tabs>
+          <w:tab w:val="num" w:pos="0"/>
+        </w:tabs>
+        <w:ind w:left="0" w:firstLine="0"/>
+      </w:pPr>
+    </w:lvl>
+    <w:lvl w:ilvl="7">
+      <w:start w:val="1"/>
+      <w:numFmt w:val="none"/>
+      <w:suff w:val="nothing"/>
+      <w:lvlText w:val=""/>
+      <w:lvlJc w:val="left"/>
+      <w:pPr>
+        <w:tabs>
+          <w:tab w:val="num" w:pos="0"/>
+        </w:tabs>
+        <w:ind w:left="0" w:firstLine="0"/>
+      </w:pPr>
+    </w:lvl>
+    <w:lvl w:ilvl="8">
+      <w:start w:val="1"/>
+      <w:numFmt w:val="none"/>
+      <w:suff w:val="nothing"/>
+      <w:lvlText w:val=""/>
+      <w:lvlJc w:val="left"/>
+      <w:pPr>
+        <w:tabs>
+          <w:tab w:val="num" w:pos="0"/>
+        </w:tabs>
+        <w:ind w:left="0" w:firstLine="0"/>
+      </w:pPr>
+    </w:lvl>
+  </w:abstractNum>
+  <w:abstractNum w:abstractNumId="1" w15:restartNumberingAfterBreak="0">
+    <w:nsid w:val="37586308"/>
+    <w:multiLevelType w:val="multilevel"/>
+    <w:tmpl w:val="E2162532"/>
     <w:lvl w:ilvl="0">
       <w:start w:val="1"/>
       <w:numFmt w:val="bullet"/>
       <w:lvlText w:val=""/>
-      <w:lvlJc w:val="start"/>
+      <w:lvlJc w:val="left"/>
       <w:pPr>
         <w:tabs>
           <w:tab w:val="num" w:pos="0"/>
         </w:tabs>
-        <w:ind w:start="720" w:hanging="360"/>
+        <w:ind w:left="720" w:hanging="360"/>
       </w:pPr>
       <w:rPr>
         <w:rFonts w:ascii="Symbol" w:hAnsi="Symbol" w:cs="Symbol" w:hint="default"/>
@@ -2300,12 +2364,12 @@
       <w:start w:val="1"/>
       <w:numFmt w:val="bullet"/>
       <w:lvlText w:val="o"/>
-      <w:lvlJc w:val="start"/>
+      <w:lvlJc w:val="left"/>
       <w:pPr>
         <w:tabs>
           <w:tab w:val="num" w:pos="0"/>
         </w:tabs>
-        <w:ind w:start="1440" w:hanging="360"/>
+        <w:ind w:left="1440" w:hanging="360"/>
       </w:pPr>
       <w:rPr>
         <w:rFonts w:ascii="Courier New" w:hAnsi="Courier New" w:cs="Courier New" w:hint="default"/>
@@ -2315,12 +2379,12 @@
       <w:start w:val="1"/>
       <w:numFmt w:val="bullet"/>
       <w:lvlText w:val=""/>
-      <w:lvlJc w:val="start"/>
+      <w:lvlJc w:val="left"/>
       <w:pPr>
         <w:tabs>
           <w:tab w:val="num" w:pos="0"/>
         </w:tabs>
-        <w:ind w:start="2160" w:hanging="360"/>
+        <w:ind w:left="2160" w:hanging="360"/>
       </w:pPr>
       <w:rPr>
         <w:rFonts w:ascii="Wingdings" w:hAnsi="Wingdings" w:cs="Wingdings" w:hint="default"/>
@@ -2330,12 +2394,12 @@
       <w:start w:val="1"/>
       <w:numFmt w:val="bullet"/>
       <w:lvlText w:val=""/>
-      <w:lvlJc w:val="start"/>
+      <w:lvlJc w:val="left"/>
       <w:pPr>
         <w:tabs>
           <w:tab w:val="num" w:pos="0"/>
         </w:tabs>
-        <w:ind w:start="2880" w:hanging="360"/>
+        <w:ind w:left="2880" w:hanging="360"/>
       </w:pPr>
       <w:rPr>
         <w:rFonts w:ascii="Symbol" w:hAnsi="Symbol" w:cs="Symbol" w:hint="default"/>
@@ -2345,12 +2409,12 @@
       <w:start w:val="1"/>
       <w:numFmt w:val="bullet"/>
       <w:lvlText w:val="o"/>
-      <w:lvlJc w:val="start"/>
+      <w:lvlJc w:val="left"/>
       <w:pPr>
         <w:tabs>
           <w:tab w:val="num" w:pos="0"/>
         </w:tabs>
-        <w:ind w:start="3600" w:hanging="360"/>
+        <w:ind w:left="3600" w:hanging="360"/>
       </w:pPr>
       <w:rPr>
         <w:rFonts w:ascii="Courier New" w:hAnsi="Courier New" w:cs="Courier New" w:hint="default"/>
@@ -2360,12 +2424,12 @@
       <w:start w:val="1"/>
       <w:numFmt w:val="bullet"/>
       <w:lvlText w:val=""/>
-      <w:lvlJc w:val="start"/>
+      <w:lvlJc w:val="left"/>
       <w:pPr>
         <w:tabs>
           <w:tab w:val="num" w:pos="0"/>
         </w:tabs>
-        <w:ind w:start="4320" w:hanging="360"/>
+        <w:ind w:left="4320" w:hanging="360"/>
       </w:pPr>
       <w:rPr>
         <w:rFonts w:ascii="Wingdings" w:hAnsi="Wingdings" w:cs="Wingdings" w:hint="default"/>
@@ -2375,12 +2439,12 @@
       <w:start w:val="1"/>
       <w:numFmt w:val="bullet"/>
       <w:lvlText w:val=""/>
-      <w:lvlJc w:val="start"/>
+      <w:lvlJc w:val="left"/>
       <w:pPr>
         <w:tabs>
           <w:tab w:val="num" w:pos="0"/>
         </w:tabs>
-        <w:ind w:start="5040" w:hanging="360"/>
+        <w:ind w:left="5040" w:hanging="360"/>
       </w:pPr>
       <w:rPr>
         <w:rFonts w:ascii="Symbol" w:hAnsi="Symbol" w:cs="Symbol" w:hint="default"/>
@@ -2390,12 +2454,12 @@
       <w:start w:val="1"/>
       <w:numFmt w:val="bullet"/>
       <w:lvlText w:val="o"/>
-      <w:lvlJc w:val="start"/>
+      <w:lvlJc w:val="left"/>
       <w:pPr>
         <w:tabs>
           <w:tab w:val="num" w:pos="0"/>
         </w:tabs>
-        <w:ind w:start="5760" w:hanging="360"/>
+        <w:ind w:left="5760" w:hanging="360"/>
       </w:pPr>
       <w:rPr>
         <w:rFonts w:ascii="Courier New" w:hAnsi="Courier New" w:cs="Courier New" w:hint="default"/>
@@ -2405,29 +2469,32 @@
       <w:start w:val="1"/>
       <w:numFmt w:val="bullet"/>
       <w:lvlText w:val=""/>
-      <w:lvlJc w:val="start"/>
+      <w:lvlJc w:val="left"/>
       <w:pPr>
         <w:tabs>
           <w:tab w:val="num" w:pos="0"/>
         </w:tabs>
-        <w:ind w:start="6480" w:hanging="360"/>
+        <w:ind w:left="6480" w:hanging="360"/>
       </w:pPr>
       <w:rPr>
         <w:rFonts w:ascii="Wingdings" w:hAnsi="Wingdings" w:cs="Wingdings" w:hint="default"/>
       </w:rPr>
     </w:lvl>
   </w:abstractNum>
-  <w:abstractNum w:abstractNumId="2">
+  <w:abstractNum w:abstractNumId="2" w15:restartNumberingAfterBreak="0">
+    <w:nsid w:val="55CC2D77"/>
+    <w:multiLevelType w:val="multilevel"/>
+    <w:tmpl w:val="B3A8E9AA"/>
     <w:lvl w:ilvl="0">
       <w:start w:val="1"/>
       <w:numFmt w:val="bullet"/>
       <w:lvlText w:val=""/>
-      <w:lvlJc w:val="start"/>
+      <w:lvlJc w:val="left"/>
       <w:pPr>
         <w:tabs>
           <w:tab w:val="num" w:pos="0"/>
         </w:tabs>
-        <w:ind w:start="720" w:hanging="360"/>
+        <w:ind w:left="720" w:hanging="360"/>
       </w:pPr>
       <w:rPr>
         <w:rFonts w:ascii="Symbol" w:hAnsi="Symbol" w:cs="Symbol" w:hint="default"/>
@@ -2437,12 +2504,12 @@
       <w:start w:val="1"/>
       <w:numFmt w:val="bullet"/>
       <w:lvlText w:val="o"/>
-      <w:lvlJc w:val="start"/>
+      <w:lvlJc w:val="left"/>
       <w:pPr>
         <w:tabs>
           <w:tab w:val="num" w:pos="0"/>
         </w:tabs>
-        <w:ind w:start="1440" w:hanging="360"/>
+        <w:ind w:left="1440" w:hanging="360"/>
       </w:pPr>
       <w:rPr>
         <w:rFonts w:ascii="Courier New" w:hAnsi="Courier New" w:cs="Courier New" w:hint="default"/>
@@ -2452,12 +2519,12 @@
       <w:start w:val="1"/>
       <w:numFmt w:val="bullet"/>
       <w:lvlText w:val=""/>
-      <w:lvlJc w:val="start"/>
+      <w:lvlJc w:val="left"/>
       <w:pPr>
         <w:tabs>
           <w:tab w:val="num" w:pos="0"/>
         </w:tabs>
-        <w:ind w:start="2160" w:hanging="360"/>
+        <w:ind w:left="2160" w:hanging="360"/>
       </w:pPr>
       <w:rPr>
         <w:rFonts w:ascii="Wingdings" w:hAnsi="Wingdings" w:cs="Wingdings" w:hint="default"/>
@@ -2467,12 +2534,12 @@
       <w:start w:val="1"/>
       <w:numFmt w:val="bullet"/>
       <w:lvlText w:val=""/>
-      <w:lvlJc w:val="start"/>
+      <w:lvlJc w:val="left"/>
       <w:pPr>
         <w:tabs>
           <w:tab w:val="num" w:pos="0"/>
         </w:tabs>
-        <w:ind w:start="2880" w:hanging="360"/>
+        <w:ind w:left="2880" w:hanging="360"/>
       </w:pPr>
       <w:rPr>
         <w:rFonts w:ascii="Symbol" w:hAnsi="Symbol" w:cs="Symbol" w:hint="default"/>
@@ -2482,12 +2549,12 @@
       <w:start w:val="1"/>
       <w:numFmt w:val="bullet"/>
       <w:lvlText w:val="o"/>
-      <w:lvlJc w:val="start"/>
+      <w:lvlJc w:val="left"/>
       <w:pPr>
         <w:tabs>
           <w:tab w:val="num" w:pos="0"/>
         </w:tabs>
-        <w:ind w:start="3600" w:hanging="360"/>
+        <w:ind w:left="3600" w:hanging="360"/>
       </w:pPr>
       <w:rPr>
         <w:rFonts w:ascii="Courier New" w:hAnsi="Courier New" w:cs="Courier New" w:hint="default"/>
@@ -2497,12 +2564,12 @@
       <w:start w:val="1"/>
       <w:numFmt w:val="bullet"/>
       <w:lvlText w:val=""/>
-      <w:lvlJc w:val="start"/>
+      <w:lvlJc w:val="left"/>
       <w:pPr>
         <w:tabs>
           <w:tab w:val="num" w:pos="0"/>
         </w:tabs>
-        <w:ind w:start="4320" w:hanging="360"/>
+        <w:ind w:left="4320" w:hanging="360"/>
       </w:pPr>
       <w:rPr>
         <w:rFonts w:ascii="Wingdings" w:hAnsi="Wingdings" w:cs="Wingdings" w:hint="default"/>
@@ -2512,12 +2579,12 @@
       <w:start w:val="1"/>
       <w:numFmt w:val="bullet"/>
       <w:lvlText w:val=""/>
-      <w:lvlJc w:val="start"/>
+      <w:lvlJc w:val="left"/>
       <w:pPr>
         <w:tabs>
           <w:tab w:val="num" w:pos="0"/>
         </w:tabs>
-        <w:ind w:start="5040" w:hanging="360"/>
+        <w:ind w:left="5040" w:hanging="360"/>
       </w:pPr>
       <w:rPr>
         <w:rFonts w:ascii="Symbol" w:hAnsi="Symbol" w:cs="Symbol" w:hint="default"/>
@@ -2527,12 +2594,12 @@
       <w:start w:val="1"/>
       <w:numFmt w:val="bullet"/>
       <w:lvlText w:val="o"/>
-      <w:lvlJc w:val="start"/>
+      <w:lvlJc w:val="left"/>
       <w:pPr>
         <w:tabs>
           <w:tab w:val="num" w:pos="0"/>
         </w:tabs>
-        <w:ind w:start="5760" w:hanging="360"/>
+        <w:ind w:left="5760" w:hanging="360"/>
       </w:pPr>
       <w:rPr>
         <w:rFonts w:ascii="Courier New" w:hAnsi="Courier New" w:cs="Courier New" w:hint="default"/>
@@ -2542,155 +2609,36 @@
       <w:start w:val="1"/>
       <w:numFmt w:val="bullet"/>
       <w:lvlText w:val=""/>
-      <w:lvlJc w:val="start"/>
+      <w:lvlJc w:val="left"/>
       <w:pPr>
         <w:tabs>
           <w:tab w:val="num" w:pos="0"/>
         </w:tabs>
-        <w:ind w:start="6480" w:hanging="360"/>
+        <w:ind w:left="6480" w:hanging="360"/>
       </w:pPr>
       <w:rPr>
         <w:rFonts w:ascii="Wingdings" w:hAnsi="Wingdings" w:cs="Wingdings" w:hint="default"/>
       </w:rPr>
     </w:lvl>
   </w:abstractNum>
-  <w:abstractNum w:abstractNumId="3">
-    <w:lvl w:ilvl="0">
-      <w:start w:val="1"/>
-      <w:numFmt w:val="none"/>
-      <w:suff w:val="nothing"/>
-      <w:lvlText w:val=""/>
-      <w:lvlJc w:val="start"/>
-      <w:pPr>
-        <w:tabs>
-          <w:tab w:val="num" w:pos="0"/>
-        </w:tabs>
-        <w:ind w:start="0" w:hanging="0"/>
-      </w:pPr>
-    </w:lvl>
-    <w:lvl w:ilvl="1">
-      <w:start w:val="1"/>
-      <w:numFmt w:val="none"/>
-      <w:suff w:val="nothing"/>
-      <w:lvlText w:val=""/>
-      <w:lvlJc w:val="start"/>
-      <w:pPr>
-        <w:tabs>
-          <w:tab w:val="num" w:pos="0"/>
-        </w:tabs>
-        <w:ind w:start="0" w:hanging="0"/>
-      </w:pPr>
-    </w:lvl>
-    <w:lvl w:ilvl="2">
-      <w:start w:val="1"/>
-      <w:numFmt w:val="none"/>
-      <w:suff w:val="nothing"/>
-      <w:lvlText w:val=""/>
-      <w:lvlJc w:val="start"/>
-      <w:pPr>
-        <w:tabs>
-          <w:tab w:val="num" w:pos="0"/>
-        </w:tabs>
-        <w:ind w:start="0" w:hanging="0"/>
-      </w:pPr>
-    </w:lvl>
-    <w:lvl w:ilvl="3">
-      <w:start w:val="1"/>
-      <w:numFmt w:val="none"/>
-      <w:suff w:val="nothing"/>
-      <w:lvlText w:val=""/>
-      <w:lvlJc w:val="start"/>
-      <w:pPr>
-        <w:tabs>
-          <w:tab w:val="num" w:pos="0"/>
-        </w:tabs>
-        <w:ind w:start="0" w:hanging="0"/>
-      </w:pPr>
-    </w:lvl>
-    <w:lvl w:ilvl="4">
-      <w:start w:val="1"/>
-      <w:numFmt w:val="none"/>
-      <w:suff w:val="nothing"/>
-      <w:lvlText w:val=""/>
-      <w:lvlJc w:val="start"/>
-      <w:pPr>
-        <w:tabs>
-          <w:tab w:val="num" w:pos="0"/>
-        </w:tabs>
-        <w:ind w:start="0" w:hanging="0"/>
-      </w:pPr>
-    </w:lvl>
-    <w:lvl w:ilvl="5">
-      <w:start w:val="1"/>
-      <w:numFmt w:val="none"/>
-      <w:suff w:val="nothing"/>
-      <w:lvlText w:val=""/>
-      <w:lvlJc w:val="start"/>
-      <w:pPr>
-        <w:tabs>
-          <w:tab w:val="num" w:pos="0"/>
-        </w:tabs>
-        <w:ind w:start="0" w:hanging="0"/>
-      </w:pPr>
-    </w:lvl>
-    <w:lvl w:ilvl="6">
-      <w:start w:val="1"/>
-      <w:numFmt w:val="none"/>
-      <w:suff w:val="nothing"/>
-      <w:lvlText w:val=""/>
-      <w:lvlJc w:val="start"/>
-      <w:pPr>
-        <w:tabs>
-          <w:tab w:val="num" w:pos="0"/>
-        </w:tabs>
-        <w:ind w:start="0" w:hanging="0"/>
-      </w:pPr>
-    </w:lvl>
-    <w:lvl w:ilvl="7">
-      <w:start w:val="1"/>
-      <w:numFmt w:val="none"/>
-      <w:suff w:val="nothing"/>
-      <w:lvlText w:val=""/>
-      <w:lvlJc w:val="start"/>
-      <w:pPr>
-        <w:tabs>
-          <w:tab w:val="num" w:pos="0"/>
-        </w:tabs>
-        <w:ind w:start="0" w:hanging="0"/>
-      </w:pPr>
-    </w:lvl>
-    <w:lvl w:ilvl="8">
-      <w:start w:val="1"/>
-      <w:numFmt w:val="none"/>
-      <w:suff w:val="nothing"/>
-      <w:lvlText w:val=""/>
-      <w:lvlJc w:val="start"/>
-      <w:pPr>
-        <w:tabs>
-          <w:tab w:val="num" w:pos="0"/>
-        </w:tabs>
-        <w:ind w:start="0" w:hanging="0"/>
-      </w:pPr>
-    </w:lvl>
-  </w:abstractNum>
-  <w:num w:numId="1">
+  <w:num w:numId="1" w16cid:durableId="1325401579">
+    <w:abstractNumId w:val="2"/>
+  </w:num>
+  <w:num w:numId="2" w16cid:durableId="1859587705">
     <w:abstractNumId w:val="1"/>
   </w:num>
-  <w:num w:numId="2">
-    <w:abstractNumId w:val="2"/>
-  </w:num>
-  <w:num w:numId="3">
-    <w:abstractNumId w:val="3"/>
+  <w:num w:numId="3" w16cid:durableId="1193108645">
+    <w:abstractNumId w:val="0"/>
   </w:num>
 </w:numbering>
 </file>
 
 <file path=word/styles.xml><?xml version="1.0" encoding="utf-8"?>
-<w:styles xmlns:w="http://schemas.openxmlformats.org/wordprocessingml/2006/main" xmlns:w14="http://schemas.microsoft.com/office/word/2010/wordml" xmlns:mc="http://schemas.openxmlformats.org/markup-compatibility/2006" mc:Ignorable="w14">
+<w:styles xmlns:mc="http://schemas.openxmlformats.org/markup-compatibility/2006" xmlns:r="http://schemas.openxmlformats.org/officeDocument/2006/relationships" xmlns:w="http://schemas.openxmlformats.org/wordprocessingml/2006/main" xmlns:w14="http://schemas.microsoft.com/office/word/2010/wordml" xmlns:w15="http://schemas.microsoft.com/office/word/2012/wordml" xmlns:w16cex="http://schemas.microsoft.com/office/word/2018/wordml/cex" xmlns:w16cid="http://schemas.microsoft.com/office/word/2016/wordml/cid" xmlns:w16="http://schemas.microsoft.com/office/word/2018/wordml" xmlns:w16du="http://schemas.microsoft.com/office/word/2023/wordml/word16du" xmlns:w16sdtdh="http://schemas.microsoft.com/office/word/2020/wordml/sdtdatahash" xmlns:w16sdtfl="http://schemas.microsoft.com/office/word/2024/wordml/sdtformatlock" xmlns:w16se="http://schemas.microsoft.com/office/word/2015/wordml/symex" mc:Ignorable="w14 w15 w16se w16cid w16 w16cex w16sdtdh w16sdtfl w16du">
   <w:docDefaults>
     <w:rPrDefault>
       <w:rPr>
-        <w:rFonts w:ascii="Arial" w:hAnsi="Arial" w:eastAsia="Arial" w:cs="Arial"/>
+        <w:rFonts w:ascii="Arial" w:eastAsia="Arial" w:hAnsi="Arial" w:cs="Arial"/>
         <w:sz w:val="22"/>
         <w:szCs w:val="22"/>
         <w:lang w:val="es-ES" w:eastAsia="es-AR" w:bidi="ar-SA"/>
@@ -2698,21 +2646,21 @@
     </w:rPrDefault>
     <w:pPrDefault>
       <w:pPr>
-        <w:suppressAutoHyphens w:val="true"/>
+        <w:suppressAutoHyphens/>
       </w:pPr>
     </w:pPrDefault>
   </w:docDefaults>
-  <w:latentStyles w:defLockedState="0" w:defUIPriority="99" w:defSemiHidden="0" w:defUnhideWhenUsed="0" w:defQFormat="0" w:count="371">
+  <w:latentStyles w:defLockedState="0" w:defUIPriority="99" w:defSemiHidden="0" w:defUnhideWhenUsed="0" w:defQFormat="0" w:count="376">
     <w:lsdException w:name="Normal" w:uiPriority="0" w:qFormat="1"/>
     <w:lsdException w:name="heading 1" w:uiPriority="9" w:qFormat="1"/>
-    <w:lsdException w:name="heading 2" w:uiPriority="9" w:semiHidden="1" w:unhideWhenUsed="1" w:qFormat="1"/>
-    <w:lsdException w:name="heading 3" w:uiPriority="9" w:semiHidden="1" w:unhideWhenUsed="1" w:qFormat="1"/>
-    <w:lsdException w:name="heading 4" w:uiPriority="9" w:semiHidden="1" w:unhideWhenUsed="1" w:qFormat="1"/>
-    <w:lsdException w:name="heading 5" w:uiPriority="9" w:semiHidden="1" w:unhideWhenUsed="1" w:qFormat="1"/>
-    <w:lsdException w:name="heading 6" w:uiPriority="9" w:semiHidden="1" w:unhideWhenUsed="1" w:qFormat="1"/>
-    <w:lsdException w:name="heading 7" w:uiPriority="9" w:semiHidden="1" w:unhideWhenUsed="1" w:qFormat="1"/>
-    <w:lsdException w:name="heading 8" w:uiPriority="9" w:semiHidden="1" w:unhideWhenUsed="1" w:qFormat="1"/>
-    <w:lsdException w:name="heading 9" w:uiPriority="9" w:semiHidden="1" w:unhideWhenUsed="1" w:qFormat="1"/>
+    <w:lsdException w:name="heading 2" w:semiHidden="1" w:uiPriority="9" w:unhideWhenUsed="1" w:qFormat="1"/>
+    <w:lsdException w:name="heading 3" w:semiHidden="1" w:uiPriority="9" w:unhideWhenUsed="1" w:qFormat="1"/>
+    <w:lsdException w:name="heading 4" w:semiHidden="1" w:uiPriority="9" w:unhideWhenUsed="1" w:qFormat="1"/>
+    <w:lsdException w:name="heading 5" w:semiHidden="1" w:uiPriority="9" w:unhideWhenUsed="1" w:qFormat="1"/>
+    <w:lsdException w:name="heading 6" w:semiHidden="1" w:uiPriority="9" w:unhideWhenUsed="1" w:qFormat="1"/>
+    <w:lsdException w:name="heading 7" w:semiHidden="1" w:uiPriority="9" w:unhideWhenUsed="1" w:qFormat="1"/>
+    <w:lsdException w:name="heading 8" w:semiHidden="1" w:uiPriority="9" w:unhideWhenUsed="1" w:qFormat="1"/>
+    <w:lsdException w:name="heading 9" w:semiHidden="1" w:uiPriority="9" w:unhideWhenUsed="1" w:qFormat="1"/>
     <w:lsdException w:name="index 1" w:semiHidden="1" w:unhideWhenUsed="1"/>
     <w:lsdException w:name="index 2" w:semiHidden="1" w:unhideWhenUsed="1"/>
     <w:lsdException w:name="index 3" w:semiHidden="1" w:unhideWhenUsed="1"/>
@@ -2722,22 +2670,22 @@
     <w:lsdException w:name="index 7" w:semiHidden="1" w:unhideWhenUsed="1"/>
     <w:lsdException w:name="index 8" w:semiHidden="1" w:unhideWhenUsed="1"/>
     <w:lsdException w:name="index 9" w:semiHidden="1" w:unhideWhenUsed="1"/>
-    <w:lsdException w:name="toc 1" w:uiPriority="39" w:semiHidden="1" w:unhideWhenUsed="1"/>
-    <w:lsdException w:name="toc 2" w:uiPriority="39" w:semiHidden="1" w:unhideWhenUsed="1"/>
-    <w:lsdException w:name="toc 3" w:uiPriority="39" w:semiHidden="1" w:unhideWhenUsed="1"/>
-    <w:lsdException w:name="toc 4" w:uiPriority="39" w:semiHidden="1" w:unhideWhenUsed="1"/>
-    <w:lsdException w:name="toc 5" w:uiPriority="39" w:semiHidden="1" w:unhideWhenUsed="1"/>
-    <w:lsdException w:name="toc 6" w:uiPriority="39" w:semiHidden="1" w:unhideWhenUsed="1"/>
-    <w:lsdException w:name="toc 7" w:uiPriority="39" w:semiHidden="1" w:unhideWhenUsed="1"/>
-    <w:lsdException w:name="toc 8" w:uiPriority="39" w:semiHidden="1" w:unhideWhenUsed="1"/>
-    <w:lsdException w:name="toc 9" w:uiPriority="39" w:semiHidden="1" w:unhideWhenUsed="1"/>
+    <w:lsdException w:name="toc 1" w:semiHidden="1" w:uiPriority="39" w:unhideWhenUsed="1"/>
+    <w:lsdException w:name="toc 2" w:semiHidden="1" w:uiPriority="39" w:unhideWhenUsed="1"/>
+    <w:lsdException w:name="toc 3" w:semiHidden="1" w:uiPriority="39" w:unhideWhenUsed="1"/>
+    <w:lsdException w:name="toc 4" w:semiHidden="1" w:uiPriority="39" w:unhideWhenUsed="1"/>
+    <w:lsdException w:name="toc 5" w:semiHidden="1" w:uiPriority="39" w:unhideWhenUsed="1"/>
+    <w:lsdException w:name="toc 6" w:semiHidden="1" w:uiPriority="39" w:unhideWhenUsed="1"/>
+    <w:lsdException w:name="toc 7" w:semiHidden="1" w:uiPriority="39" w:unhideWhenUsed="1"/>
+    <w:lsdException w:name="toc 8" w:semiHidden="1" w:uiPriority="39" w:unhideWhenUsed="1"/>
+    <w:lsdException w:name="toc 9" w:semiHidden="1" w:uiPriority="39" w:unhideWhenUsed="1"/>
     <w:lsdException w:name="Normal Indent" w:semiHidden="1" w:unhideWhenUsed="1"/>
     <w:lsdException w:name="footnote text" w:semiHidden="1" w:unhideWhenUsed="1"/>
     <w:lsdException w:name="annotation text" w:semiHidden="1" w:unhideWhenUsed="1"/>
     <w:lsdException w:name="header" w:semiHidden="1" w:unhideWhenUsed="1"/>
     <w:lsdException w:name="footer" w:semiHidden="1" w:unhideWhenUsed="1"/>
     <w:lsdException w:name="index heading" w:semiHidden="1" w:unhideWhenUsed="1"/>
-    <w:lsdException w:name="caption" w:uiPriority="35" w:semiHidden="1" w:unhideWhenUsed="1" w:qFormat="1"/>
+    <w:lsdException w:name="caption" w:semiHidden="1" w:uiPriority="35" w:unhideWhenUsed="1" w:qFormat="1"/>
     <w:lsdException w:name="table of figures" w:semiHidden="1" w:unhideWhenUsed="1"/>
     <w:lsdException w:name="envelope address" w:semiHidden="1" w:unhideWhenUsed="1"/>
     <w:lsdException w:name="envelope return" w:semiHidden="1" w:unhideWhenUsed="1"/>
@@ -2768,7 +2716,7 @@
     <w:lsdException w:name="Title" w:uiPriority="10" w:qFormat="1"/>
     <w:lsdException w:name="Closing" w:semiHidden="1" w:unhideWhenUsed="1"/>
     <w:lsdException w:name="Signature" w:semiHidden="1" w:unhideWhenUsed="1"/>
-    <w:lsdException w:name="Default Paragraph Font" w:uiPriority="1" w:semiHidden="1" w:unhideWhenUsed="1"/>
+    <w:lsdException w:name="Default Paragraph Font" w:semiHidden="1" w:uiPriority="1" w:unhideWhenUsed="1"/>
     <w:lsdException w:name="Body Text" w:semiHidden="1" w:unhideWhenUsed="1"/>
     <w:lsdException w:name="Body Text Indent" w:semiHidden="1" w:unhideWhenUsed="1"/>
     <w:lsdException w:name="List Continue" w:semiHidden="1" w:unhideWhenUsed="1"/>
@@ -2968,8 +2916,8 @@
     <w:lsdException w:name="Subtle Reference" w:uiPriority="31" w:qFormat="1"/>
     <w:lsdException w:name="Intense Reference" w:uiPriority="32" w:qFormat="1"/>
     <w:lsdException w:name="Book Title" w:uiPriority="33" w:qFormat="1"/>
-    <w:lsdException w:name="Bibliography" w:uiPriority="37" w:semiHidden="1" w:unhideWhenUsed="1"/>
-    <w:lsdException w:name="TOC Heading" w:uiPriority="39" w:semiHidden="1" w:unhideWhenUsed="1" w:qFormat="1"/>
+    <w:lsdException w:name="Bibliography" w:semiHidden="1" w:uiPriority="37" w:unhideWhenUsed="1"/>
+    <w:lsdException w:name="TOC Heading" w:semiHidden="1" w:uiPriority="39" w:unhideWhenUsed="1" w:qFormat="1"/>
     <w:lsdException w:name="Plain Table 1" w:uiPriority="41"/>
     <w:lsdException w:name="Plain Table 2" w:uiPriority="42"/>
     <w:lsdException w:name="Plain Table 3" w:uiPriority="43"/>
@@ -3074,33 +3022,27 @@
     <w:lsdException w:name="List Table 5 Dark Accent 6" w:uiPriority="50"/>
     <w:lsdException w:name="List Table 6 Colorful Accent 6" w:uiPriority="51"/>
     <w:lsdException w:name="List Table 7 Colorful Accent 6" w:uiPriority="52"/>
+    <w:lsdException w:name="Mention" w:semiHidden="1" w:unhideWhenUsed="1"/>
+    <w:lsdException w:name="Smart Hyperlink" w:semiHidden="1" w:unhideWhenUsed="1"/>
+    <w:lsdException w:name="Hashtag" w:semiHidden="1" w:unhideWhenUsed="1"/>
+    <w:lsdException w:name="Unresolved Mention" w:semiHidden="1" w:unhideWhenUsed="1"/>
+    <w:lsdException w:name="Smart Link" w:semiHidden="1" w:unhideWhenUsed="1"/>
   </w:latentStyles>
-  <w:style w:type="paragraph" w:styleId="Normal" w:default="1">
+  <w:style w:type="paragraph" w:default="1" w:styleId="Normal">
     <w:name w:val="Normal"/>
     <w:qFormat/>
     <w:pPr>
-      <w:widowControl/>
-      <w:bidi w:val="0"/>
-      <w:spacing w:lineRule="auto" w:line="276" w:before="0" w:after="0"/>
-      <w:jc w:val="start"/>
+      <w:spacing w:line="276" w:lineRule="auto"/>
     </w:pPr>
-    <w:rPr>
-      <w:rFonts w:ascii="Arial" w:hAnsi="Arial" w:eastAsia="Arial" w:cs="Arial"/>
-      <w:color w:val="auto"/>
-      <w:kern w:val="0"/>
-      <w:sz w:val="22"/>
-      <w:szCs w:val="22"/>
-      <w:lang w:val="es-ES" w:eastAsia="es-AR" w:bidi="ar-SA"/>
-    </w:rPr>
   </w:style>
-  <w:style w:type="paragraph" w:styleId="Heading1">
+  <w:style w:type="paragraph" w:styleId="Ttulo1">
     <w:name w:val="heading 1"/>
     <w:basedOn w:val="Normal"/>
     <w:next w:val="Normal"/>
     <w:uiPriority w:val="9"/>
     <w:qFormat/>
     <w:pPr>
-      <w:keepNext w:val="true"/>
+      <w:keepNext/>
       <w:keepLines/>
       <w:spacing w:before="400" w:after="120"/>
       <w:outlineLvl w:val="0"/>
@@ -3110,7 +3052,7 @@
       <w:szCs w:val="40"/>
     </w:rPr>
   </w:style>
-  <w:style w:type="paragraph" w:styleId="Heading2">
+  <w:style w:type="paragraph" w:styleId="Ttulo2">
     <w:name w:val="heading 2"/>
     <w:basedOn w:val="Normal"/>
     <w:next w:val="Normal"/>
@@ -3118,7 +3060,7 @@
     <w:unhideWhenUsed/>
     <w:qFormat/>
     <w:pPr>
-      <w:keepNext w:val="true"/>
+      <w:keepNext/>
       <w:keepLines/>
       <w:spacing w:before="360" w:after="120"/>
       <w:outlineLvl w:val="1"/>
@@ -3128,7 +3070,7 @@
       <w:szCs w:val="32"/>
     </w:rPr>
   </w:style>
-  <w:style w:type="paragraph" w:styleId="Heading3">
+  <w:style w:type="paragraph" w:styleId="Ttulo3">
     <w:name w:val="heading 3"/>
     <w:basedOn w:val="Normal"/>
     <w:next w:val="Normal"/>
@@ -3136,7 +3078,7 @@
     <w:unhideWhenUsed/>
     <w:qFormat/>
     <w:pPr>
-      <w:keepNext w:val="true"/>
+      <w:keepNext/>
       <w:keepLines/>
       <w:spacing w:before="320" w:after="80"/>
       <w:outlineLvl w:val="2"/>
@@ -3147,7 +3089,7 @@
       <w:szCs w:val="28"/>
     </w:rPr>
   </w:style>
-  <w:style w:type="paragraph" w:styleId="Heading4">
+  <w:style w:type="paragraph" w:styleId="Ttulo4">
     <w:name w:val="heading 4"/>
     <w:basedOn w:val="Normal"/>
     <w:next w:val="Normal"/>
@@ -3155,7 +3097,7 @@
     <w:unhideWhenUsed/>
     <w:qFormat/>
     <w:pPr>
-      <w:keepNext w:val="true"/>
+      <w:keepNext/>
       <w:keepLines/>
       <w:spacing w:before="280" w:after="80"/>
       <w:outlineLvl w:val="3"/>
@@ -3166,7 +3108,7 @@
       <w:szCs w:val="24"/>
     </w:rPr>
   </w:style>
-  <w:style w:type="paragraph" w:styleId="Heading5">
+  <w:style w:type="paragraph" w:styleId="Ttulo5">
     <w:name w:val="heading 5"/>
     <w:basedOn w:val="Normal"/>
     <w:next w:val="Normal"/>
@@ -3175,7 +3117,7 @@
     <w:unhideWhenUsed/>
     <w:qFormat/>
     <w:pPr>
-      <w:keepNext w:val="true"/>
+      <w:keepNext/>
       <w:keepLines/>
       <w:spacing w:before="240" w:after="80"/>
       <w:outlineLvl w:val="4"/>
@@ -3184,7 +3126,7 @@
       <w:color w:val="666666"/>
     </w:rPr>
   </w:style>
-  <w:style w:type="paragraph" w:styleId="Heading6">
+  <w:style w:type="paragraph" w:styleId="Ttulo6">
     <w:name w:val="heading 6"/>
     <w:basedOn w:val="Normal"/>
     <w:next w:val="Normal"/>
@@ -3193,7 +3135,7 @@
     <w:unhideWhenUsed/>
     <w:qFormat/>
     <w:pPr>
-      <w:keepNext w:val="true"/>
+      <w:keepNext/>
       <w:keepLines/>
       <w:spacing w:before="240" w:after="80"/>
       <w:outlineLvl w:val="5"/>
@@ -3204,99 +3146,114 @@
       <w:color w:val="666666"/>
     </w:rPr>
   </w:style>
-  <w:style w:type="character" w:styleId="DefaultParagraphFont" w:default="1">
+  <w:style w:type="character" w:default="1" w:styleId="Fuentedeprrafopredeter">
     <w:name w:val="Default Paragraph Font"/>
     <w:uiPriority w:val="1"/>
     <w:semiHidden/>
     <w:unhideWhenUsed/>
-    <w:rPr/>
   </w:style>
-  <w:style w:type="character" w:styleId="Hyperlink">
+  <w:style w:type="table" w:default="1" w:styleId="Tablanormal">
+    <w:name w:val="Normal Table"/>
+    <w:uiPriority w:val="99"/>
+    <w:semiHidden/>
+    <w:unhideWhenUsed/>
+    <w:tblPr>
+      <w:tblInd w:w="0" w:type="dxa"/>
+      <w:tblCellMar>
+        <w:top w:w="0" w:type="dxa"/>
+        <w:left w:w="108" w:type="dxa"/>
+        <w:bottom w:w="0" w:type="dxa"/>
+        <w:right w:w="108" w:type="dxa"/>
+      </w:tblCellMar>
+    </w:tblPr>
+  </w:style>
+  <w:style w:type="numbering" w:default="1" w:styleId="Sinlista">
+    <w:name w:val="No List"/>
+    <w:uiPriority w:val="99"/>
+    <w:semiHidden/>
+    <w:unhideWhenUsed/>
+  </w:style>
+  <w:style w:type="character" w:styleId="Hipervnculo">
     <w:name w:val="Hyperlink"/>
-    <w:basedOn w:val="DefaultParagraphFont"/>
+    <w:basedOn w:val="Fuentedeprrafopredeter"/>
     <w:uiPriority w:val="99"/>
     <w:unhideWhenUsed/>
-    <w:rsid w:val="00f62768"/>
+    <w:rsid w:val="00F62768"/>
     <w:rPr>
-      <w:color w:themeColor="hyperlink" w:val="0000FF"/>
+      <w:color w:val="0000FF" w:themeColor="hyperlink"/>
       <w:u w:val="single"/>
     </w:rPr>
   </w:style>
-  <w:style w:type="character" w:styleId="Mencinsinresolver1" w:customStyle="1">
+  <w:style w:type="character" w:customStyle="1" w:styleId="Mencinsinresolver1">
     <w:name w:val="Mención sin resolver1"/>
-    <w:basedOn w:val="DefaultParagraphFont"/>
+    <w:basedOn w:val="Fuentedeprrafopredeter"/>
     <w:uiPriority w:val="99"/>
     <w:semiHidden/>
     <w:unhideWhenUsed/>
-    <w:rsid w:val="00f62768"/>
+    <w:rsid w:val="00F62768"/>
     <w:rPr>
       <w:color w:val="605E5C"/>
-      <w:shd w:fill="E1DFDD" w:val="clear"/>
+      <w:shd w:val="clear" w:color="auto" w:fill="E1DFDD"/>
     </w:rPr>
   </w:style>
-  <w:style w:type="character" w:styleId="FollowedHyperlink">
+  <w:style w:type="character" w:styleId="Hipervnculovisitado">
     <w:name w:val="FollowedHyperlink"/>
-    <w:basedOn w:val="DefaultParagraphFont"/>
+    <w:basedOn w:val="Fuentedeprrafopredeter"/>
     <w:uiPriority w:val="99"/>
     <w:semiHidden/>
     <w:unhideWhenUsed/>
-    <w:rsid w:val="00f62768"/>
+    <w:rsid w:val="00F62768"/>
     <w:rPr>
-      <w:color w:themeColor="followedHyperlink" w:val="800080"/>
+      <w:color w:val="800080" w:themeColor="followedHyperlink"/>
       <w:u w:val="single"/>
     </w:rPr>
   </w:style>
-  <w:style w:type="character" w:styleId="EncabezadoCar" w:customStyle="1">
+  <w:style w:type="character" w:customStyle="1" w:styleId="EncabezadoCar">
     <w:name w:val="Encabezado Car"/>
-    <w:basedOn w:val="DefaultParagraphFont"/>
-    <w:link w:val="Header"/>
+    <w:basedOn w:val="Fuentedeprrafopredeter"/>
+    <w:link w:val="Encabezado"/>
     <w:uiPriority w:val="99"/>
-    <w:rsid w:val="004b52d1"/>
-    <w:rPr/>
+    <w:rsid w:val="004B52D1"/>
   </w:style>
-  <w:style w:type="character" w:styleId="PiedepginaCar" w:customStyle="1">
+  <w:style w:type="character" w:customStyle="1" w:styleId="PiedepginaCar">
     <w:name w:val="Pie de página Car"/>
-    <w:basedOn w:val="DefaultParagraphFont"/>
-    <w:link w:val="Footer"/>
+    <w:basedOn w:val="Fuentedeprrafopredeter"/>
+    <w:link w:val="Piedepgina"/>
     <w:uiPriority w:val="99"/>
-    <w:rsid w:val="004b52d1"/>
-    <w:rPr/>
+    <w:rsid w:val="004B52D1"/>
   </w:style>
-  <w:style w:type="character" w:styleId="IndexLink">
+  <w:style w:type="character" w:customStyle="1" w:styleId="IndexLink">
     <w:name w:val="Index Link"/>
-    <w:rPr/>
   </w:style>
-  <w:style w:type="paragraph" w:styleId="Heading">
+  <w:style w:type="paragraph" w:customStyle="1" w:styleId="Heading">
     <w:name w:val="Heading"/>
     <w:basedOn w:val="Normal"/>
-    <w:next w:val="BodyText"/>
+    <w:next w:val="Textoindependiente"/>
     <w:pPr>
-      <w:keepNext w:val="true"/>
+      <w:keepNext/>
       <w:spacing w:before="240" w:after="120"/>
     </w:pPr>
     <w:rPr>
-      <w:rFonts w:ascii="Liberation Sans" w:hAnsi="Liberation Sans" w:eastAsia="Noto Sans" w:cs="Noto Sans Devanagari"/>
+      <w:rFonts w:ascii="Liberation Sans" w:eastAsia="Noto Sans" w:hAnsi="Liberation Sans" w:cs="Noto Sans Devanagari"/>
       <w:sz w:val="28"/>
       <w:szCs w:val="28"/>
     </w:rPr>
   </w:style>
-  <w:style w:type="paragraph" w:styleId="BodyText">
+  <w:style w:type="paragraph" w:styleId="Textoindependiente">
     <w:name w:val="Body Text"/>
     <w:basedOn w:val="Normal"/>
     <w:pPr>
-      <w:spacing w:lineRule="auto" w:line="276" w:before="0" w:after="140"/>
+      <w:spacing w:after="140"/>
     </w:pPr>
-    <w:rPr/>
   </w:style>
-  <w:style w:type="paragraph" w:styleId="List">
+  <w:style w:type="paragraph" w:styleId="Lista">
     <w:name w:val="List"/>
-    <w:basedOn w:val="BodyText"/>
-    <w:pPr/>
+    <w:basedOn w:val="Textoindependiente"/>
     <w:rPr>
       <w:rFonts w:cs="Noto Sans Devanagari"/>
     </w:rPr>
   </w:style>
-  <w:style w:type="paragraph" w:styleId="Caption">
+  <w:style w:type="paragraph" w:styleId="Descripcin">
     <w:name w:val="caption"/>
     <w:basedOn w:val="Normal"/>
     <w:pPr>
@@ -3311,7 +3268,7 @@
       <w:szCs w:val="24"/>
     </w:rPr>
   </w:style>
-  <w:style w:type="paragraph" w:styleId="Index">
+  <w:style w:type="paragraph" w:customStyle="1" w:styleId="Index">
     <w:name w:val="Index"/>
     <w:basedOn w:val="Normal"/>
     <w:pPr>
@@ -3321,32 +3278,32 @@
       <w:rFonts w:cs="Noto Sans Devanagari"/>
     </w:rPr>
   </w:style>
-  <w:style w:type="paragraph" w:styleId="Title">
+  <w:style w:type="paragraph" w:styleId="Ttulo">
     <w:name w:val="Title"/>
     <w:basedOn w:val="Normal"/>
     <w:next w:val="Normal"/>
     <w:uiPriority w:val="10"/>
     <w:qFormat/>
     <w:pPr>
-      <w:keepNext w:val="true"/>
+      <w:keepNext/>
       <w:keepLines/>
-      <w:spacing w:before="0" w:after="60"/>
+      <w:spacing w:after="60"/>
     </w:pPr>
     <w:rPr>
       <w:sz w:val="52"/>
       <w:szCs w:val="52"/>
     </w:rPr>
   </w:style>
-  <w:style w:type="paragraph" w:styleId="Subtitle">
+  <w:style w:type="paragraph" w:styleId="Subttulo">
     <w:name w:val="Subtitle"/>
     <w:basedOn w:val="Normal"/>
     <w:next w:val="Normal"/>
     <w:uiPriority w:val="11"/>
     <w:qFormat/>
     <w:pPr>
-      <w:keepNext w:val="true"/>
+      <w:keepNext/>
       <w:keepLines/>
-      <w:spacing w:before="0" w:after="320"/>
+      <w:spacing w:after="320"/>
     </w:pPr>
     <w:rPr>
       <w:color w:val="666666"/>
@@ -3354,151 +3311,116 @@
       <w:szCs w:val="30"/>
     </w:rPr>
   </w:style>
-  <w:style w:type="paragraph" w:styleId="HeaderandFooter">
+  <w:style w:type="paragraph" w:customStyle="1" w:styleId="HeaderandFooter">
     <w:name w:val="Header and Footer"/>
     <w:basedOn w:val="Normal"/>
-    <w:pPr/>
-    <w:rPr/>
   </w:style>
-  <w:style w:type="paragraph" w:styleId="Header">
+  <w:style w:type="paragraph" w:styleId="Encabezado">
     <w:name w:val="header"/>
     <w:basedOn w:val="Normal"/>
     <w:link w:val="EncabezadoCar"/>
     <w:uiPriority w:val="99"/>
     <w:unhideWhenUsed/>
-    <w:rsid w:val="004b52d1"/>
+    <w:rsid w:val="004B52D1"/>
     <w:pPr>
       <w:tabs>
-        <w:tab w:val="clear" w:pos="720"/>
-        <w:tab w:val="center" w:pos="4252" w:leader="none"/>
-        <w:tab w:val="right" w:pos="8504" w:leader="none"/>
+        <w:tab w:val="center" w:pos="4252"/>
+        <w:tab w:val="right" w:pos="8504"/>
       </w:tabs>
-      <w:spacing w:lineRule="auto" w:line="240"/>
+      <w:spacing w:line="240" w:lineRule="auto"/>
     </w:pPr>
-    <w:rPr/>
   </w:style>
-  <w:style w:type="paragraph" w:styleId="Footer">
+  <w:style w:type="paragraph" w:styleId="Piedepgina">
     <w:name w:val="footer"/>
     <w:basedOn w:val="Normal"/>
     <w:link w:val="PiedepginaCar"/>
     <w:uiPriority w:val="99"/>
     <w:unhideWhenUsed/>
-    <w:rsid w:val="004b52d1"/>
+    <w:rsid w:val="004B52D1"/>
     <w:pPr>
       <w:tabs>
-        <w:tab w:val="clear" w:pos="720"/>
-        <w:tab w:val="center" w:pos="4252" w:leader="none"/>
-        <w:tab w:val="right" w:pos="8504" w:leader="none"/>
+        <w:tab w:val="center" w:pos="4252"/>
+        <w:tab w:val="right" w:pos="8504"/>
       </w:tabs>
-      <w:spacing w:lineRule="auto" w:line="240"/>
+      <w:spacing w:line="240" w:lineRule="auto"/>
     </w:pPr>
-    <w:rPr/>
   </w:style>
-  <w:style w:type="paragraph" w:styleId="IndexHeading">
+  <w:style w:type="paragraph" w:styleId="Ttulodendice">
     <w:name w:val="index heading"/>
     <w:basedOn w:val="Heading"/>
-    <w:pPr/>
-    <w:rPr/>
   </w:style>
-  <w:style w:type="paragraph" w:styleId="TOCHeading">
+  <w:style w:type="paragraph" w:styleId="TtuloTDC">
     <w:name w:val="TOC Heading"/>
-    <w:basedOn w:val="Heading1"/>
+    <w:basedOn w:val="Ttulo1"/>
     <w:next w:val="Normal"/>
     <w:uiPriority w:val="39"/>
     <w:unhideWhenUsed/>
     <w:qFormat/>
-    <w:rsid w:val="006076cf"/>
+    <w:rsid w:val="006076CF"/>
     <w:pPr>
-      <w:spacing w:lineRule="auto" w:line="259" w:before="240" w:after="0"/>
+      <w:spacing w:before="240" w:after="0" w:line="259" w:lineRule="auto"/>
       <w:outlineLvl w:val="9"/>
     </w:pPr>
     <w:rPr>
-      <w:rFonts w:ascii="Calibri" w:hAnsi="Calibri" w:eastAsia="" w:cs="" w:asciiTheme="majorHAnsi" w:cstheme="majorBidi" w:eastAsiaTheme="majorEastAsia" w:hAnsiTheme="majorHAnsi"/>
-      <w:color w:themeColor="accent1" w:themeShade="bf" w:val="365F91"/>
+      <w:rFonts w:asciiTheme="majorHAnsi" w:eastAsiaTheme="majorEastAsia" w:hAnsiTheme="majorHAnsi" w:cstheme="majorBidi"/>
+      <w:color w:val="365F91" w:themeColor="accent1" w:themeShade="BF"/>
       <w:sz w:val="32"/>
       <w:szCs w:val="32"/>
       <w:lang w:val="en-US" w:eastAsia="en-US"/>
     </w:rPr>
   </w:style>
-  <w:style w:type="paragraph" w:styleId="TOC1">
+  <w:style w:type="paragraph" w:styleId="TDC1">
     <w:name w:val="toc 1"/>
     <w:basedOn w:val="Normal"/>
     <w:next w:val="Normal"/>
     <w:autoRedefine/>
     <w:uiPriority w:val="39"/>
     <w:unhideWhenUsed/>
-    <w:rsid w:val="006076cf"/>
+    <w:rsid w:val="006076CF"/>
     <w:pPr>
-      <w:spacing w:before="0" w:after="100"/>
+      <w:spacing w:after="100"/>
     </w:pPr>
-    <w:rPr/>
   </w:style>
-  <w:style w:type="paragraph" w:styleId="TOC2">
+  <w:style w:type="paragraph" w:styleId="TDC2">
     <w:name w:val="toc 2"/>
     <w:basedOn w:val="Normal"/>
     <w:next w:val="Normal"/>
     <w:autoRedefine/>
     <w:uiPriority w:val="39"/>
     <w:unhideWhenUsed/>
-    <w:rsid w:val="006076cf"/>
+    <w:rsid w:val="006076CF"/>
     <w:pPr>
-      <w:spacing w:before="0" w:after="100"/>
-      <w:ind w:start="220"/>
+      <w:spacing w:after="100"/>
+      <w:ind w:left="220"/>
     </w:pPr>
-    <w:rPr/>
   </w:style>
-  <w:style w:type="paragraph" w:styleId="ListParagraph">
+  <w:style w:type="paragraph" w:styleId="Prrafodelista">
     <w:name w:val="List Paragraph"/>
     <w:basedOn w:val="Normal"/>
     <w:uiPriority w:val="34"/>
     <w:qFormat/>
-    <w:rsid w:val="0079637a"/>
+    <w:rsid w:val="0079637A"/>
     <w:pPr>
-      <w:spacing w:before="0" w:after="0"/>
-      <w:ind w:start="720"/>
+      <w:ind w:left="720"/>
       <w:contextualSpacing/>
     </w:pPr>
-    <w:rPr/>
   </w:style>
-  <w:style w:type="paragraph" w:styleId="TOC3">
+  <w:style w:type="paragraph" w:styleId="TDC3">
     <w:name w:val="toc 3"/>
     <w:basedOn w:val="Normal"/>
     <w:next w:val="Normal"/>
     <w:autoRedefine/>
     <w:uiPriority w:val="39"/>
     <w:unhideWhenUsed/>
-    <w:rsid w:val="007544e2"/>
+    <w:rsid w:val="007544E2"/>
     <w:pPr>
-      <w:spacing w:before="0" w:after="100"/>
-      <w:ind w:start="440"/>
+      <w:spacing w:after="100"/>
+      <w:ind w:left="440"/>
     </w:pPr>
-    <w:rPr/>
   </w:style>
-  <w:style w:type="paragraph" w:styleId="FrameContents">
+  <w:style w:type="paragraph" w:customStyle="1" w:styleId="FrameContents">
     <w:name w:val="Frame Contents"/>
     <w:basedOn w:val="Normal"/>
-    <w:pPr/>
-    <w:rPr/>
-  </w:style>
-  <w:style w:type="numbering" w:styleId="NoList" w:default="1">
-    <w:name w:val="No List"/>
-    <w:uiPriority w:val="99"/>
-    <w:semiHidden/>
-    <w:unhideWhenUsed/>
-  </w:style>
-  <w:style w:type="table" w:default="1" w:styleId="Tablanormal">
-    <w:name w:val="Normal Table"/>
-    <w:uiPriority w:val="99"/>
-    <w:semiHidden/>
-    <w:unhideWhenUsed/>
-    <w:tblPr>
-      <w:tblCellMar>
-        <w:top w:w="0" w:type="dxa"/>
-        <w:left w:w="108" w:type="dxa"/>
-        <w:bottom w:w="0" w:type="dxa"/>
-        <w:right w:w="108" w:type="dxa"/>
-      </w:tblCellMar>
-    </w:tblPr>
   </w:style>
   <w:style w:type="table" w:customStyle="1" w:styleId="TableNormal">
     <w:name w:val="TableNormal"/>
@@ -3515,18 +3437,15 @@
     <w:name w:val="Table Grid"/>
     <w:basedOn w:val="Tablanormal"/>
     <w:uiPriority w:val="39"/>
-    <w:rsid w:val="00c55a72"/>
-    <w:pPr>
-      <w:spacing w:line="240" w:lineRule="auto"/>
-    </w:pPr>
+    <w:rsid w:val="00C55A72"/>
     <w:tblPr>
       <w:tblBorders>
-        <w:top w:val="single" w:color="auto" w:sz="4" w:space="0"/>
-        <w:left w:val="single" w:color="auto" w:sz="4" w:space="0"/>
-        <w:bottom w:val="single" w:color="auto" w:sz="4" w:space="0"/>
-        <w:right w:val="single" w:color="auto" w:sz="4" w:space="0"/>
-        <w:insideH w:val="single" w:color="auto" w:sz="4" w:space="0"/>
-        <w:insideV w:val="single" w:color="auto" w:sz="4" w:space="0"/>
+        <w:top w:val="single" w:sz="4" w:space="0" w:color="auto"/>
+        <w:left w:val="single" w:sz="4" w:space="0" w:color="auto"/>
+        <w:bottom w:val="single" w:sz="4" w:space="0" w:color="auto"/>
+        <w:right w:val="single" w:sz="4" w:space="0" w:color="auto"/>
+        <w:insideH w:val="single" w:sz="4" w:space="0" w:color="auto"/>
+        <w:insideV w:val="single" w:sz="4" w:space="0" w:color="auto"/>
       </w:tblBorders>
     </w:tblPr>
   </w:style>
@@ -3534,7 +3453,7 @@
 </file>
 
 <file path=word/theme/theme1.xml><?xml version="1.0" encoding="utf-8"?>
-<a:theme xmlns:a="http://schemas.openxmlformats.org/drawingml/2006/main" xmlns:r="http://schemas.openxmlformats.org/officeDocument/2006/relationships" name="Office Theme">
+<a:theme xmlns:a="http://schemas.openxmlformats.org/drawingml/2006/main" name="Office Theme">
   <a:themeElements>
     <a:clrScheme name="Office">
       <a:dk1>
@@ -3576,7 +3495,7 @@
     </a:clrScheme>
     <a:fontScheme name="Office">
       <a:majorFont>
-        <a:latin typeface="Calibri" pitchFamily="0" charset="1"/>
+        <a:latin typeface="Calibri"/>
         <a:ea typeface=""/>
         <a:cs typeface=""/>
         <a:font script="Jpan" typeface="ＭＳ ゴシック"/>
@@ -3611,7 +3530,7 @@
         <a:font script="Geor" typeface="Sylfaen"/>
       </a:majorFont>
       <a:minorFont>
-        <a:latin typeface="Cambria" pitchFamily="0" charset="1"/>
+        <a:latin typeface="Cambria"/>
         <a:ea typeface=""/>
         <a:cs typeface=""/>
         <a:font script="Jpan" typeface="ＭＳ 明朝"/>
@@ -3670,7 +3589,7 @@
             </a:gs>
           </a:gsLst>
           <a:lin ang="16200000" scaled="1"/>
-          <a:tileRect l="0" t="0" r="0" b="0"/>
+          <a:tileRect/>
         </a:gradFill>
         <a:gradFill>
           <a:gsLst>
@@ -3688,7 +3607,7 @@
             </a:gs>
           </a:gsLst>
           <a:lin ang="16200000" scaled="0"/>
-          <a:tileRect l="0" t="0" r="0" b="0"/>
+          <a:tileRect/>
         </a:gradFill>
       </a:fillStyleLst>
       <a:lnStyleLst>
@@ -3739,7 +3658,7 @@
           <a:path path="circle">
             <a:fillToRect l="50000" t="-80000" r="50000" b="180000"/>
           </a:path>
-          <a:tileRect l="0" t="0" r="0" b="0"/>
+          <a:tileRect/>
         </a:gradFill>
         <a:gradFill>
           <a:gsLst>
@@ -3757,10 +3676,12 @@
           <a:path path="circle">
             <a:fillToRect l="50000" t="50000" r="50000" b="50000"/>
           </a:path>
-          <a:tileRect l="0" t="0" r="0" b="0"/>
+          <a:tileRect/>
         </a:gradFill>
       </a:bgFillStyleLst>
     </a:fmtScheme>
   </a:themeElements>
+  <a:objectDefaults/>
+  <a:extraClrSchemeLst/>
 </a:theme>
 </file>
</xml_diff>